<commit_message>
fix: improve HiddenBench disclosure scoring
</commit_message>
<xml_diff>
--- a/reports/给彭老师的HiddenBench_MAF复现实验最终报告_2026-07-28.docx
+++ b/reports/给彭老师的HiddenBench_MAF复现实验最终报告_2026-07-28.docx
@@ -2260,7 +2260,7 @@
           <w:color w:val="2E74B5"/>
           <w:sz w:val="26"/>
         </w:rPr>
-        <w:t>5. 自动过程指标的误报</w:t>
+        <w:t>5. 自动披露指标修正</w:t>
       </w:r>
     </w:p>
     <w:p>
@@ -2289,7 +2289,7 @@
           <w:color w:val="1F2D3D"/>
           <w:sz w:val="22"/>
         </w:rPr>
-        <w:t xml:space="preserve"> 保守规则：一条发言必须至少命中私有事实的 6 个实义词，并覆盖该事实词汇的 55%，才记为信息披露。</w:t>
+        <w:t xml:space="preserve"> 保守规则：一条发言必须至少命中私有事实的 6 个实义词，并覆盖该事实词汇的 55%，才记为信息披露。该规则能避免 把一般性讨论误记为披露，但会漏掉压缩和释义表达。例如，Agent 把完整 的 Alpha 通风检测报告概括为 “Station Alpha is unsafe due to elevated toxin levels”，含义已经披露，词汇覆盖率却不足 55%。</w:t>
       </w:r>
     </w:p>
     <w:p>
@@ -2302,20 +2302,320 @@
           <w:color w:val="1F2D3D"/>
           <w:sz w:val="22"/>
         </w:rPr>
-        <w:t>Agent 实际采用了压缩和释义表达，例如把完整的 Alpha 通风检测报告概括 为 “Station Alpha is unsafe due to elevated toxin levels”。因此自动 指标错误地得到披露率 0，并生成四个 FM-2.4 候选。</w:t>
+        <w:t xml:space="preserve">本次在不修改任何原始模型回答、不增加 DeepSeek 调用的前提下，将过程 指标升级为 </w:t>
       </w:r>
-    </w:p>
-    <w:p>
-      <w:pPr>
-        <w:widowControl/>
-      </w:pPr>
+      <w:r>
+        <w:rPr>
+          <w:rFonts w:ascii="Consolas" w:hAnsi="Consolas" w:eastAsia="Microsoft YaHei"/>
+          <w:color w:val="1F4D78"/>
+          <w:sz w:val="21"/>
+        </w:rPr>
+        <w:t>lexical-semantic-v2</w:t>
+      </w:r>
       <w:r>
         <w:rPr>
           <w:rFonts w:ascii="Calibri" w:hAnsi="Calibri" w:eastAsia="Microsoft YaHei"/>
           <w:color w:val="1F2D3D"/>
           <w:sz w:val="22"/>
         </w:rPr>
-        <w:t>人工检查原始对话后，可以确认四条私有信息都在第一轮披露，且随后被 其他智能体用于判断。因此这四个 FM-2.4 候选是词法阈值造成的误报， 不能作为真实失败结论。原始自动结果予以保留，避免在看到结果后修改 规则；人工结论在报告中单独记录。</w:t>
+        <w:t>。新规则包括：</w:t>
+      </w:r>
+    </w:p>
+    <w:p>
+      <w:pPr>
+        <w:spacing w:after="160" w:line="280" w:lineRule="auto"/>
+        <w:numPr>
+          <w:ilvl w:val="0"/>
+          <w:numId w:val="12"/>
+        </w:numPr>
+      </w:pPr>
+      <w:r>
+        <w:rPr>
+          <w:rFonts w:ascii="Calibri" w:hAnsi="Calibri" w:eastAsia="Microsoft YaHei"/>
+          <w:color w:val="1F2D3D"/>
+          <w:sz w:val="22"/>
+        </w:rPr>
+        <w:t>保留原来的 6 词、55% 严格词法闸门；</w:t>
+      </w:r>
+    </w:p>
+    <w:p>
+      <w:pPr>
+        <w:spacing w:after="160" w:line="280" w:lineRule="auto"/>
+        <w:numPr>
+          <w:ilvl w:val="0"/>
+          <w:numId w:val="12"/>
+        </w:numPr>
+      </w:pPr>
+      <w:r>
+        <w:rPr>
+          <w:rFonts w:ascii="Calibri" w:hAnsi="Calibri" w:eastAsia="Microsoft YaHei"/>
+          <w:color w:val="1F2D3D"/>
+          <w:sz w:val="22"/>
+        </w:rPr>
+        <w:t xml:space="preserve">对 </w:t>
+      </w:r>
+      <w:r>
+        <w:rPr>
+          <w:rFonts w:ascii="Consolas" w:hAnsi="Consolas" w:eastAsia="Microsoft YaHei"/>
+          <w:color w:val="1F4D78"/>
+          <w:sz w:val="21"/>
+        </w:rPr>
+        <w:t>exposed/exposure</w:t>
+      </w:r>
+      <w:r>
+        <w:rPr>
+          <w:rFonts w:ascii="Calibri" w:hAnsi="Calibri" w:eastAsia="Microsoft YaHei"/>
+          <w:color w:val="1F2D3D"/>
+          <w:sz w:val="22"/>
+        </w:rPr>
+        <w:t>、</w:t>
+      </w:r>
+      <w:r>
+        <w:rPr>
+          <w:rFonts w:ascii="Consolas" w:hAnsi="Consolas" w:eastAsia="Microsoft YaHei"/>
+          <w:color w:val="1F4D78"/>
+          <w:sz w:val="21"/>
+        </w:rPr>
+        <w:t>expires/expiring</w:t>
+      </w:r>
+      <w:r>
+        <w:rPr>
+          <w:rFonts w:ascii="Calibri" w:hAnsi="Calibri" w:eastAsia="Microsoft YaHei"/>
+          <w:color w:val="1F2D3D"/>
+          <w:sz w:val="22"/>
+        </w:rPr>
+        <w:t xml:space="preserve"> 等表达做轻量词形归一；</w:t>
+      </w:r>
+    </w:p>
+    <w:p>
+      <w:pPr>
+        <w:spacing w:after="160" w:line="280" w:lineRule="auto"/>
+        <w:numPr>
+          <w:ilvl w:val="0"/>
+          <w:numId w:val="12"/>
+        </w:numPr>
+      </w:pPr>
+      <w:r>
+        <w:rPr>
+          <w:rFonts w:ascii="Calibri" w:hAnsi="Calibri" w:eastAsia="Microsoft YaHei"/>
+          <w:color w:val="1F2D3D"/>
+          <w:sz w:val="22"/>
+        </w:rPr>
+        <w:t>将长列表拆成原子事实，允许 Agent 披露其中一条决策相关私有信息；</w:t>
+      </w:r>
+    </w:p>
+    <w:p>
+      <w:pPr>
+        <w:spacing w:after="160" w:line="280" w:lineRule="auto"/>
+        <w:numPr>
+          <w:ilvl w:val="0"/>
+          <w:numId w:val="12"/>
+        </w:numPr>
+      </w:pPr>
+      <w:r>
+        <w:rPr>
+          <w:rFonts w:ascii="Calibri" w:hAnsi="Calibri" w:eastAsia="Microsoft YaHei"/>
+          <w:color w:val="1F2D3D"/>
+          <w:sz w:val="22"/>
+        </w:rPr>
+        <w:t>使用 Station、Hospital、Restaurant、Lab、Option 和 Data Center</w:t>
+      </w:r>
+    </w:p>
+    <w:p>
+      <w:pPr>
+        <w:widowControl/>
+      </w:pPr>
+      <w:r>
+        <w:rPr>
+          <w:rFonts w:ascii="Calibri" w:hAnsi="Calibri" w:eastAsia="Microsoft YaHei"/>
+          <w:color w:val="1F2D3D"/>
+          <w:sz w:val="22"/>
+        </w:rPr>
+        <w:t>等实体锚点；</w:t>
+      </w:r>
+    </w:p>
+    <w:p>
+      <w:pPr>
+        <w:spacing w:after="160" w:line="280" w:lineRule="auto"/>
+        <w:numPr>
+          <w:ilvl w:val="0"/>
+          <w:numId w:val="13"/>
+        </w:numPr>
+      </w:pPr>
+      <w:r>
+        <w:rPr>
+          <w:rFonts w:ascii="Calibri" w:hAnsi="Calibri" w:eastAsia="Microsoft YaHei"/>
+          <w:color w:val="1F2D3D"/>
+          <w:sz w:val="22"/>
+        </w:rPr>
+        <w:t>识别断电、污染、道路阻断、人员流失等有限、可检查的语义概念；</w:t>
+      </w:r>
+    </w:p>
+    <w:p>
+      <w:pPr>
+        <w:spacing w:after="160" w:line="280" w:lineRule="auto"/>
+        <w:numPr>
+          <w:ilvl w:val="0"/>
+          <w:numId w:val="13"/>
+        </w:numPr>
+      </w:pPr>
+      <w:r>
+        <w:rPr>
+          <w:rFonts w:ascii="Calibri" w:hAnsi="Calibri" w:eastAsia="Microsoft YaHei"/>
+          <w:color w:val="1F2D3D"/>
+          <w:sz w:val="22"/>
+        </w:rPr>
+        <w:t>设置极性冲突保护，避免把“有电”当成“断电”、把“有污染”当成</w:t>
+      </w:r>
+    </w:p>
+    <w:p>
+      <w:pPr>
+        <w:widowControl/>
+      </w:pPr>
+      <w:r>
+        <w:rPr>
+          <w:rFonts w:ascii="Calibri" w:hAnsi="Calibri" w:eastAsia="Microsoft YaHei"/>
+          <w:color w:val="1F2D3D"/>
+          <w:sz w:val="22"/>
+        </w:rPr>
+        <w:t>“无污染”；</w:t>
+      </w:r>
+    </w:p>
+    <w:p>
+      <w:pPr>
+        <w:spacing w:after="160" w:line="280" w:lineRule="auto"/>
+        <w:numPr>
+          <w:ilvl w:val="0"/>
+          <w:numId w:val="14"/>
+        </w:numPr>
+      </w:pPr>
+      <w:r>
+        <w:rPr>
+          <w:rFonts w:ascii="Calibri" w:hAnsi="Calibri" w:eastAsia="Microsoft YaHei"/>
+          <w:color w:val="1F2D3D"/>
+          <w:sz w:val="22"/>
+        </w:rPr>
+        <w:t xml:space="preserve">对 </w:t>
+      </w:r>
+      <w:r>
+        <w:rPr>
+          <w:rFonts w:ascii="Consolas" w:hAnsi="Consolas" w:eastAsia="Microsoft YaHei"/>
+          <w:color w:val="1F4D78"/>
+          <w:sz w:val="21"/>
+        </w:rPr>
+        <w:t>(a) N</w:t>
+      </w:r>
+      <w:r>
+        <w:rPr>
+          <w:rFonts w:ascii="Calibri" w:hAnsi="Calibri" w:eastAsia="Microsoft YaHei"/>
+          <w:color w:val="1F2D3D"/>
+          <w:sz w:val="22"/>
+        </w:rPr>
+        <w:t xml:space="preserve"> 一类结构化准则，同时核对实体、准则编号和通过/失败方向。</w:t>
+      </w:r>
+    </w:p>
+    <w:p>
+      <w:pPr>
+        <w:widowControl/>
+      </w:pPr>
+      <w:r>
+        <w:rPr>
+          <w:rFonts w:ascii="Calibri" w:hAnsi="Calibri" w:eastAsia="Microsoft YaHei"/>
+          <w:color w:val="1F2D3D"/>
+          <w:sz w:val="22"/>
+        </w:rPr>
+        <w:t>修正后，ID 25 的四条私有信息全部被自动识别为已披露：</w:t>
+      </w:r>
+    </w:p>
+    <w:tbl>
+      <w:tblPr>
+        <w:tblW w:type="dxa" w:w="9360"/>
+        <w:jc w:val="left"/>
+        <w:tblLayout w:type="fixed"/>
+        <w:tblLook w:firstColumn="1" w:firstRow="1" w:lastColumn="0" w:lastRow="0" w:noHBand="0" w:noVBand="1" w:val="04A0"/>
+        <w:tblInd w:w="120" w:type="dxa"/>
+      </w:tblPr>
+      <w:tblGrid>
+        <w:gridCol w:w="9360"/>
+      </w:tblGrid>
+      <w:tr>
+        <w:trPr>
+          <w:cantSplit/>
+        </w:trPr>
+        <w:tc>
+          <w:tcPr>
+            <w:tcW w:type="dxa" w:w="9360"/>
+            <w:tcMar>
+              <w:top w:w="80" w:type="dxa"/>
+              <w:start w:w="120" w:type="dxa"/>
+              <w:bottom w:w="80" w:type="dxa"/>
+              <w:end w:w="120" w:type="dxa"/>
+            </w:tcMar>
+            <w:vAlign w:val="center"/>
+            <w:shd w:fill="F4F6F9"/>
+          </w:tcPr>
+          <w:p>
+            <w:pPr>
+              <w:spacing w:before="20" w:after="20" w:line="240" w:lineRule="auto"/>
+            </w:pPr>
+            <w:r>
+              <w:rPr>
+                <w:rFonts w:ascii="Consolas" w:hAnsi="Consolas" w:eastAsia="Microsoft YaHei"/>
+                <w:color w:val="1F2D3D"/>
+                <w:sz w:val="18"/>
+              </w:rPr>
+              <w:t>private_fact_disclosure_rate = 1.000</w:t>
+            </w:r>
+            <w:r>
+              <w:br/>
+            </w:r>
+            <w:r>
+              <w:rPr>
+                <w:rFonts w:ascii="Consolas" w:hAnsi="Consolas" w:eastAsia="Microsoft YaHei"/>
+                <w:color w:val="1F2D3D"/>
+                <w:sz w:val="18"/>
+              </w:rPr>
+              <w:t>cross_agent_use_rate = 0.750</w:t>
+            </w:r>
+            <w:r>
+              <w:br/>
+            </w:r>
+            <w:r>
+              <w:rPr>
+                <w:rFonts w:ascii="Consolas" w:hAnsi="Consolas" w:eastAsia="Microsoft YaHei"/>
+                <w:color w:val="1F2D3D"/>
+                <w:sz w:val="18"/>
+              </w:rPr>
+              <w:t>FM-2.4 candidates = 0</w:t>
+            </w:r>
+          </w:p>
+        </w:tc>
+      </w:tr>
+    </w:tbl>
+    <w:p>
+      <w:pPr>
+        <w:spacing w:after="0"/>
+      </w:pPr>
+    </w:p>
+    <w:p>
+      <w:pPr>
+        <w:widowControl/>
+      </w:pPr>
+      <w:r>
+        <w:rPr>
+          <w:rFonts w:ascii="Consolas" w:hAnsi="Consolas" w:eastAsia="Microsoft YaHei"/>
+          <w:color w:val="1F4D78"/>
+          <w:sz w:val="21"/>
+        </w:rPr>
+        <w:t>cross_agent_use_rate = 0.750</w:t>
+      </w:r>
+      <w:r>
+        <w:rPr>
+          <w:rFonts w:ascii="Calibri" w:hAnsi="Calibri" w:eastAsia="Microsoft YaHei"/>
+          <w:color w:val="1F2D3D"/>
+          <w:sz w:val="22"/>
+        </w:rPr>
+        <w:t xml:space="preserve"> 表示四条私有事实中有三条在披露后被至少 一名其他 Agent 明确复用。原来的四个 FM-2.4 候选已经消失。自动候选 仍须人工复核，因为该规则是透明的任务级语义启发式，不是通用自然语言 蕴含模型。</w:t>
       </w:r>
     </w:p>
     <w:p>
@@ -4365,7 +4665,7 @@
         <w:spacing w:after="160" w:line="280" w:lineRule="auto"/>
         <w:numPr>
           <w:ilvl w:val="0"/>
-          <w:numId w:val="12"/>
+          <w:numId w:val="15"/>
         </w:numPr>
       </w:pPr>
       <w:r>
@@ -4395,7 +4695,7 @@
         <w:spacing w:after="160" w:line="280" w:lineRule="auto"/>
         <w:numPr>
           <w:ilvl w:val="0"/>
-          <w:numId w:val="13"/>
+          <w:numId w:val="16"/>
         </w:numPr>
       </w:pPr>
       <w:r>
@@ -4425,7 +4725,7 @@
         <w:spacing w:after="160" w:line="280" w:lineRule="auto"/>
         <w:numPr>
           <w:ilvl w:val="0"/>
-          <w:numId w:val="14"/>
+          <w:numId w:val="17"/>
         </w:numPr>
       </w:pPr>
       <w:r>
@@ -4442,7 +4742,7 @@
         <w:spacing w:after="160" w:line="280" w:lineRule="auto"/>
         <w:numPr>
           <w:ilvl w:val="0"/>
-          <w:numId w:val="14"/>
+          <w:numId w:val="17"/>
         </w:numPr>
       </w:pPr>
       <w:r>
@@ -4459,7 +4759,7 @@
         <w:spacing w:after="160" w:line="280" w:lineRule="auto"/>
         <w:numPr>
           <w:ilvl w:val="0"/>
-          <w:numId w:val="14"/>
+          <w:numId w:val="17"/>
         </w:numPr>
       </w:pPr>
       <w:r>
@@ -4476,7 +4776,7 @@
         <w:spacing w:after="160" w:line="280" w:lineRule="auto"/>
         <w:numPr>
           <w:ilvl w:val="0"/>
-          <w:numId w:val="14"/>
+          <w:numId w:val="17"/>
         </w:numPr>
       </w:pPr>
       <w:r>
@@ -4499,6 +4799,1791 @@
           <w:sz w:val="22"/>
         </w:rPr>
         <w:t>因此，这十题并不支持“共识等于正确”。讨论既可能整合信息，也可能 让智能体围绕错误答案快速收敛。</w:t>
+      </w:r>
+    </w:p>
+    <w:p>
+      <w:pPr>
+        <w:pStyle w:val="Heading2"/>
+      </w:pPr>
+      <w:r>
+        <w:rPr>
+          <w:rFonts w:ascii="Calibri" w:hAnsi="Calibri" w:eastAsia="Microsoft YaHei"/>
+          <w:b/>
+          <w:color w:val="2E74B5"/>
+          <w:sz w:val="26"/>
+        </w:rPr>
+        <w:t>自动信息流指标</w:t>
+      </w:r>
+    </w:p>
+    <w:p>
+      <w:pPr>
+        <w:widowControl/>
+      </w:pPr>
+      <w:r>
+        <w:rPr>
+          <w:rFonts w:ascii="Calibri" w:hAnsi="Calibri" w:eastAsia="Microsoft YaHei"/>
+          <w:color w:val="1F2D3D"/>
+          <w:sz w:val="22"/>
+        </w:rPr>
+        <w:t>使用同一批原始 JSONL 重新评分，没有重新调用模型，正确率和投票结果 均未改变。</w:t>
+      </w:r>
+    </w:p>
+    <w:tbl>
+      <w:tblPr>
+        <w:tblStyle w:val="TableGrid"/>
+        <w:tblW w:type="dxa" w:w="9360"/>
+        <w:jc w:val="left"/>
+        <w:tblLayout w:type="fixed"/>
+        <w:tblLook w:firstColumn="1" w:firstRow="1" w:lastColumn="0" w:lastRow="0" w:noHBand="0" w:noVBand="1" w:val="04A0"/>
+        <w:tblInd w:w="120" w:type="dxa"/>
+      </w:tblPr>
+      <w:tblGrid>
+        <w:gridCol w:w="600"/>
+        <w:gridCol w:w="3960"/>
+        <w:gridCol w:w="1200"/>
+        <w:gridCol w:w="1200"/>
+        <w:gridCol w:w="2400"/>
+      </w:tblGrid>
+      <w:tr>
+        <w:trPr>
+          <w:cantSplit/>
+          <w:tblHeader w:val="true"/>
+        </w:trPr>
+        <w:tc>
+          <w:tcPr>
+            <w:tcW w:type="dxa" w:w="600"/>
+            <w:tcMar>
+              <w:top w:w="80" w:type="dxa"/>
+              <w:start w:w="120" w:type="dxa"/>
+              <w:bottom w:w="80" w:type="dxa"/>
+              <w:end w:w="120" w:type="dxa"/>
+            </w:tcMar>
+            <w:vAlign w:val="center"/>
+            <w:shd w:fill="F2F4F7"/>
+          </w:tcPr>
+          <w:p>
+            <w:pPr>
+              <w:spacing w:before="0" w:after="40" w:line="240" w:lineRule="auto"/>
+            </w:pPr>
+            <w:r>
+              <w:rPr>
+                <w:rFonts w:ascii="Calibri" w:hAnsi="Calibri" w:eastAsia="Microsoft YaHei"/>
+                <w:b/>
+                <w:color w:val="1F4D78"/>
+                <w:sz w:val="18"/>
+              </w:rPr>
+              <w:t>ID</w:t>
+            </w:r>
+          </w:p>
+        </w:tc>
+        <w:tc>
+          <w:tcPr>
+            <w:tcW w:type="dxa" w:w="3960"/>
+            <w:tcMar>
+              <w:top w:w="80" w:type="dxa"/>
+              <w:start w:w="120" w:type="dxa"/>
+              <w:bottom w:w="80" w:type="dxa"/>
+              <w:end w:w="120" w:type="dxa"/>
+            </w:tcMar>
+            <w:vAlign w:val="center"/>
+            <w:shd w:fill="F2F4F7"/>
+          </w:tcPr>
+          <w:p>
+            <w:pPr>
+              <w:spacing w:before="0" w:after="40" w:line="240" w:lineRule="auto"/>
+            </w:pPr>
+            <w:r>
+              <w:rPr>
+                <w:rFonts w:ascii="Calibri" w:hAnsi="Calibri" w:eastAsia="Microsoft YaHei"/>
+                <w:b/>
+                <w:color w:val="1F4D78"/>
+                <w:sz w:val="18"/>
+              </w:rPr>
+              <w:t>任务</w:t>
+            </w:r>
+          </w:p>
+        </w:tc>
+        <w:tc>
+          <w:tcPr>
+            <w:tcW w:type="dxa" w:w="1200"/>
+            <w:tcMar>
+              <w:top w:w="80" w:type="dxa"/>
+              <w:start w:w="120" w:type="dxa"/>
+              <w:bottom w:w="80" w:type="dxa"/>
+              <w:end w:w="120" w:type="dxa"/>
+            </w:tcMar>
+            <w:vAlign w:val="center"/>
+            <w:shd w:fill="F2F4F7"/>
+          </w:tcPr>
+          <w:p>
+            <w:pPr>
+              <w:spacing w:before="0" w:after="40" w:line="240" w:lineRule="auto"/>
+              <w:jc w:val="center"/>
+            </w:pPr>
+            <w:r>
+              <w:rPr>
+                <w:rFonts w:ascii="Calibri" w:hAnsi="Calibri" w:eastAsia="Microsoft YaHei"/>
+                <w:b/>
+                <w:color w:val="1F4D78"/>
+                <w:sz w:val="18"/>
+              </w:rPr>
+              <w:t>私有信息披露率</w:t>
+            </w:r>
+          </w:p>
+        </w:tc>
+        <w:tc>
+          <w:tcPr>
+            <w:tcW w:type="dxa" w:w="1200"/>
+            <w:tcMar>
+              <w:top w:w="80" w:type="dxa"/>
+              <w:start w:w="120" w:type="dxa"/>
+              <w:bottom w:w="80" w:type="dxa"/>
+              <w:end w:w="120" w:type="dxa"/>
+            </w:tcMar>
+            <w:vAlign w:val="center"/>
+            <w:shd w:fill="F2F4F7"/>
+          </w:tcPr>
+          <w:p>
+            <w:pPr>
+              <w:spacing w:before="0" w:after="40" w:line="240" w:lineRule="auto"/>
+              <w:jc w:val="center"/>
+            </w:pPr>
+            <w:r>
+              <w:rPr>
+                <w:rFonts w:ascii="Calibri" w:hAnsi="Calibri" w:eastAsia="Microsoft YaHei"/>
+                <w:b/>
+                <w:color w:val="1F4D78"/>
+                <w:sz w:val="18"/>
+              </w:rPr>
+              <w:t>跨 Agent 使用率</w:t>
+            </w:r>
+          </w:p>
+        </w:tc>
+        <w:tc>
+          <w:tcPr>
+            <w:tcW w:type="dxa" w:w="2400"/>
+            <w:tcMar>
+              <w:top w:w="80" w:type="dxa"/>
+              <w:start w:w="120" w:type="dxa"/>
+              <w:bottom w:w="80" w:type="dxa"/>
+              <w:end w:w="120" w:type="dxa"/>
+            </w:tcMar>
+            <w:vAlign w:val="center"/>
+            <w:shd w:fill="F2F4F7"/>
+          </w:tcPr>
+          <w:p>
+            <w:pPr>
+              <w:spacing w:before="0" w:after="40" w:line="240" w:lineRule="auto"/>
+              <w:jc w:val="center"/>
+            </w:pPr>
+            <w:r>
+              <w:rPr>
+                <w:rFonts w:ascii="Calibri" w:hAnsi="Calibri" w:eastAsia="Microsoft YaHei"/>
+                <w:b/>
+                <w:color w:val="1F4D78"/>
+                <w:sz w:val="18"/>
+              </w:rPr>
+              <w:t>FM-2.4 候选数</w:t>
+            </w:r>
+          </w:p>
+        </w:tc>
+      </w:tr>
+      <w:tr>
+        <w:trPr>
+          <w:cantSplit/>
+        </w:trPr>
+        <w:tc>
+          <w:tcPr>
+            <w:tcW w:type="dxa" w:w="600"/>
+            <w:tcMar>
+              <w:top w:w="80" w:type="dxa"/>
+              <w:start w:w="120" w:type="dxa"/>
+              <w:bottom w:w="80" w:type="dxa"/>
+              <w:end w:w="120" w:type="dxa"/>
+            </w:tcMar>
+            <w:vAlign w:val="center"/>
+          </w:tcPr>
+          <w:p>
+            <w:pPr>
+              <w:spacing w:before="0" w:after="40" w:line="240" w:lineRule="auto"/>
+            </w:pPr>
+            <w:r>
+              <w:rPr>
+                <w:rFonts w:ascii="Calibri" w:hAnsi="Calibri" w:eastAsia="Microsoft YaHei"/>
+                <w:color w:val="1F2D3D"/>
+                <w:sz w:val="18"/>
+              </w:rPr>
+              <w:t>1</w:t>
+            </w:r>
+          </w:p>
+        </w:tc>
+        <w:tc>
+          <w:tcPr>
+            <w:tcW w:type="dxa" w:w="3960"/>
+            <w:tcMar>
+              <w:top w:w="80" w:type="dxa"/>
+              <w:start w:w="120" w:type="dxa"/>
+              <w:bottom w:w="80" w:type="dxa"/>
+              <w:end w:w="120" w:type="dxa"/>
+            </w:tcMar>
+            <w:vAlign w:val="center"/>
+          </w:tcPr>
+          <w:p>
+            <w:pPr>
+              <w:spacing w:before="0" w:after="40" w:line="240" w:lineRule="auto"/>
+            </w:pPr>
+            <w:r>
+              <w:rPr>
+                <w:rFonts w:ascii="Calibri" w:hAnsi="Calibri" w:eastAsia="Microsoft YaHei"/>
+                <w:color w:val="1F2D3D"/>
+                <w:sz w:val="18"/>
+              </w:rPr>
+              <w:t>evacuation_west_city</w:t>
+            </w:r>
+          </w:p>
+        </w:tc>
+        <w:tc>
+          <w:tcPr>
+            <w:tcW w:type="dxa" w:w="1200"/>
+            <w:tcMar>
+              <w:top w:w="80" w:type="dxa"/>
+              <w:start w:w="120" w:type="dxa"/>
+              <w:bottom w:w="80" w:type="dxa"/>
+              <w:end w:w="120" w:type="dxa"/>
+            </w:tcMar>
+            <w:vAlign w:val="center"/>
+          </w:tcPr>
+          <w:p>
+            <w:pPr>
+              <w:spacing w:before="0" w:after="40" w:line="240" w:lineRule="auto"/>
+              <w:jc w:val="center"/>
+            </w:pPr>
+            <w:r>
+              <w:rPr>
+                <w:rFonts w:ascii="Calibri" w:hAnsi="Calibri" w:eastAsia="Microsoft YaHei"/>
+                <w:color w:val="1F2D3D"/>
+                <w:sz w:val="18"/>
+              </w:rPr>
+              <w:t>0.750</w:t>
+            </w:r>
+          </w:p>
+        </w:tc>
+        <w:tc>
+          <w:tcPr>
+            <w:tcW w:type="dxa" w:w="1200"/>
+            <w:tcMar>
+              <w:top w:w="80" w:type="dxa"/>
+              <w:start w:w="120" w:type="dxa"/>
+              <w:bottom w:w="80" w:type="dxa"/>
+              <w:end w:w="120" w:type="dxa"/>
+            </w:tcMar>
+            <w:vAlign w:val="center"/>
+          </w:tcPr>
+          <w:p>
+            <w:pPr>
+              <w:spacing w:before="0" w:after="40" w:line="240" w:lineRule="auto"/>
+              <w:jc w:val="center"/>
+            </w:pPr>
+            <w:r>
+              <w:rPr>
+                <w:rFonts w:ascii="Calibri" w:hAnsi="Calibri" w:eastAsia="Microsoft YaHei"/>
+                <w:color w:val="1F2D3D"/>
+                <w:sz w:val="18"/>
+              </w:rPr>
+              <w:t>0.750</w:t>
+            </w:r>
+          </w:p>
+        </w:tc>
+        <w:tc>
+          <w:tcPr>
+            <w:tcW w:type="dxa" w:w="2400"/>
+            <w:tcMar>
+              <w:top w:w="80" w:type="dxa"/>
+              <w:start w:w="120" w:type="dxa"/>
+              <w:bottom w:w="80" w:type="dxa"/>
+              <w:end w:w="120" w:type="dxa"/>
+            </w:tcMar>
+            <w:vAlign w:val="center"/>
+          </w:tcPr>
+          <w:p>
+            <w:pPr>
+              <w:spacing w:before="0" w:after="40" w:line="240" w:lineRule="auto"/>
+              <w:jc w:val="center"/>
+            </w:pPr>
+            <w:r>
+              <w:rPr>
+                <w:rFonts w:ascii="Calibri" w:hAnsi="Calibri" w:eastAsia="Microsoft YaHei"/>
+                <w:color w:val="1F2D3D"/>
+                <w:sz w:val="18"/>
+              </w:rPr>
+              <w:t>1</w:t>
+            </w:r>
+          </w:p>
+        </w:tc>
+      </w:tr>
+      <w:tr>
+        <w:trPr>
+          <w:cantSplit/>
+        </w:trPr>
+        <w:tc>
+          <w:tcPr>
+            <w:tcW w:type="dxa" w:w="600"/>
+            <w:tcMar>
+              <w:top w:w="80" w:type="dxa"/>
+              <w:start w:w="120" w:type="dxa"/>
+              <w:bottom w:w="80" w:type="dxa"/>
+              <w:end w:w="120" w:type="dxa"/>
+            </w:tcMar>
+            <w:vAlign w:val="center"/>
+          </w:tcPr>
+          <w:p>
+            <w:pPr>
+              <w:spacing w:before="0" w:after="40" w:line="240" w:lineRule="auto"/>
+            </w:pPr>
+            <w:r>
+              <w:rPr>
+                <w:rFonts w:ascii="Calibri" w:hAnsi="Calibri" w:eastAsia="Microsoft YaHei"/>
+                <w:color w:val="1F2D3D"/>
+                <w:sz w:val="18"/>
+              </w:rPr>
+              <w:t>5</w:t>
+            </w:r>
+          </w:p>
+        </w:tc>
+        <w:tc>
+          <w:tcPr>
+            <w:tcW w:type="dxa" w:w="3960"/>
+            <w:tcMar>
+              <w:top w:w="80" w:type="dxa"/>
+              <w:start w:w="120" w:type="dxa"/>
+              <w:bottom w:w="80" w:type="dxa"/>
+              <w:end w:w="120" w:type="dxa"/>
+            </w:tcMar>
+            <w:vAlign w:val="center"/>
+          </w:tcPr>
+          <w:p>
+            <w:pPr>
+              <w:spacing w:before="0" w:after="40" w:line="240" w:lineRule="auto"/>
+            </w:pPr>
+            <w:r>
+              <w:rPr>
+                <w:rFonts w:ascii="Calibri" w:hAnsi="Calibri" w:eastAsia="Microsoft YaHei"/>
+                <w:color w:val="1F2D3D"/>
+                <w:sz w:val="18"/>
+              </w:rPr>
+              <w:t>baker_2010</w:t>
+            </w:r>
+          </w:p>
+        </w:tc>
+        <w:tc>
+          <w:tcPr>
+            <w:tcW w:type="dxa" w:w="1200"/>
+            <w:tcMar>
+              <w:top w:w="80" w:type="dxa"/>
+              <w:start w:w="120" w:type="dxa"/>
+              <w:bottom w:w="80" w:type="dxa"/>
+              <w:end w:w="120" w:type="dxa"/>
+            </w:tcMar>
+            <w:vAlign w:val="center"/>
+          </w:tcPr>
+          <w:p>
+            <w:pPr>
+              <w:spacing w:before="0" w:after="40" w:line="240" w:lineRule="auto"/>
+              <w:jc w:val="center"/>
+            </w:pPr>
+            <w:r>
+              <w:rPr>
+                <w:rFonts w:ascii="Calibri" w:hAnsi="Calibri" w:eastAsia="Microsoft YaHei"/>
+                <w:color w:val="1F2D3D"/>
+                <w:sz w:val="18"/>
+              </w:rPr>
+              <w:t>0.750</w:t>
+            </w:r>
+          </w:p>
+        </w:tc>
+        <w:tc>
+          <w:tcPr>
+            <w:tcW w:type="dxa" w:w="1200"/>
+            <w:tcMar>
+              <w:top w:w="80" w:type="dxa"/>
+              <w:start w:w="120" w:type="dxa"/>
+              <w:bottom w:w="80" w:type="dxa"/>
+              <w:end w:w="120" w:type="dxa"/>
+            </w:tcMar>
+            <w:vAlign w:val="center"/>
+          </w:tcPr>
+          <w:p>
+            <w:pPr>
+              <w:spacing w:before="0" w:after="40" w:line="240" w:lineRule="auto"/>
+              <w:jc w:val="center"/>
+            </w:pPr>
+            <w:r>
+              <w:rPr>
+                <w:rFonts w:ascii="Calibri" w:hAnsi="Calibri" w:eastAsia="Microsoft YaHei"/>
+                <w:color w:val="1F2D3D"/>
+                <w:sz w:val="18"/>
+              </w:rPr>
+              <w:t>0.500</w:t>
+            </w:r>
+          </w:p>
+        </w:tc>
+        <w:tc>
+          <w:tcPr>
+            <w:tcW w:type="dxa" w:w="2400"/>
+            <w:tcMar>
+              <w:top w:w="80" w:type="dxa"/>
+              <w:start w:w="120" w:type="dxa"/>
+              <w:bottom w:w="80" w:type="dxa"/>
+              <w:end w:w="120" w:type="dxa"/>
+            </w:tcMar>
+            <w:vAlign w:val="center"/>
+          </w:tcPr>
+          <w:p>
+            <w:pPr>
+              <w:spacing w:before="0" w:after="40" w:line="240" w:lineRule="auto"/>
+              <w:jc w:val="center"/>
+            </w:pPr>
+            <w:r>
+              <w:rPr>
+                <w:rFonts w:ascii="Calibri" w:hAnsi="Calibri" w:eastAsia="Microsoft YaHei"/>
+                <w:color w:val="1F2D3D"/>
+                <w:sz w:val="18"/>
+              </w:rPr>
+              <w:t>1</w:t>
+            </w:r>
+          </w:p>
+        </w:tc>
+      </w:tr>
+      <w:tr>
+        <w:trPr>
+          <w:cantSplit/>
+        </w:trPr>
+        <w:tc>
+          <w:tcPr>
+            <w:tcW w:type="dxa" w:w="600"/>
+            <w:tcMar>
+              <w:top w:w="80" w:type="dxa"/>
+              <w:start w:w="120" w:type="dxa"/>
+              <w:bottom w:w="80" w:type="dxa"/>
+              <w:end w:w="120" w:type="dxa"/>
+            </w:tcMar>
+            <w:vAlign w:val="center"/>
+          </w:tcPr>
+          <w:p>
+            <w:pPr>
+              <w:spacing w:before="0" w:after="40" w:line="240" w:lineRule="auto"/>
+            </w:pPr>
+            <w:r>
+              <w:rPr>
+                <w:rFonts w:ascii="Calibri" w:hAnsi="Calibri" w:eastAsia="Microsoft YaHei"/>
+                <w:color w:val="1F2D3D"/>
+                <w:sz w:val="18"/>
+              </w:rPr>
+              <w:t>7</w:t>
+            </w:r>
+          </w:p>
+        </w:tc>
+        <w:tc>
+          <w:tcPr>
+            <w:tcW w:type="dxa" w:w="3960"/>
+            <w:tcMar>
+              <w:top w:w="80" w:type="dxa"/>
+              <w:start w:w="120" w:type="dxa"/>
+              <w:bottom w:w="80" w:type="dxa"/>
+              <w:end w:w="120" w:type="dxa"/>
+            </w:tcMar>
+            <w:vAlign w:val="center"/>
+          </w:tcPr>
+          <w:p>
+            <w:pPr>
+              <w:spacing w:before="0" w:after="40" w:line="240" w:lineRule="auto"/>
+            </w:pPr>
+            <w:r>
+              <w:rPr>
+                <w:rFonts w:ascii="Calibri" w:hAnsi="Calibri" w:eastAsia="Microsoft YaHei"/>
+                <w:color w:val="1F2D3D"/>
+                <w:sz w:val="18"/>
+              </w:rPr>
+              <w:t>graetz_et_al_1998</w:t>
+            </w:r>
+          </w:p>
+        </w:tc>
+        <w:tc>
+          <w:tcPr>
+            <w:tcW w:type="dxa" w:w="1200"/>
+            <w:tcMar>
+              <w:top w:w="80" w:type="dxa"/>
+              <w:start w:w="120" w:type="dxa"/>
+              <w:bottom w:w="80" w:type="dxa"/>
+              <w:end w:w="120" w:type="dxa"/>
+            </w:tcMar>
+            <w:vAlign w:val="center"/>
+          </w:tcPr>
+          <w:p>
+            <w:pPr>
+              <w:spacing w:before="0" w:after="40" w:line="240" w:lineRule="auto"/>
+              <w:jc w:val="center"/>
+            </w:pPr>
+            <w:r>
+              <w:rPr>
+                <w:rFonts w:ascii="Calibri" w:hAnsi="Calibri" w:eastAsia="Microsoft YaHei"/>
+                <w:color w:val="1F2D3D"/>
+                <w:sz w:val="18"/>
+              </w:rPr>
+              <w:t>1.000</w:t>
+            </w:r>
+          </w:p>
+        </w:tc>
+        <w:tc>
+          <w:tcPr>
+            <w:tcW w:type="dxa" w:w="1200"/>
+            <w:tcMar>
+              <w:top w:w="80" w:type="dxa"/>
+              <w:start w:w="120" w:type="dxa"/>
+              <w:bottom w:w="80" w:type="dxa"/>
+              <w:end w:w="120" w:type="dxa"/>
+            </w:tcMar>
+            <w:vAlign w:val="center"/>
+          </w:tcPr>
+          <w:p>
+            <w:pPr>
+              <w:spacing w:before="0" w:after="40" w:line="240" w:lineRule="auto"/>
+              <w:jc w:val="center"/>
+            </w:pPr>
+            <w:r>
+              <w:rPr>
+                <w:rFonts w:ascii="Calibri" w:hAnsi="Calibri" w:eastAsia="Microsoft YaHei"/>
+                <w:color w:val="1F2D3D"/>
+                <w:sz w:val="18"/>
+              </w:rPr>
+              <w:t>1.000</w:t>
+            </w:r>
+          </w:p>
+        </w:tc>
+        <w:tc>
+          <w:tcPr>
+            <w:tcW w:type="dxa" w:w="2400"/>
+            <w:tcMar>
+              <w:top w:w="80" w:type="dxa"/>
+              <w:start w:w="120" w:type="dxa"/>
+              <w:bottom w:w="80" w:type="dxa"/>
+              <w:end w:w="120" w:type="dxa"/>
+            </w:tcMar>
+            <w:vAlign w:val="center"/>
+          </w:tcPr>
+          <w:p>
+            <w:pPr>
+              <w:spacing w:before="0" w:after="40" w:line="240" w:lineRule="auto"/>
+              <w:jc w:val="center"/>
+            </w:pPr>
+            <w:r>
+              <w:rPr>
+                <w:rFonts w:ascii="Calibri" w:hAnsi="Calibri" w:eastAsia="Microsoft YaHei"/>
+                <w:color w:val="1F2D3D"/>
+                <w:sz w:val="18"/>
+              </w:rPr>
+              <w:t>0</w:t>
+            </w:r>
+          </w:p>
+        </w:tc>
+      </w:tr>
+      <w:tr>
+        <w:trPr>
+          <w:cantSplit/>
+        </w:trPr>
+        <w:tc>
+          <w:tcPr>
+            <w:tcW w:type="dxa" w:w="600"/>
+            <w:tcMar>
+              <w:top w:w="80" w:type="dxa"/>
+              <w:start w:w="120" w:type="dxa"/>
+              <w:bottom w:w="80" w:type="dxa"/>
+              <w:end w:w="120" w:type="dxa"/>
+            </w:tcMar>
+            <w:vAlign w:val="center"/>
+          </w:tcPr>
+          <w:p>
+            <w:pPr>
+              <w:spacing w:before="0" w:after="40" w:line="240" w:lineRule="auto"/>
+            </w:pPr>
+            <w:r>
+              <w:rPr>
+                <w:rFonts w:ascii="Calibri" w:hAnsi="Calibri" w:eastAsia="Microsoft YaHei"/>
+                <w:color w:val="1F2D3D"/>
+                <w:sz w:val="18"/>
+              </w:rPr>
+              <w:t>9</w:t>
+            </w:r>
+          </w:p>
+        </w:tc>
+        <w:tc>
+          <w:tcPr>
+            <w:tcW w:type="dxa" w:w="3960"/>
+            <w:tcMar>
+              <w:top w:w="80" w:type="dxa"/>
+              <w:start w:w="120" w:type="dxa"/>
+              <w:bottom w:w="80" w:type="dxa"/>
+              <w:end w:w="120" w:type="dxa"/>
+            </w:tcMar>
+            <w:vAlign w:val="center"/>
+          </w:tcPr>
+          <w:p>
+            <w:pPr>
+              <w:spacing w:before="0" w:after="40" w:line="240" w:lineRule="auto"/>
+            </w:pPr>
+            <w:r>
+              <w:rPr>
+                <w:rFonts w:ascii="Calibri" w:hAnsi="Calibri" w:eastAsia="Microsoft YaHei"/>
+                <w:color w:val="1F2D3D"/>
+                <w:sz w:val="18"/>
+              </w:rPr>
+              <w:t>critical_hospital_transfer</w:t>
+            </w:r>
+          </w:p>
+        </w:tc>
+        <w:tc>
+          <w:tcPr>
+            <w:tcW w:type="dxa" w:w="1200"/>
+            <w:tcMar>
+              <w:top w:w="80" w:type="dxa"/>
+              <w:start w:w="120" w:type="dxa"/>
+              <w:bottom w:w="80" w:type="dxa"/>
+              <w:end w:w="120" w:type="dxa"/>
+            </w:tcMar>
+            <w:vAlign w:val="center"/>
+          </w:tcPr>
+          <w:p>
+            <w:pPr>
+              <w:spacing w:before="0" w:after="40" w:line="240" w:lineRule="auto"/>
+              <w:jc w:val="center"/>
+            </w:pPr>
+            <w:r>
+              <w:rPr>
+                <w:rFonts w:ascii="Calibri" w:hAnsi="Calibri" w:eastAsia="Microsoft YaHei"/>
+                <w:color w:val="1F2D3D"/>
+                <w:sz w:val="18"/>
+              </w:rPr>
+              <w:t>0.750</w:t>
+            </w:r>
+          </w:p>
+        </w:tc>
+        <w:tc>
+          <w:tcPr>
+            <w:tcW w:type="dxa" w:w="1200"/>
+            <w:tcMar>
+              <w:top w:w="80" w:type="dxa"/>
+              <w:start w:w="120" w:type="dxa"/>
+              <w:bottom w:w="80" w:type="dxa"/>
+              <w:end w:w="120" w:type="dxa"/>
+            </w:tcMar>
+            <w:vAlign w:val="center"/>
+          </w:tcPr>
+          <w:p>
+            <w:pPr>
+              <w:spacing w:before="0" w:after="40" w:line="240" w:lineRule="auto"/>
+              <w:jc w:val="center"/>
+            </w:pPr>
+            <w:r>
+              <w:rPr>
+                <w:rFonts w:ascii="Calibri" w:hAnsi="Calibri" w:eastAsia="Microsoft YaHei"/>
+                <w:color w:val="1F2D3D"/>
+                <w:sz w:val="18"/>
+              </w:rPr>
+              <w:t>0.500</w:t>
+            </w:r>
+          </w:p>
+        </w:tc>
+        <w:tc>
+          <w:tcPr>
+            <w:tcW w:type="dxa" w:w="2400"/>
+            <w:tcMar>
+              <w:top w:w="80" w:type="dxa"/>
+              <w:start w:w="120" w:type="dxa"/>
+              <w:bottom w:w="80" w:type="dxa"/>
+              <w:end w:w="120" w:type="dxa"/>
+            </w:tcMar>
+            <w:vAlign w:val="center"/>
+          </w:tcPr>
+          <w:p>
+            <w:pPr>
+              <w:spacing w:before="0" w:after="40" w:line="240" w:lineRule="auto"/>
+              <w:jc w:val="center"/>
+            </w:pPr>
+            <w:r>
+              <w:rPr>
+                <w:rFonts w:ascii="Calibri" w:hAnsi="Calibri" w:eastAsia="Microsoft YaHei"/>
+                <w:color w:val="1F2D3D"/>
+                <w:sz w:val="18"/>
+              </w:rPr>
+              <w:t>1</w:t>
+            </w:r>
+          </w:p>
+        </w:tc>
+      </w:tr>
+      <w:tr>
+        <w:trPr>
+          <w:cantSplit/>
+        </w:trPr>
+        <w:tc>
+          <w:tcPr>
+            <w:tcW w:type="dxa" w:w="600"/>
+            <w:tcMar>
+              <w:top w:w="80" w:type="dxa"/>
+              <w:start w:w="120" w:type="dxa"/>
+              <w:bottom w:w="80" w:type="dxa"/>
+              <w:end w:w="120" w:type="dxa"/>
+            </w:tcMar>
+            <w:vAlign w:val="center"/>
+          </w:tcPr>
+          <w:p>
+            <w:pPr>
+              <w:spacing w:before="0" w:after="40" w:line="240" w:lineRule="auto"/>
+            </w:pPr>
+            <w:r>
+              <w:rPr>
+                <w:rFonts w:ascii="Calibri" w:hAnsi="Calibri" w:eastAsia="Microsoft YaHei"/>
+                <w:color w:val="1F2D3D"/>
+                <w:sz w:val="18"/>
+              </w:rPr>
+              <w:t>13</w:t>
+            </w:r>
+          </w:p>
+        </w:tc>
+        <w:tc>
+          <w:tcPr>
+            <w:tcW w:type="dxa" w:w="3960"/>
+            <w:tcMar>
+              <w:top w:w="80" w:type="dxa"/>
+              <w:start w:w="120" w:type="dxa"/>
+              <w:bottom w:w="80" w:type="dxa"/>
+              <w:end w:w="120" w:type="dxa"/>
+            </w:tcMar>
+            <w:vAlign w:val="center"/>
+          </w:tcPr>
+          <w:p>
+            <w:pPr>
+              <w:spacing w:before="0" w:after="40" w:line="240" w:lineRule="auto"/>
+            </w:pPr>
+            <w:r>
+              <w:rPr>
+                <w:rFonts w:ascii="Calibri" w:hAnsi="Calibri" w:eastAsia="Microsoft YaHei"/>
+                <w:color w:val="1F2D3D"/>
+                <w:sz w:val="18"/>
+              </w:rPr>
+              <w:t>Laboratory Theft Deduction</w:t>
+            </w:r>
+          </w:p>
+        </w:tc>
+        <w:tc>
+          <w:tcPr>
+            <w:tcW w:type="dxa" w:w="1200"/>
+            <w:tcMar>
+              <w:top w:w="80" w:type="dxa"/>
+              <w:start w:w="120" w:type="dxa"/>
+              <w:bottom w:w="80" w:type="dxa"/>
+              <w:end w:w="120" w:type="dxa"/>
+            </w:tcMar>
+            <w:vAlign w:val="center"/>
+          </w:tcPr>
+          <w:p>
+            <w:pPr>
+              <w:spacing w:before="0" w:after="40" w:line="240" w:lineRule="auto"/>
+              <w:jc w:val="center"/>
+            </w:pPr>
+            <w:r>
+              <w:rPr>
+                <w:rFonts w:ascii="Calibri" w:hAnsi="Calibri" w:eastAsia="Microsoft YaHei"/>
+                <w:color w:val="1F2D3D"/>
+                <w:sz w:val="18"/>
+              </w:rPr>
+              <w:t>1.000</w:t>
+            </w:r>
+          </w:p>
+        </w:tc>
+        <w:tc>
+          <w:tcPr>
+            <w:tcW w:type="dxa" w:w="1200"/>
+            <w:tcMar>
+              <w:top w:w="80" w:type="dxa"/>
+              <w:start w:w="120" w:type="dxa"/>
+              <w:bottom w:w="80" w:type="dxa"/>
+              <w:end w:w="120" w:type="dxa"/>
+            </w:tcMar>
+            <w:vAlign w:val="center"/>
+          </w:tcPr>
+          <w:p>
+            <w:pPr>
+              <w:spacing w:before="0" w:after="40" w:line="240" w:lineRule="auto"/>
+              <w:jc w:val="center"/>
+            </w:pPr>
+            <w:r>
+              <w:rPr>
+                <w:rFonts w:ascii="Calibri" w:hAnsi="Calibri" w:eastAsia="Microsoft YaHei"/>
+                <w:color w:val="1F2D3D"/>
+                <w:sz w:val="18"/>
+              </w:rPr>
+              <w:t>0.750</w:t>
+            </w:r>
+          </w:p>
+        </w:tc>
+        <w:tc>
+          <w:tcPr>
+            <w:tcW w:type="dxa" w:w="2400"/>
+            <w:tcMar>
+              <w:top w:w="80" w:type="dxa"/>
+              <w:start w:w="120" w:type="dxa"/>
+              <w:bottom w:w="80" w:type="dxa"/>
+              <w:end w:w="120" w:type="dxa"/>
+            </w:tcMar>
+            <w:vAlign w:val="center"/>
+          </w:tcPr>
+          <w:p>
+            <w:pPr>
+              <w:spacing w:before="0" w:after="40" w:line="240" w:lineRule="auto"/>
+              <w:jc w:val="center"/>
+            </w:pPr>
+            <w:r>
+              <w:rPr>
+                <w:rFonts w:ascii="Calibri" w:hAnsi="Calibri" w:eastAsia="Microsoft YaHei"/>
+                <w:color w:val="1F2D3D"/>
+                <w:sz w:val="18"/>
+              </w:rPr>
+              <w:t>0</w:t>
+            </w:r>
+          </w:p>
+        </w:tc>
+      </w:tr>
+      <w:tr>
+        <w:trPr>
+          <w:cantSplit/>
+        </w:trPr>
+        <w:tc>
+          <w:tcPr>
+            <w:tcW w:type="dxa" w:w="600"/>
+            <w:tcMar>
+              <w:top w:w="80" w:type="dxa"/>
+              <w:start w:w="120" w:type="dxa"/>
+              <w:bottom w:w="80" w:type="dxa"/>
+              <w:end w:w="120" w:type="dxa"/>
+            </w:tcMar>
+            <w:vAlign w:val="center"/>
+          </w:tcPr>
+          <w:p>
+            <w:pPr>
+              <w:spacing w:before="0" w:after="40" w:line="240" w:lineRule="auto"/>
+            </w:pPr>
+            <w:r>
+              <w:rPr>
+                <w:rFonts w:ascii="Calibri" w:hAnsi="Calibri" w:eastAsia="Microsoft YaHei"/>
+                <w:color w:val="1F2D3D"/>
+                <w:sz w:val="18"/>
+              </w:rPr>
+              <w:t>14</w:t>
+            </w:r>
+          </w:p>
+        </w:tc>
+        <w:tc>
+          <w:tcPr>
+            <w:tcW w:type="dxa" w:w="3960"/>
+            <w:tcMar>
+              <w:top w:w="80" w:type="dxa"/>
+              <w:start w:w="120" w:type="dxa"/>
+              <w:bottom w:w="80" w:type="dxa"/>
+              <w:end w:w="120" w:type="dxa"/>
+            </w:tcMar>
+            <w:vAlign w:val="center"/>
+          </w:tcPr>
+          <w:p>
+            <w:pPr>
+              <w:spacing w:before="0" w:after="40" w:line="240" w:lineRule="auto"/>
+            </w:pPr>
+            <w:r>
+              <w:rPr>
+                <w:rFonts w:ascii="Calibri" w:hAnsi="Calibri" w:eastAsia="Microsoft YaHei"/>
+                <w:color w:val="1F2D3D"/>
+                <w:sz w:val="18"/>
+              </w:rPr>
+              <w:t>lunch_group_decision</w:t>
+            </w:r>
+          </w:p>
+        </w:tc>
+        <w:tc>
+          <w:tcPr>
+            <w:tcW w:type="dxa" w:w="1200"/>
+            <w:tcMar>
+              <w:top w:w="80" w:type="dxa"/>
+              <w:start w:w="120" w:type="dxa"/>
+              <w:bottom w:w="80" w:type="dxa"/>
+              <w:end w:w="120" w:type="dxa"/>
+            </w:tcMar>
+            <w:vAlign w:val="center"/>
+          </w:tcPr>
+          <w:p>
+            <w:pPr>
+              <w:spacing w:before="0" w:after="40" w:line="240" w:lineRule="auto"/>
+              <w:jc w:val="center"/>
+            </w:pPr>
+            <w:r>
+              <w:rPr>
+                <w:rFonts w:ascii="Calibri" w:hAnsi="Calibri" w:eastAsia="Microsoft YaHei"/>
+                <w:color w:val="1F2D3D"/>
+                <w:sz w:val="18"/>
+              </w:rPr>
+              <w:t>0.750</w:t>
+            </w:r>
+          </w:p>
+        </w:tc>
+        <w:tc>
+          <w:tcPr>
+            <w:tcW w:type="dxa" w:w="1200"/>
+            <w:tcMar>
+              <w:top w:w="80" w:type="dxa"/>
+              <w:start w:w="120" w:type="dxa"/>
+              <w:bottom w:w="80" w:type="dxa"/>
+              <w:end w:w="120" w:type="dxa"/>
+            </w:tcMar>
+            <w:vAlign w:val="center"/>
+          </w:tcPr>
+          <w:p>
+            <w:pPr>
+              <w:spacing w:before="0" w:after="40" w:line="240" w:lineRule="auto"/>
+              <w:jc w:val="center"/>
+            </w:pPr>
+            <w:r>
+              <w:rPr>
+                <w:rFonts w:ascii="Calibri" w:hAnsi="Calibri" w:eastAsia="Microsoft YaHei"/>
+                <w:color w:val="1F2D3D"/>
+                <w:sz w:val="18"/>
+              </w:rPr>
+              <w:t>0.000</w:t>
+            </w:r>
+          </w:p>
+        </w:tc>
+        <w:tc>
+          <w:tcPr>
+            <w:tcW w:type="dxa" w:w="2400"/>
+            <w:tcMar>
+              <w:top w:w="80" w:type="dxa"/>
+              <w:start w:w="120" w:type="dxa"/>
+              <w:bottom w:w="80" w:type="dxa"/>
+              <w:end w:w="120" w:type="dxa"/>
+            </w:tcMar>
+            <w:vAlign w:val="center"/>
+          </w:tcPr>
+          <w:p>
+            <w:pPr>
+              <w:spacing w:before="0" w:after="40" w:line="240" w:lineRule="auto"/>
+              <w:jc w:val="center"/>
+            </w:pPr>
+            <w:r>
+              <w:rPr>
+                <w:rFonts w:ascii="Calibri" w:hAnsi="Calibri" w:eastAsia="Microsoft YaHei"/>
+                <w:color w:val="1F2D3D"/>
+                <w:sz w:val="18"/>
+              </w:rPr>
+              <w:t>1</w:t>
+            </w:r>
+          </w:p>
+        </w:tc>
+      </w:tr>
+      <w:tr>
+        <w:trPr>
+          <w:cantSplit/>
+        </w:trPr>
+        <w:tc>
+          <w:tcPr>
+            <w:tcW w:type="dxa" w:w="600"/>
+            <w:tcMar>
+              <w:top w:w="80" w:type="dxa"/>
+              <w:start w:w="120" w:type="dxa"/>
+              <w:bottom w:w="80" w:type="dxa"/>
+              <w:end w:w="120" w:type="dxa"/>
+            </w:tcMar>
+            <w:vAlign w:val="center"/>
+          </w:tcPr>
+          <w:p>
+            <w:pPr>
+              <w:spacing w:before="0" w:after="40" w:line="240" w:lineRule="auto"/>
+            </w:pPr>
+            <w:r>
+              <w:rPr>
+                <w:rFonts w:ascii="Calibri" w:hAnsi="Calibri" w:eastAsia="Microsoft YaHei"/>
+                <w:color w:val="1F2D3D"/>
+                <w:sz w:val="18"/>
+              </w:rPr>
+              <w:t>16</w:t>
+            </w:r>
+          </w:p>
+        </w:tc>
+        <w:tc>
+          <w:tcPr>
+            <w:tcW w:type="dxa" w:w="3960"/>
+            <w:tcMar>
+              <w:top w:w="80" w:type="dxa"/>
+              <w:start w:w="120" w:type="dxa"/>
+              <w:bottom w:w="80" w:type="dxa"/>
+              <w:end w:w="120" w:type="dxa"/>
+            </w:tcMar>
+            <w:vAlign w:val="center"/>
+          </w:tcPr>
+          <w:p>
+            <w:pPr>
+              <w:spacing w:before="0" w:after="40" w:line="240" w:lineRule="auto"/>
+            </w:pPr>
+            <w:r>
+              <w:rPr>
+                <w:rFonts w:ascii="Calibri" w:hAnsi="Calibri" w:eastAsia="Microsoft YaHei"/>
+                <w:color w:val="1F2D3D"/>
+                <w:sz w:val="18"/>
+              </w:rPr>
+              <w:t>Crisis Backup Decision</w:t>
+            </w:r>
+          </w:p>
+        </w:tc>
+        <w:tc>
+          <w:tcPr>
+            <w:tcW w:type="dxa" w:w="1200"/>
+            <w:tcMar>
+              <w:top w:w="80" w:type="dxa"/>
+              <w:start w:w="120" w:type="dxa"/>
+              <w:bottom w:w="80" w:type="dxa"/>
+              <w:end w:w="120" w:type="dxa"/>
+            </w:tcMar>
+            <w:vAlign w:val="center"/>
+          </w:tcPr>
+          <w:p>
+            <w:pPr>
+              <w:spacing w:before="0" w:after="40" w:line="240" w:lineRule="auto"/>
+              <w:jc w:val="center"/>
+            </w:pPr>
+            <w:r>
+              <w:rPr>
+                <w:rFonts w:ascii="Calibri" w:hAnsi="Calibri" w:eastAsia="Microsoft YaHei"/>
+                <w:color w:val="1F2D3D"/>
+                <w:sz w:val="18"/>
+              </w:rPr>
+              <w:t>0.500</w:t>
+            </w:r>
+          </w:p>
+        </w:tc>
+        <w:tc>
+          <w:tcPr>
+            <w:tcW w:type="dxa" w:w="1200"/>
+            <w:tcMar>
+              <w:top w:w="80" w:type="dxa"/>
+              <w:start w:w="120" w:type="dxa"/>
+              <w:bottom w:w="80" w:type="dxa"/>
+              <w:end w:w="120" w:type="dxa"/>
+            </w:tcMar>
+            <w:vAlign w:val="center"/>
+          </w:tcPr>
+          <w:p>
+            <w:pPr>
+              <w:spacing w:before="0" w:after="40" w:line="240" w:lineRule="auto"/>
+              <w:jc w:val="center"/>
+            </w:pPr>
+            <w:r>
+              <w:rPr>
+                <w:rFonts w:ascii="Calibri" w:hAnsi="Calibri" w:eastAsia="Microsoft YaHei"/>
+                <w:color w:val="1F2D3D"/>
+                <w:sz w:val="18"/>
+              </w:rPr>
+              <w:t>0.500</w:t>
+            </w:r>
+          </w:p>
+        </w:tc>
+        <w:tc>
+          <w:tcPr>
+            <w:tcW w:type="dxa" w:w="2400"/>
+            <w:tcMar>
+              <w:top w:w="80" w:type="dxa"/>
+              <w:start w:w="120" w:type="dxa"/>
+              <w:bottom w:w="80" w:type="dxa"/>
+              <w:end w:w="120" w:type="dxa"/>
+            </w:tcMar>
+            <w:vAlign w:val="center"/>
+          </w:tcPr>
+          <w:p>
+            <w:pPr>
+              <w:spacing w:before="0" w:after="40" w:line="240" w:lineRule="auto"/>
+              <w:jc w:val="center"/>
+            </w:pPr>
+            <w:r>
+              <w:rPr>
+                <w:rFonts w:ascii="Calibri" w:hAnsi="Calibri" w:eastAsia="Microsoft YaHei"/>
+                <w:color w:val="1F2D3D"/>
+                <w:sz w:val="18"/>
+              </w:rPr>
+              <w:t>2</w:t>
+            </w:r>
+          </w:p>
+        </w:tc>
+      </w:tr>
+      <w:tr>
+        <w:trPr>
+          <w:cantSplit/>
+        </w:trPr>
+        <w:tc>
+          <w:tcPr>
+            <w:tcW w:type="dxa" w:w="600"/>
+            <w:tcMar>
+              <w:top w:w="80" w:type="dxa"/>
+              <w:start w:w="120" w:type="dxa"/>
+              <w:bottom w:w="80" w:type="dxa"/>
+              <w:end w:w="120" w:type="dxa"/>
+            </w:tcMar>
+            <w:vAlign w:val="center"/>
+          </w:tcPr>
+          <w:p>
+            <w:pPr>
+              <w:spacing w:before="0" w:after="40" w:line="240" w:lineRule="auto"/>
+            </w:pPr>
+            <w:r>
+              <w:rPr>
+                <w:rFonts w:ascii="Calibri" w:hAnsi="Calibri" w:eastAsia="Microsoft YaHei"/>
+                <w:color w:val="1F2D3D"/>
+                <w:sz w:val="18"/>
+              </w:rPr>
+              <w:t>25</w:t>
+            </w:r>
+          </w:p>
+        </w:tc>
+        <w:tc>
+          <w:tcPr>
+            <w:tcW w:type="dxa" w:w="3960"/>
+            <w:tcMar>
+              <w:top w:w="80" w:type="dxa"/>
+              <w:start w:w="120" w:type="dxa"/>
+              <w:bottom w:w="80" w:type="dxa"/>
+              <w:end w:w="120" w:type="dxa"/>
+            </w:tcMar>
+            <w:vAlign w:val="center"/>
+          </w:tcPr>
+          <w:p>
+            <w:pPr>
+              <w:spacing w:before="0" w:after="40" w:line="240" w:lineRule="auto"/>
+            </w:pPr>
+            <w:r>
+              <w:rPr>
+                <w:rFonts w:ascii="Calibri" w:hAnsi="Calibri" w:eastAsia="Microsoft YaHei"/>
+                <w:color w:val="1F2D3D"/>
+                <w:sz w:val="18"/>
+              </w:rPr>
+              <w:t>select_emergency_shelter</w:t>
+            </w:r>
+          </w:p>
+        </w:tc>
+        <w:tc>
+          <w:tcPr>
+            <w:tcW w:type="dxa" w:w="1200"/>
+            <w:tcMar>
+              <w:top w:w="80" w:type="dxa"/>
+              <w:start w:w="120" w:type="dxa"/>
+              <w:bottom w:w="80" w:type="dxa"/>
+              <w:end w:w="120" w:type="dxa"/>
+            </w:tcMar>
+            <w:vAlign w:val="center"/>
+          </w:tcPr>
+          <w:p>
+            <w:pPr>
+              <w:spacing w:before="0" w:after="40" w:line="240" w:lineRule="auto"/>
+              <w:jc w:val="center"/>
+            </w:pPr>
+            <w:r>
+              <w:rPr>
+                <w:rFonts w:ascii="Calibri" w:hAnsi="Calibri" w:eastAsia="Microsoft YaHei"/>
+                <w:color w:val="1F2D3D"/>
+                <w:sz w:val="18"/>
+              </w:rPr>
+              <w:t>1.000</w:t>
+            </w:r>
+          </w:p>
+        </w:tc>
+        <w:tc>
+          <w:tcPr>
+            <w:tcW w:type="dxa" w:w="1200"/>
+            <w:tcMar>
+              <w:top w:w="80" w:type="dxa"/>
+              <w:start w:w="120" w:type="dxa"/>
+              <w:bottom w:w="80" w:type="dxa"/>
+              <w:end w:w="120" w:type="dxa"/>
+            </w:tcMar>
+            <w:vAlign w:val="center"/>
+          </w:tcPr>
+          <w:p>
+            <w:pPr>
+              <w:spacing w:before="0" w:after="40" w:line="240" w:lineRule="auto"/>
+              <w:jc w:val="center"/>
+            </w:pPr>
+            <w:r>
+              <w:rPr>
+                <w:rFonts w:ascii="Calibri" w:hAnsi="Calibri" w:eastAsia="Microsoft YaHei"/>
+                <w:color w:val="1F2D3D"/>
+                <w:sz w:val="18"/>
+              </w:rPr>
+              <w:t>1.000</w:t>
+            </w:r>
+          </w:p>
+        </w:tc>
+        <w:tc>
+          <w:tcPr>
+            <w:tcW w:type="dxa" w:w="2400"/>
+            <w:tcMar>
+              <w:top w:w="80" w:type="dxa"/>
+              <w:start w:w="120" w:type="dxa"/>
+              <w:bottom w:w="80" w:type="dxa"/>
+              <w:end w:w="120" w:type="dxa"/>
+            </w:tcMar>
+            <w:vAlign w:val="center"/>
+          </w:tcPr>
+          <w:p>
+            <w:pPr>
+              <w:spacing w:before="0" w:after="40" w:line="240" w:lineRule="auto"/>
+              <w:jc w:val="center"/>
+            </w:pPr>
+            <w:r>
+              <w:rPr>
+                <w:rFonts w:ascii="Calibri" w:hAnsi="Calibri" w:eastAsia="Microsoft YaHei"/>
+                <w:color w:val="1F2D3D"/>
+                <w:sz w:val="18"/>
+              </w:rPr>
+              <w:t>0</w:t>
+            </w:r>
+          </w:p>
+        </w:tc>
+      </w:tr>
+      <w:tr>
+        <w:trPr>
+          <w:cantSplit/>
+        </w:trPr>
+        <w:tc>
+          <w:tcPr>
+            <w:tcW w:type="dxa" w:w="600"/>
+            <w:tcMar>
+              <w:top w:w="80" w:type="dxa"/>
+              <w:start w:w="120" w:type="dxa"/>
+              <w:bottom w:w="80" w:type="dxa"/>
+              <w:end w:w="120" w:type="dxa"/>
+            </w:tcMar>
+            <w:vAlign w:val="center"/>
+          </w:tcPr>
+          <w:p>
+            <w:pPr>
+              <w:spacing w:before="0" w:after="40" w:line="240" w:lineRule="auto"/>
+            </w:pPr>
+            <w:r>
+              <w:rPr>
+                <w:rFonts w:ascii="Calibri" w:hAnsi="Calibri" w:eastAsia="Microsoft YaHei"/>
+                <w:color w:val="1F2D3D"/>
+                <w:sz w:val="18"/>
+              </w:rPr>
+              <w:t>47</w:t>
+            </w:r>
+          </w:p>
+        </w:tc>
+        <w:tc>
+          <w:tcPr>
+            <w:tcW w:type="dxa" w:w="3960"/>
+            <w:tcMar>
+              <w:top w:w="80" w:type="dxa"/>
+              <w:start w:w="120" w:type="dxa"/>
+              <w:bottom w:w="80" w:type="dxa"/>
+              <w:end w:w="120" w:type="dxa"/>
+            </w:tcMar>
+            <w:vAlign w:val="center"/>
+          </w:tcPr>
+          <w:p>
+            <w:pPr>
+              <w:spacing w:before="0" w:after="40" w:line="240" w:lineRule="auto"/>
+            </w:pPr>
+            <w:r>
+              <w:rPr>
+                <w:rFonts w:ascii="Calibri" w:hAnsi="Calibri" w:eastAsia="Microsoft YaHei"/>
+                <w:color w:val="1F2D3D"/>
+                <w:sz w:val="18"/>
+              </w:rPr>
+              <w:t>Find the Missing Prototype</w:t>
+            </w:r>
+          </w:p>
+        </w:tc>
+        <w:tc>
+          <w:tcPr>
+            <w:tcW w:type="dxa" w:w="1200"/>
+            <w:tcMar>
+              <w:top w:w="80" w:type="dxa"/>
+              <w:start w:w="120" w:type="dxa"/>
+              <w:bottom w:w="80" w:type="dxa"/>
+              <w:end w:w="120" w:type="dxa"/>
+            </w:tcMar>
+            <w:vAlign w:val="center"/>
+          </w:tcPr>
+          <w:p>
+            <w:pPr>
+              <w:spacing w:before="0" w:after="40" w:line="240" w:lineRule="auto"/>
+              <w:jc w:val="center"/>
+            </w:pPr>
+            <w:r>
+              <w:rPr>
+                <w:rFonts w:ascii="Calibri" w:hAnsi="Calibri" w:eastAsia="Microsoft YaHei"/>
+                <w:color w:val="1F2D3D"/>
+                <w:sz w:val="18"/>
+              </w:rPr>
+              <w:t>1.000</w:t>
+            </w:r>
+          </w:p>
+        </w:tc>
+        <w:tc>
+          <w:tcPr>
+            <w:tcW w:type="dxa" w:w="1200"/>
+            <w:tcMar>
+              <w:top w:w="80" w:type="dxa"/>
+              <w:start w:w="120" w:type="dxa"/>
+              <w:bottom w:w="80" w:type="dxa"/>
+              <w:end w:w="120" w:type="dxa"/>
+            </w:tcMar>
+            <w:vAlign w:val="center"/>
+          </w:tcPr>
+          <w:p>
+            <w:pPr>
+              <w:spacing w:before="0" w:after="40" w:line="240" w:lineRule="auto"/>
+              <w:jc w:val="center"/>
+            </w:pPr>
+            <w:r>
+              <w:rPr>
+                <w:rFonts w:ascii="Calibri" w:hAnsi="Calibri" w:eastAsia="Microsoft YaHei"/>
+                <w:color w:val="1F2D3D"/>
+                <w:sz w:val="18"/>
+              </w:rPr>
+              <w:t>0.750</w:t>
+            </w:r>
+          </w:p>
+        </w:tc>
+        <w:tc>
+          <w:tcPr>
+            <w:tcW w:type="dxa" w:w="2400"/>
+            <w:tcMar>
+              <w:top w:w="80" w:type="dxa"/>
+              <w:start w:w="120" w:type="dxa"/>
+              <w:bottom w:w="80" w:type="dxa"/>
+              <w:end w:w="120" w:type="dxa"/>
+            </w:tcMar>
+            <w:vAlign w:val="center"/>
+          </w:tcPr>
+          <w:p>
+            <w:pPr>
+              <w:spacing w:before="0" w:after="40" w:line="240" w:lineRule="auto"/>
+              <w:jc w:val="center"/>
+            </w:pPr>
+            <w:r>
+              <w:rPr>
+                <w:rFonts w:ascii="Calibri" w:hAnsi="Calibri" w:eastAsia="Microsoft YaHei"/>
+                <w:color w:val="1F2D3D"/>
+                <w:sz w:val="18"/>
+              </w:rPr>
+              <w:t>0</w:t>
+            </w:r>
+          </w:p>
+        </w:tc>
+      </w:tr>
+      <w:tr>
+        <w:trPr>
+          <w:cantSplit/>
+        </w:trPr>
+        <w:tc>
+          <w:tcPr>
+            <w:tcW w:type="dxa" w:w="600"/>
+            <w:tcMar>
+              <w:top w:w="80" w:type="dxa"/>
+              <w:start w:w="120" w:type="dxa"/>
+              <w:bottom w:w="80" w:type="dxa"/>
+              <w:end w:w="120" w:type="dxa"/>
+            </w:tcMar>
+            <w:vAlign w:val="center"/>
+          </w:tcPr>
+          <w:p>
+            <w:pPr>
+              <w:spacing w:before="0" w:after="40" w:line="240" w:lineRule="auto"/>
+            </w:pPr>
+            <w:r>
+              <w:rPr>
+                <w:rFonts w:ascii="Calibri" w:hAnsi="Calibri" w:eastAsia="Microsoft YaHei"/>
+                <w:color w:val="1F2D3D"/>
+                <w:sz w:val="18"/>
+              </w:rPr>
+              <w:t>62</w:t>
+            </w:r>
+          </w:p>
+        </w:tc>
+        <w:tc>
+          <w:tcPr>
+            <w:tcW w:type="dxa" w:w="3960"/>
+            <w:tcMar>
+              <w:top w:w="80" w:type="dxa"/>
+              <w:start w:w="120" w:type="dxa"/>
+              <w:bottom w:w="80" w:type="dxa"/>
+              <w:end w:w="120" w:type="dxa"/>
+            </w:tcMar>
+            <w:vAlign w:val="center"/>
+          </w:tcPr>
+          <w:p>
+            <w:pPr>
+              <w:spacing w:before="0" w:after="40" w:line="240" w:lineRule="auto"/>
+            </w:pPr>
+            <w:r>
+              <w:rPr>
+                <w:rFonts w:ascii="Calibri" w:hAnsi="Calibri" w:eastAsia="Microsoft YaHei"/>
+                <w:color w:val="1F2D3D"/>
+                <w:sz w:val="18"/>
+              </w:rPr>
+              <w:t>company_acquisition_decision</w:t>
+            </w:r>
+          </w:p>
+        </w:tc>
+        <w:tc>
+          <w:tcPr>
+            <w:tcW w:type="dxa" w:w="1200"/>
+            <w:tcMar>
+              <w:top w:w="80" w:type="dxa"/>
+              <w:start w:w="120" w:type="dxa"/>
+              <w:bottom w:w="80" w:type="dxa"/>
+              <w:end w:w="120" w:type="dxa"/>
+            </w:tcMar>
+            <w:vAlign w:val="center"/>
+          </w:tcPr>
+          <w:p>
+            <w:pPr>
+              <w:spacing w:before="0" w:after="40" w:line="240" w:lineRule="auto"/>
+              <w:jc w:val="center"/>
+            </w:pPr>
+            <w:r>
+              <w:rPr>
+                <w:rFonts w:ascii="Calibri" w:hAnsi="Calibri" w:eastAsia="Microsoft YaHei"/>
+                <w:color w:val="1F2D3D"/>
+                <w:sz w:val="18"/>
+              </w:rPr>
+              <w:t>1.000</w:t>
+            </w:r>
+          </w:p>
+        </w:tc>
+        <w:tc>
+          <w:tcPr>
+            <w:tcW w:type="dxa" w:w="1200"/>
+            <w:tcMar>
+              <w:top w:w="80" w:type="dxa"/>
+              <w:start w:w="120" w:type="dxa"/>
+              <w:bottom w:w="80" w:type="dxa"/>
+              <w:end w:w="120" w:type="dxa"/>
+            </w:tcMar>
+            <w:vAlign w:val="center"/>
+          </w:tcPr>
+          <w:p>
+            <w:pPr>
+              <w:spacing w:before="0" w:after="40" w:line="240" w:lineRule="auto"/>
+              <w:jc w:val="center"/>
+            </w:pPr>
+            <w:r>
+              <w:rPr>
+                <w:rFonts w:ascii="Calibri" w:hAnsi="Calibri" w:eastAsia="Microsoft YaHei"/>
+                <w:color w:val="1F2D3D"/>
+                <w:sz w:val="18"/>
+              </w:rPr>
+              <w:t>0.750</w:t>
+            </w:r>
+          </w:p>
+        </w:tc>
+        <w:tc>
+          <w:tcPr>
+            <w:tcW w:type="dxa" w:w="2400"/>
+            <w:tcMar>
+              <w:top w:w="80" w:type="dxa"/>
+              <w:start w:w="120" w:type="dxa"/>
+              <w:bottom w:w="80" w:type="dxa"/>
+              <w:end w:w="120" w:type="dxa"/>
+            </w:tcMar>
+            <w:vAlign w:val="center"/>
+          </w:tcPr>
+          <w:p>
+            <w:pPr>
+              <w:spacing w:before="0" w:after="40" w:line="240" w:lineRule="auto"/>
+              <w:jc w:val="center"/>
+            </w:pPr>
+            <w:r>
+              <w:rPr>
+                <w:rFonts w:ascii="Calibri" w:hAnsi="Calibri" w:eastAsia="Microsoft YaHei"/>
+                <w:color w:val="1F2D3D"/>
+                <w:sz w:val="18"/>
+              </w:rPr>
+              <w:t>0</w:t>
+            </w:r>
+          </w:p>
+        </w:tc>
+      </w:tr>
+      <w:tr>
+        <w:trPr>
+          <w:cantSplit/>
+        </w:trPr>
+        <w:tc>
+          <w:tcPr>
+            <w:tcW w:type="dxa" w:w="600"/>
+            <w:tcMar>
+              <w:top w:w="80" w:type="dxa"/>
+              <w:start w:w="120" w:type="dxa"/>
+              <w:bottom w:w="80" w:type="dxa"/>
+              <w:end w:w="120" w:type="dxa"/>
+            </w:tcMar>
+            <w:vAlign w:val="center"/>
+          </w:tcPr>
+          <w:p>
+            <w:pPr>
+              <w:spacing w:before="0" w:after="40" w:line="240" w:lineRule="auto"/>
+            </w:pPr>
+            <w:r>
+              <w:rPr>
+                <w:rFonts w:ascii="Calibri" w:hAnsi="Calibri" w:eastAsia="Microsoft YaHei"/>
+                <w:b/>
+                <w:color w:val="1F2D3D"/>
+                <w:sz w:val="18"/>
+              </w:rPr>
+              <w:t>平均/合计</w:t>
+            </w:r>
+          </w:p>
+        </w:tc>
+        <w:tc>
+          <w:tcPr>
+            <w:tcW w:type="dxa" w:w="3960"/>
+            <w:tcMar>
+              <w:top w:w="80" w:type="dxa"/>
+              <w:start w:w="120" w:type="dxa"/>
+              <w:bottom w:w="80" w:type="dxa"/>
+              <w:end w:w="120" w:type="dxa"/>
+            </w:tcMar>
+            <w:vAlign w:val="center"/>
+          </w:tcPr>
+          <w:p>
+            <w:pPr>
+              <w:spacing w:before="0" w:after="40" w:line="240" w:lineRule="auto"/>
+            </w:pPr>
+          </w:p>
+        </w:tc>
+        <w:tc>
+          <w:tcPr>
+            <w:tcW w:type="dxa" w:w="1200"/>
+            <w:tcMar>
+              <w:top w:w="80" w:type="dxa"/>
+              <w:start w:w="120" w:type="dxa"/>
+              <w:bottom w:w="80" w:type="dxa"/>
+              <w:end w:w="120" w:type="dxa"/>
+            </w:tcMar>
+            <w:vAlign w:val="center"/>
+          </w:tcPr>
+          <w:p>
+            <w:pPr>
+              <w:spacing w:before="0" w:after="40" w:line="240" w:lineRule="auto"/>
+              <w:jc w:val="center"/>
+            </w:pPr>
+            <w:r>
+              <w:rPr>
+                <w:rFonts w:ascii="Calibri" w:hAnsi="Calibri" w:eastAsia="Microsoft YaHei"/>
+                <w:b/>
+                <w:color w:val="1F2D3D"/>
+                <w:sz w:val="18"/>
+              </w:rPr>
+              <w:t>0.850</w:t>
+            </w:r>
+          </w:p>
+        </w:tc>
+        <w:tc>
+          <w:tcPr>
+            <w:tcW w:type="dxa" w:w="1200"/>
+            <w:tcMar>
+              <w:top w:w="80" w:type="dxa"/>
+              <w:start w:w="120" w:type="dxa"/>
+              <w:bottom w:w="80" w:type="dxa"/>
+              <w:end w:w="120" w:type="dxa"/>
+            </w:tcMar>
+            <w:vAlign w:val="center"/>
+          </w:tcPr>
+          <w:p>
+            <w:pPr>
+              <w:spacing w:before="0" w:after="40" w:line="240" w:lineRule="auto"/>
+              <w:jc w:val="center"/>
+            </w:pPr>
+            <w:r>
+              <w:rPr>
+                <w:rFonts w:ascii="Calibri" w:hAnsi="Calibri" w:eastAsia="Microsoft YaHei"/>
+                <w:b/>
+                <w:color w:val="1F2D3D"/>
+                <w:sz w:val="18"/>
+              </w:rPr>
+              <w:t>0.650</w:t>
+            </w:r>
+          </w:p>
+        </w:tc>
+        <w:tc>
+          <w:tcPr>
+            <w:tcW w:type="dxa" w:w="2400"/>
+            <w:tcMar>
+              <w:top w:w="80" w:type="dxa"/>
+              <w:start w:w="120" w:type="dxa"/>
+              <w:bottom w:w="80" w:type="dxa"/>
+              <w:end w:w="120" w:type="dxa"/>
+            </w:tcMar>
+            <w:vAlign w:val="center"/>
+          </w:tcPr>
+          <w:p>
+            <w:pPr>
+              <w:spacing w:before="0" w:after="40" w:line="240" w:lineRule="auto"/>
+              <w:jc w:val="center"/>
+            </w:pPr>
+            <w:r>
+              <w:rPr>
+                <w:rFonts w:ascii="Calibri" w:hAnsi="Calibri" w:eastAsia="Microsoft YaHei"/>
+                <w:b/>
+                <w:color w:val="1F2D3D"/>
+                <w:sz w:val="18"/>
+              </w:rPr>
+              <w:t>6</w:t>
+            </w:r>
+          </w:p>
+        </w:tc>
+      </w:tr>
+    </w:tbl>
+    <w:p>
+      <w:pPr>
+        <w:spacing w:after="0"/>
+      </w:pPr>
+    </w:p>
+    <w:p>
+      <w:pPr>
+        <w:widowControl/>
+      </w:pPr>
+      <w:r>
+        <w:rPr>
+          <w:rFonts w:ascii="Calibri" w:hAnsi="Calibri" w:eastAsia="Microsoft YaHei"/>
+          <w:color w:val="1F2D3D"/>
+          <w:sz w:val="22"/>
+        </w:rPr>
+        <w:t xml:space="preserve">原 </w:t>
+      </w:r>
+      <w:r>
+        <w:rPr>
+          <w:rFonts w:ascii="Consolas" w:hAnsi="Consolas" w:eastAsia="Microsoft YaHei"/>
+          <w:color w:val="1F4D78"/>
+          <w:sz w:val="21"/>
+        </w:rPr>
+        <w:t>lexical-v1</w:t>
+      </w:r>
+      <w:r>
+        <w:rPr>
+          <w:rFonts w:ascii="Calibri" w:hAnsi="Calibri" w:eastAsia="Microsoft YaHei"/>
+          <w:color w:val="1F2D3D"/>
+          <w:sz w:val="22"/>
+        </w:rPr>
+        <w:t xml:space="preserve"> 在十题上的平均披露率为 0.025、跨 Agent 使用率为 0.000。v2 修正为 0.850 和 0.650，说明旧结果主要反映词法漏检，不能 解释为 Agent 普遍没有披露信息。</w:t>
+      </w:r>
+    </w:p>
+    <w:p>
+      <w:pPr>
+        <w:widowControl/>
+      </w:pPr>
+      <w:r>
+        <w:rPr>
+          <w:rFonts w:ascii="Calibri" w:hAnsi="Calibri" w:eastAsia="Microsoft YaHei"/>
+          <w:color w:val="1F2D3D"/>
+          <w:sz w:val="22"/>
+        </w:rPr>
+        <w:t>仍保留的 6 个 FM-2.4 自动候选是：</w:t>
+      </w:r>
+    </w:p>
+    <w:p>
+      <w:pPr>
+        <w:pStyle w:val="ListBullet"/>
+      </w:pPr>
+      <w:r>
+        <w:rPr>
+          <w:rFonts w:ascii="Calibri" w:hAnsi="Calibri" w:eastAsia="Microsoft YaHei"/>
+          <w:color w:val="1F2D3D"/>
+          <w:sz w:val="22"/>
+        </w:rPr>
+        <w:t>ID 1 / agent-c：未公开“步道因倒树关闭”；</w:t>
+      </w:r>
+    </w:p>
+    <w:p>
+      <w:pPr>
+        <w:pStyle w:val="ListBullet"/>
+      </w:pPr>
+      <w:r>
+        <w:rPr>
+          <w:rFonts w:ascii="Calibri" w:hAnsi="Calibri" w:eastAsia="Microsoft YaHei"/>
+          <w:color w:val="1F2D3D"/>
+          <w:sz w:val="22"/>
+        </w:rPr>
+        <w:t>ID 5 / agent-a：未公开其候选人资料包中的决策相关私有点；</w:t>
+      </w:r>
+    </w:p>
+    <w:p>
+      <w:pPr>
+        <w:pStyle w:val="ListBullet"/>
+      </w:pPr>
+      <w:r>
+        <w:rPr>
+          <w:rFonts w:ascii="Calibri" w:hAnsi="Calibri" w:eastAsia="Microsoft YaHei"/>
+          <w:color w:val="1F2D3D"/>
+          <w:sz w:val="22"/>
+        </w:rPr>
+        <w:t>ID 9 / agent-a：未公开“Hospital A 山路已清理并确认安全”；</w:t>
+      </w:r>
+    </w:p>
+    <w:p>
+      <w:pPr>
+        <w:pStyle w:val="ListBullet"/>
+      </w:pPr>
+      <w:r>
+        <w:rPr>
+          <w:rFonts w:ascii="Calibri" w:hAnsi="Calibri" w:eastAsia="Microsoft YaHei"/>
+          <w:color w:val="1F2D3D"/>
+          <w:sz w:val="22"/>
+        </w:rPr>
+        <w:t>ID 14 / agent-b：未公开“Restaurant C 次餐厅仍对公众开放”；</w:t>
+      </w:r>
+    </w:p>
+    <w:p>
+      <w:pPr>
+        <w:pStyle w:val="ListBullet"/>
+      </w:pPr>
+      <w:r>
+        <w:rPr>
+          <w:rFonts w:ascii="Calibri" w:hAnsi="Calibri" w:eastAsia="Microsoft YaHei"/>
+          <w:color w:val="1F2D3D"/>
+          <w:sz w:val="22"/>
+        </w:rPr>
+        <w:t>ID 16 / agent-a：未公开“Charlie 电缆已修复并通过额外安全审计”；</w:t>
+      </w:r>
+    </w:p>
+    <w:p>
+      <w:pPr>
+        <w:pStyle w:val="ListBullet"/>
+      </w:pPr>
+      <w:r>
+        <w:rPr>
+          <w:rFonts w:ascii="Calibri" w:hAnsi="Calibri" w:eastAsia="Microsoft YaHei"/>
+          <w:color w:val="1F2D3D"/>
+          <w:sz w:val="22"/>
+        </w:rPr>
+        <w:t>ID 16 / agent-d：未公开“Bravo 临时负责人不熟悉应急流程”。</w:t>
+      </w:r>
+    </w:p>
+    <w:p>
+      <w:pPr>
+        <w:widowControl/>
+      </w:pPr>
+      <w:r>
+        <w:rPr>
+          <w:rFonts w:ascii="Calibri" w:hAnsi="Calibri" w:eastAsia="Microsoft YaHei"/>
+          <w:color w:val="1F2D3D"/>
+          <w:sz w:val="22"/>
+        </w:rPr>
+        <w:t>人工复核这些所有者的 15 次发言后，没有发现能够推翻上述 6 个候选的 明确表达，因此它们不是本轮已知的词法漏检；但最终是否构成 MAST FM-2.4，仍需结合任务重要性和完整上下文人工定性。</w:t>
       </w:r>
     </w:p>
     <w:p>
@@ -4648,6 +6733,58 @@
           <w:color w:val="1F2D3D"/>
           <w:sz w:val="22"/>
         </w:rPr>
+        <w:t>v2 信息披露重评分：0 次新增模型/API 请求，原始回答和投票未改动；</w:t>
+      </w:r>
+    </w:p>
+    <w:p>
+      <w:pPr>
+        <w:pStyle w:val="ListBullet"/>
+      </w:pPr>
+      <w:r>
+        <w:rPr>
+          <w:rFonts w:ascii="Calibri" w:hAnsi="Calibri" w:eastAsia="Microsoft YaHei"/>
+          <w:color w:val="1F2D3D"/>
+          <w:sz w:val="22"/>
+        </w:rPr>
+        <w:t>ID 25 自动披露率：由 0.000 修正为 1.000；</w:t>
+      </w:r>
+    </w:p>
+    <w:p>
+      <w:pPr>
+        <w:pStyle w:val="ListBullet"/>
+      </w:pPr>
+      <w:r>
+        <w:rPr>
+          <w:rFonts w:ascii="Calibri" w:hAnsi="Calibri" w:eastAsia="Microsoft YaHei"/>
+          <w:color w:val="1F2D3D"/>
+          <w:sz w:val="22"/>
+        </w:rPr>
+        <w:t>十题平均自动披露率：由 0.025 修正为 0.850；</w:t>
+      </w:r>
+    </w:p>
+    <w:p>
+      <w:pPr>
+        <w:pStyle w:val="ListBullet"/>
+      </w:pPr>
+      <w:r>
+        <w:rPr>
+          <w:rFonts w:ascii="Calibri" w:hAnsi="Calibri" w:eastAsia="Microsoft YaHei"/>
+          <w:color w:val="1F2D3D"/>
+          <w:sz w:val="22"/>
+        </w:rPr>
+        <w:t>十题平均跨 Agent 使用率：由 0.000 修正为 0.650；</w:t>
+      </w:r>
+    </w:p>
+    <w:p>
+      <w:pPr>
+        <w:pStyle w:val="ListBullet"/>
+      </w:pPr>
+      <w:r>
+        <w:rPr>
+          <w:rFonts w:ascii="Calibri" w:hAnsi="Calibri" w:eastAsia="Microsoft YaHei"/>
+          <w:color w:val="1F2D3D"/>
+          <w:sz w:val="22"/>
+        </w:rPr>
         <w:t>总输入 token：1,205,166；</w:t>
       </w:r>
     </w:p>
@@ -4700,7 +6837,7 @@
           <w:color w:val="1F2D3D"/>
           <w:sz w:val="22"/>
         </w:rPr>
-        <w:t>全套测试：133 项通过；</w:t>
+        <w:t>全套测试：149 项通过；</w:t>
       </w:r>
     </w:p>
     <w:p>
@@ -5171,6 +7308,19 @@
           <w:color w:val="1F2D3D"/>
           <w:sz w:val="22"/>
         </w:rPr>
+        <w:t>修复了自动信息披露指标的释义漏检，并增加反向陈述保护；</w:t>
+      </w:r>
+    </w:p>
+    <w:p>
+      <w:pPr>
+        <w:pStyle w:val="ListBullet"/>
+      </w:pPr>
+      <w:r>
+        <w:rPr>
+          <w:rFonts w:ascii="Calibri" w:hAnsi="Calibri" w:eastAsia="Microsoft YaHei"/>
+          <w:color w:val="1F2D3D"/>
+          <w:sz w:val="22"/>
+        </w:rPr>
         <w:t>发现讨论增益与错误共识同时存在。</w:t>
       </w:r>
     </w:p>
@@ -5192,7 +7342,7 @@
         <w:spacing w:after="160" w:line="280" w:lineRule="auto"/>
         <w:numPr>
           <w:ilvl w:val="0"/>
-          <w:numId w:val="15"/>
+          <w:numId w:val="18"/>
         </w:numPr>
       </w:pPr>
       <w:r>
@@ -5222,7 +7372,7 @@
         <w:spacing w:after="160" w:line="280" w:lineRule="auto"/>
         <w:numPr>
           <w:ilvl w:val="0"/>
-          <w:numId w:val="16"/>
+          <w:numId w:val="19"/>
         </w:numPr>
       </w:pPr>
       <w:r>
@@ -5271,7 +7421,7 @@
           <w:color w:val="1F4D78"/>
           <w:sz w:val="21"/>
         </w:rPr>
-        <w:t>artifacts/hiddenbench-showcase-20260728.jsonl</w:t>
+        <w:t>artifacts/hiddenbench-showcase-20260728-v2.jsonl</w:t>
       </w:r>
       <w:r>
         <w:rPr>
@@ -5279,7 +7429,7 @@
           <w:color w:val="1F2D3D"/>
           <w:sz w:val="22"/>
         </w:rPr>
-        <w:t>：ID 25 原始记录；</w:t>
+        <w:t>：ID 25 v2 重评分记录；</w:t>
       </w:r>
     </w:p>
     <w:p>
@@ -5292,7 +7442,7 @@
           <w:color w:val="1F4D78"/>
           <w:sz w:val="21"/>
         </w:rPr>
-        <w:t>artifacts/hiddenbench-showcase-20260728.md</w:t>
+        <w:t>artifacts/hiddenbench-showcase-20260728-v2.md</w:t>
       </w:r>
       <w:r>
         <w:rPr>
@@ -5313,7 +7463,7 @@
           <w:color w:val="1F4D78"/>
           <w:sz w:val="21"/>
         </w:rPr>
-        <w:t>artifacts/hiddenbench-showcase-20260728.manifest.json</w:t>
+        <w:t>artifacts/hiddenbench-showcase-20260728-v2.manifest.json</w:t>
       </w:r>
       <w:r>
         <w:rPr>
@@ -5334,7 +7484,7 @@
           <w:color w:val="1F4D78"/>
           <w:sz w:val="21"/>
         </w:rPr>
-        <w:t>artifacts/hiddenbench-showcase-20260728.gate.json</w:t>
+        <w:t>artifacts/hiddenbench-showcase-20260728-v2.gate.json</w:t>
       </w:r>
       <w:r>
         <w:rPr>
@@ -5355,7 +7505,7 @@
           <w:color w:val="1F4D78"/>
           <w:sz w:val="21"/>
         </w:rPr>
-        <w:t>artifacts/hiddenbench-screening-20260728.jsonl</w:t>
+        <w:t>artifacts/hiddenbench-screening-20260728-v2.jsonl</w:t>
       </w:r>
       <w:r>
         <w:rPr>
@@ -5363,7 +7513,7 @@
           <w:color w:val="1F2D3D"/>
           <w:sz w:val="22"/>
         </w:rPr>
-        <w:t>：十题原始记录；</w:t>
+        <w:t>：十题 v2 重评分记录；</w:t>
       </w:r>
     </w:p>
     <w:p>
@@ -5376,7 +7526,7 @@
           <w:color w:val="1F4D78"/>
           <w:sz w:val="21"/>
         </w:rPr>
-        <w:t>artifacts/hiddenbench-screening-20260728.md</w:t>
+        <w:t>artifacts/hiddenbench-screening-20260728-v2.md</w:t>
       </w:r>
       <w:r>
         <w:rPr>
@@ -5384,7 +7534,7 @@
           <w:color w:val="1F2D3D"/>
           <w:sz w:val="22"/>
         </w:rPr>
-        <w:t>：十题汇总；</w:t>
+        <w:t>：十题指标汇总；</w:t>
       </w:r>
     </w:p>
     <w:p>
@@ -5397,7 +7547,7 @@
           <w:color w:val="1F4D78"/>
           <w:sz w:val="21"/>
         </w:rPr>
-        <w:t>artifacts/hiddenbench-screening-20260728.manifest.json</w:t>
+        <w:t>artifacts/hiddenbench-screening-20260728-v2.manifest.json</w:t>
       </w:r>
       <w:r>
         <w:rPr>
@@ -5752,7 +7902,7 @@
   <w:abstractNum w:abstractNumId="12">
     <w:multiLevelType w:val="singleLevel"/>
     <w:lvl w:ilvl="0">
-      <w:start w:val="2"/>
+      <w:start w:val="5"/>
       <w:numFmt w:val="decimal"/>
       <w:lvlText w:val="%1."/>
       <w:suff w:val="tab"/>
@@ -5770,7 +7920,7 @@
   <w:abstractNum w:abstractNumId="13">
     <w:multiLevelType w:val="singleLevel"/>
     <w:lvl w:ilvl="0">
-      <w:start w:val="3"/>
+      <w:start w:val="7"/>
       <w:numFmt w:val="decimal"/>
       <w:lvlText w:val="%1."/>
       <w:suff w:val="tab"/>
@@ -5820,6 +7970,60 @@
   </w:abstractNum>
   <w:num w:numId="16">
     <w:abstractNumId w:val="15"/>
+  </w:num>
+  <w:abstractNum w:abstractNumId="16">
+    <w:multiLevelType w:val="singleLevel"/>
+    <w:lvl w:ilvl="0">
+      <w:start w:val="3"/>
+      <w:numFmt w:val="decimal"/>
+      <w:lvlText w:val="%1."/>
+      <w:suff w:val="tab"/>
+      <w:pPr>
+        <w:tabs>
+          <w:tab w:val="num" w:pos="720"/>
+        </w:tabs>
+        <w:ind w:left="720" w:hanging="360"/>
+      </w:pPr>
+    </w:lvl>
+  </w:abstractNum>
+  <w:num w:numId="17">
+    <w:abstractNumId w:val="16"/>
+  </w:num>
+  <w:abstractNum w:abstractNumId="17">
+    <w:multiLevelType w:val="singleLevel"/>
+    <w:lvl w:ilvl="0">
+      <w:start w:val="1"/>
+      <w:numFmt w:val="decimal"/>
+      <w:lvlText w:val="%1."/>
+      <w:suff w:val="tab"/>
+      <w:pPr>
+        <w:tabs>
+          <w:tab w:val="num" w:pos="720"/>
+        </w:tabs>
+        <w:ind w:left="720" w:hanging="360"/>
+      </w:pPr>
+    </w:lvl>
+  </w:abstractNum>
+  <w:num w:numId="18">
+    <w:abstractNumId w:val="17"/>
+  </w:num>
+  <w:abstractNum w:abstractNumId="18">
+    <w:multiLevelType w:val="singleLevel"/>
+    <w:lvl w:ilvl="0">
+      <w:start w:val="2"/>
+      <w:numFmt w:val="decimal"/>
+      <w:lvlText w:val="%1."/>
+      <w:suff w:val="tab"/>
+      <w:pPr>
+        <w:tabs>
+          <w:tab w:val="num" w:pos="720"/>
+        </w:tabs>
+        <w:ind w:left="720" w:hanging="360"/>
+      </w:pPr>
+    </w:lvl>
+  </w:abstractNum>
+  <w:num w:numId="19">
+    <w:abstractNumId w:val="18"/>
   </w:num>
 </w:numbering>
 </file>

</xml_diff>

<commit_message>
docs: complete teacher review package
</commit_message>
<xml_diff>
--- a/reports/给彭老师的HiddenBench_MAF复现实验最终报告_2026-07-28.docx
+++ b/reports/给彭老师的HiddenBench_MAF复现实验最终报告_2026-07-28.docx
@@ -29,7 +29,7 @@
           <w:color w:val="2E74B5"/>
           <w:sz w:val="22"/>
         </w:rPr>
-        <w:t>阶段复现实验最终报告</w:t>
+        <w:t>复现实验最终报告</w:t>
       </w:r>
     </w:p>
     <w:p>
@@ -802,6 +802,692 @@
     </w:p>
     <w:p>
       <w:pPr>
+        <w:pStyle w:val="Heading2"/>
+      </w:pPr>
+      <w:r>
+        <w:rPr>
+          <w:rFonts w:ascii="Calibri" w:hAnsi="Calibri" w:eastAsia="Microsoft YaHei"/>
+          <w:b/>
+          <w:color w:val="2E74B5"/>
+          <w:sz w:val="26"/>
+        </w:rPr>
+        <w:t>3. Microsoft 框架与非 Microsoft 工作的关系</w:t>
+      </w:r>
+    </w:p>
+    <w:p>
+      <w:pPr>
+        <w:widowControl/>
+      </w:pPr>
+      <w:r>
+        <w:rPr>
+          <w:rFonts w:ascii="Calibri" w:hAnsi="Calibri" w:eastAsia="Microsoft YaHei"/>
+          <w:color w:val="1F2D3D"/>
+          <w:sz w:val="22"/>
+        </w:rPr>
+        <w:t>老师提出的核心问题是：已有研究是否做过同类多智能体问题，以及这些 研究是否使用 Microsoft 框架。本次查到的关系如下。</w:t>
+      </w:r>
+    </w:p>
+    <w:tbl>
+      <w:tblPr>
+        <w:tblStyle w:val="TableGrid"/>
+        <w:tblW w:type="dxa" w:w="9360"/>
+        <w:jc w:val="left"/>
+        <w:tblLayout w:type="fixed"/>
+        <w:tblLook w:firstColumn="1" w:firstRow="1" w:lastColumn="0" w:lastRow="0" w:noHBand="0" w:noVBand="1" w:val="04A0"/>
+        <w:tblInd w:w="120" w:type="dxa"/>
+      </w:tblPr>
+      <w:tblGrid>
+        <w:gridCol w:w="1600"/>
+        <w:gridCol w:w="2200"/>
+        <w:gridCol w:w="1700"/>
+        <w:gridCol w:w="3860"/>
+      </w:tblGrid>
+      <w:tr>
+        <w:trPr>
+          <w:cantSplit/>
+          <w:tblHeader w:val="true"/>
+        </w:trPr>
+        <w:tc>
+          <w:tcPr>
+            <w:tcW w:type="dxa" w:w="1600"/>
+            <w:tcMar>
+              <w:top w:w="80" w:type="dxa"/>
+              <w:start w:w="120" w:type="dxa"/>
+              <w:bottom w:w="80" w:type="dxa"/>
+              <w:end w:w="120" w:type="dxa"/>
+            </w:tcMar>
+            <w:vAlign w:val="center"/>
+            <w:shd w:fill="F2F4F7"/>
+          </w:tcPr>
+          <w:p>
+            <w:pPr>
+              <w:spacing w:before="0" w:after="40" w:line="240" w:lineRule="auto"/>
+            </w:pPr>
+            <w:r>
+              <w:rPr>
+                <w:rFonts w:ascii="Calibri" w:hAnsi="Calibri" w:eastAsia="Microsoft YaHei"/>
+                <w:b/>
+                <w:color w:val="1F4D78"/>
+                <w:sz w:val="20"/>
+              </w:rPr>
+              <w:t>研究/系统</w:t>
+            </w:r>
+          </w:p>
+        </w:tc>
+        <w:tc>
+          <w:tcPr>
+            <w:tcW w:type="dxa" w:w="2200"/>
+            <w:tcMar>
+              <w:top w:w="80" w:type="dxa"/>
+              <w:start w:w="120" w:type="dxa"/>
+              <w:bottom w:w="80" w:type="dxa"/>
+              <w:end w:w="120" w:type="dxa"/>
+            </w:tcMar>
+            <w:vAlign w:val="center"/>
+            <w:shd w:fill="F2F4F7"/>
+          </w:tcPr>
+          <w:p>
+            <w:pPr>
+              <w:spacing w:before="0" w:after="40" w:line="240" w:lineRule="auto"/>
+            </w:pPr>
+            <w:r>
+              <w:rPr>
+                <w:rFonts w:ascii="Calibri" w:hAnsi="Calibri" w:eastAsia="Microsoft YaHei"/>
+                <w:b/>
+                <w:color w:val="1F4D78"/>
+                <w:sz w:val="20"/>
+              </w:rPr>
+              <w:t>研究的问题</w:t>
+            </w:r>
+          </w:p>
+        </w:tc>
+        <w:tc>
+          <w:tcPr>
+            <w:tcW w:type="dxa" w:w="1700"/>
+            <w:tcMar>
+              <w:top w:w="80" w:type="dxa"/>
+              <w:start w:w="120" w:type="dxa"/>
+              <w:bottom w:w="80" w:type="dxa"/>
+              <w:end w:w="120" w:type="dxa"/>
+            </w:tcMar>
+            <w:vAlign w:val="center"/>
+            <w:shd w:fill="F2F4F7"/>
+          </w:tcPr>
+          <w:p>
+            <w:pPr>
+              <w:spacing w:before="0" w:after="40" w:line="240" w:lineRule="auto"/>
+            </w:pPr>
+            <w:r>
+              <w:rPr>
+                <w:rFonts w:ascii="Calibri" w:hAnsi="Calibri" w:eastAsia="Microsoft YaHei"/>
+                <w:b/>
+                <w:color w:val="1F4D78"/>
+                <w:sz w:val="20"/>
+              </w:rPr>
+              <w:t>使用的框架</w:t>
+            </w:r>
+          </w:p>
+        </w:tc>
+        <w:tc>
+          <w:tcPr>
+            <w:tcW w:type="dxa" w:w="3860"/>
+            <w:tcMar>
+              <w:top w:w="80" w:type="dxa"/>
+              <w:start w:w="120" w:type="dxa"/>
+              <w:bottom w:w="80" w:type="dxa"/>
+              <w:end w:w="120" w:type="dxa"/>
+            </w:tcMar>
+            <w:vAlign w:val="center"/>
+            <w:shd w:fill="F2F4F7"/>
+          </w:tcPr>
+          <w:p>
+            <w:pPr>
+              <w:spacing w:before="0" w:after="40" w:line="240" w:lineRule="auto"/>
+            </w:pPr>
+            <w:r>
+              <w:rPr>
+                <w:rFonts w:ascii="Calibri" w:hAnsi="Calibri" w:eastAsia="Microsoft YaHei"/>
+                <w:b/>
+                <w:color w:val="1F4D78"/>
+                <w:sz w:val="20"/>
+              </w:rPr>
+              <w:t>与本实验的关系</w:t>
+            </w:r>
+          </w:p>
+        </w:tc>
+      </w:tr>
+      <w:tr>
+        <w:trPr>
+          <w:cantSplit/>
+        </w:trPr>
+        <w:tc>
+          <w:tcPr>
+            <w:tcW w:type="dxa" w:w="1600"/>
+            <w:tcMar>
+              <w:top w:w="80" w:type="dxa"/>
+              <w:start w:w="120" w:type="dxa"/>
+              <w:bottom w:w="80" w:type="dxa"/>
+              <w:end w:w="120" w:type="dxa"/>
+            </w:tcMar>
+            <w:vAlign w:val="center"/>
+          </w:tcPr>
+          <w:p>
+            <w:pPr>
+              <w:spacing w:before="0" w:after="40" w:line="240" w:lineRule="auto"/>
+            </w:pPr>
+            <w:r>
+              <w:rPr>
+                <w:rFonts w:ascii="Calibri" w:hAnsi="Calibri" w:eastAsia="Microsoft YaHei"/>
+                <w:color w:val="1F2D3D"/>
+                <w:sz w:val="20"/>
+              </w:rPr>
+              <w:t>HiddenBench（Li et al., 2025）</w:t>
+            </w:r>
+          </w:p>
+        </w:tc>
+        <w:tc>
+          <w:tcPr>
+            <w:tcW w:type="dxa" w:w="2200"/>
+            <w:tcMar>
+              <w:top w:w="80" w:type="dxa"/>
+              <w:start w:w="120" w:type="dxa"/>
+              <w:bottom w:w="80" w:type="dxa"/>
+              <w:end w:w="120" w:type="dxa"/>
+            </w:tcMar>
+            <w:vAlign w:val="center"/>
+          </w:tcPr>
+          <w:p>
+            <w:pPr>
+              <w:spacing w:before="0" w:after="40" w:line="240" w:lineRule="auto"/>
+            </w:pPr>
+            <w:r>
+              <w:rPr>
+                <w:rFonts w:ascii="Calibri" w:hAnsi="Calibri" w:eastAsia="Microsoft YaHei"/>
+                <w:color w:val="1F2D3D"/>
+                <w:sz w:val="20"/>
+              </w:rPr>
+              <w:t>私有信息分散后，多智能体能否通过讨论得到正确答案</w:t>
+            </w:r>
+          </w:p>
+        </w:tc>
+        <w:tc>
+          <w:tcPr>
+            <w:tcW w:type="dxa" w:w="1700"/>
+            <w:tcMar>
+              <w:top w:w="80" w:type="dxa"/>
+              <w:start w:w="120" w:type="dxa"/>
+              <w:bottom w:w="80" w:type="dxa"/>
+              <w:end w:w="120" w:type="dxa"/>
+            </w:tcMar>
+            <w:vAlign w:val="center"/>
+          </w:tcPr>
+          <w:p>
+            <w:pPr>
+              <w:spacing w:before="0" w:after="40" w:line="240" w:lineRule="auto"/>
+            </w:pPr>
+            <w:r>
+              <w:rPr>
+                <w:rFonts w:ascii="Calibri" w:hAnsi="Calibri" w:eastAsia="Microsoft YaHei"/>
+                <w:color w:val="1F2D3D"/>
+                <w:sz w:val="20"/>
+              </w:rPr>
+              <w:t>论文公开的是任务、Prompt 和评测协议，未把 Microsoft Agent Framework 作为实验变量</w:t>
+            </w:r>
+          </w:p>
+        </w:tc>
+        <w:tc>
+          <w:tcPr>
+            <w:tcW w:type="dxa" w:w="3860"/>
+            <w:tcMar>
+              <w:top w:w="80" w:type="dxa"/>
+              <w:start w:w="120" w:type="dxa"/>
+              <w:bottom w:w="80" w:type="dxa"/>
+              <w:end w:w="120" w:type="dxa"/>
+            </w:tcMar>
+            <w:vAlign w:val="center"/>
+          </w:tcPr>
+          <w:p>
+            <w:pPr>
+              <w:spacing w:before="0" w:after="40" w:line="240" w:lineRule="auto"/>
+            </w:pPr>
+            <w:r>
+              <w:rPr>
+                <w:rFonts w:ascii="Calibri" w:hAnsi="Calibri" w:eastAsia="Microsoft YaHei"/>
+                <w:color w:val="1F2D3D"/>
+                <w:sz w:val="20"/>
+              </w:rPr>
+              <w:t>本实验直接复现其问题和十个官方案例，并迁移到 MAF</w:t>
+            </w:r>
+          </w:p>
+        </w:tc>
+      </w:tr>
+      <w:tr>
+        <w:trPr>
+          <w:cantSplit/>
+        </w:trPr>
+        <w:tc>
+          <w:tcPr>
+            <w:tcW w:type="dxa" w:w="1600"/>
+            <w:tcMar>
+              <w:top w:w="80" w:type="dxa"/>
+              <w:start w:w="120" w:type="dxa"/>
+              <w:bottom w:w="80" w:type="dxa"/>
+              <w:end w:w="120" w:type="dxa"/>
+            </w:tcMar>
+            <w:vAlign w:val="center"/>
+          </w:tcPr>
+          <w:p>
+            <w:pPr>
+              <w:spacing w:before="0" w:after="40" w:line="240" w:lineRule="auto"/>
+            </w:pPr>
+            <w:r>
+              <w:rPr>
+                <w:rFonts w:ascii="Calibri" w:hAnsi="Calibri" w:eastAsia="Microsoft YaHei"/>
+                <w:color w:val="1F2D3D"/>
+                <w:sz w:val="20"/>
+              </w:rPr>
+              <w:t>AutoGen（Wu et al., 2023/2024）</w:t>
+            </w:r>
+          </w:p>
+        </w:tc>
+        <w:tc>
+          <w:tcPr>
+            <w:tcW w:type="dxa" w:w="2200"/>
+            <w:tcMar>
+              <w:top w:w="80" w:type="dxa"/>
+              <w:start w:w="120" w:type="dxa"/>
+              <w:bottom w:w="80" w:type="dxa"/>
+              <w:end w:w="120" w:type="dxa"/>
+            </w:tcMar>
+            <w:vAlign w:val="center"/>
+          </w:tcPr>
+          <w:p>
+            <w:pPr>
+              <w:spacing w:before="0" w:after="40" w:line="240" w:lineRule="auto"/>
+            </w:pPr>
+            <w:r>
+              <w:rPr>
+                <w:rFonts w:ascii="Calibri" w:hAnsi="Calibri" w:eastAsia="Microsoft YaHei"/>
+                <w:color w:val="1F2D3D"/>
+                <w:sz w:val="20"/>
+              </w:rPr>
+              <w:t>用可配置的多智能体对话完成数学、编程、问答和决策任务</w:t>
+            </w:r>
+          </w:p>
+        </w:tc>
+        <w:tc>
+          <w:tcPr>
+            <w:tcW w:type="dxa" w:w="1700"/>
+            <w:tcMar>
+              <w:top w:w="80" w:type="dxa"/>
+              <w:start w:w="120" w:type="dxa"/>
+              <w:bottom w:w="80" w:type="dxa"/>
+              <w:end w:w="120" w:type="dxa"/>
+            </w:tcMar>
+            <w:vAlign w:val="center"/>
+          </w:tcPr>
+          <w:p>
+            <w:pPr>
+              <w:spacing w:before="0" w:after="40" w:line="240" w:lineRule="auto"/>
+            </w:pPr>
+            <w:r>
+              <w:rPr>
+                <w:rFonts w:ascii="Calibri" w:hAnsi="Calibri" w:eastAsia="Microsoft YaHei"/>
+                <w:color w:val="1F2D3D"/>
+                <w:sz w:val="20"/>
+              </w:rPr>
+              <w:t>Microsoft AutoGen</w:t>
+            </w:r>
+          </w:p>
+        </w:tc>
+        <w:tc>
+          <w:tcPr>
+            <w:tcW w:type="dxa" w:w="3860"/>
+            <w:tcMar>
+              <w:top w:w="80" w:type="dxa"/>
+              <w:start w:w="120" w:type="dxa"/>
+              <w:bottom w:w="80" w:type="dxa"/>
+              <w:end w:w="120" w:type="dxa"/>
+            </w:tcMar>
+            <w:vAlign w:val="center"/>
+          </w:tcPr>
+          <w:p>
+            <w:pPr>
+              <w:spacing w:before="0" w:after="40" w:line="240" w:lineRule="auto"/>
+            </w:pPr>
+            <w:r>
+              <w:rPr>
+                <w:rFonts w:ascii="Calibri" w:hAnsi="Calibri" w:eastAsia="Microsoft YaHei"/>
+                <w:color w:val="1F2D3D"/>
+                <w:sz w:val="20"/>
+              </w:rPr>
+              <w:t>证明 Microsoft 系框架可以承载多智能体会话，但没有针对 HiddenBench 的分布式私有信息问题</w:t>
+            </w:r>
+          </w:p>
+        </w:tc>
+      </w:tr>
+      <w:tr>
+        <w:trPr>
+          <w:cantSplit/>
+        </w:trPr>
+        <w:tc>
+          <w:tcPr>
+            <w:tcW w:type="dxa" w:w="1600"/>
+            <w:tcMar>
+              <w:top w:w="80" w:type="dxa"/>
+              <w:start w:w="120" w:type="dxa"/>
+              <w:bottom w:w="80" w:type="dxa"/>
+              <w:end w:w="120" w:type="dxa"/>
+            </w:tcMar>
+            <w:vAlign w:val="center"/>
+          </w:tcPr>
+          <w:p>
+            <w:pPr>
+              <w:spacing w:before="0" w:after="40" w:line="240" w:lineRule="auto"/>
+            </w:pPr>
+            <w:r>
+              <w:rPr>
+                <w:rFonts w:ascii="Calibri" w:hAnsi="Calibri" w:eastAsia="Microsoft YaHei"/>
+                <w:color w:val="1F2D3D"/>
+                <w:sz w:val="20"/>
+              </w:rPr>
+              <w:t>Multiagent Debate（Du et al., 2023/2024）</w:t>
+            </w:r>
+          </w:p>
+        </w:tc>
+        <w:tc>
+          <w:tcPr>
+            <w:tcW w:type="dxa" w:w="2200"/>
+            <w:tcMar>
+              <w:top w:w="80" w:type="dxa"/>
+              <w:start w:w="120" w:type="dxa"/>
+              <w:bottom w:w="80" w:type="dxa"/>
+              <w:end w:w="120" w:type="dxa"/>
+            </w:tcMar>
+            <w:vAlign w:val="center"/>
+          </w:tcPr>
+          <w:p>
+            <w:pPr>
+              <w:spacing w:before="0" w:after="40" w:line="240" w:lineRule="auto"/>
+            </w:pPr>
+            <w:r>
+              <w:rPr>
+                <w:rFonts w:ascii="Calibri" w:hAnsi="Calibri" w:eastAsia="Microsoft YaHei"/>
+                <w:color w:val="1F2D3D"/>
+                <w:sz w:val="20"/>
+              </w:rPr>
+              <w:t>多个模型实例多轮辩论能否提高事实性和推理</w:t>
+            </w:r>
+          </w:p>
+        </w:tc>
+        <w:tc>
+          <w:tcPr>
+            <w:tcW w:type="dxa" w:w="1700"/>
+            <w:tcMar>
+              <w:top w:w="80" w:type="dxa"/>
+              <w:start w:w="120" w:type="dxa"/>
+              <w:bottom w:w="80" w:type="dxa"/>
+              <w:end w:w="120" w:type="dxa"/>
+            </w:tcMar>
+            <w:vAlign w:val="center"/>
+          </w:tcPr>
+          <w:p>
+            <w:pPr>
+              <w:spacing w:before="0" w:after="40" w:line="240" w:lineRule="auto"/>
+            </w:pPr>
+            <w:r>
+              <w:rPr>
+                <w:rFonts w:ascii="Calibri" w:hAnsi="Calibri" w:eastAsia="Microsoft YaHei"/>
+                <w:color w:val="1F2D3D"/>
+                <w:sz w:val="20"/>
+              </w:rPr>
+              <w:t>论文采用自定义黑盒模型辩论流程，不依赖 MAF</w:t>
+            </w:r>
+          </w:p>
+        </w:tc>
+        <w:tc>
+          <w:tcPr>
+            <w:tcW w:type="dxa" w:w="3860"/>
+            <w:tcMar>
+              <w:top w:w="80" w:type="dxa"/>
+              <w:start w:w="120" w:type="dxa"/>
+              <w:bottom w:w="80" w:type="dxa"/>
+              <w:end w:w="120" w:type="dxa"/>
+            </w:tcMar>
+            <w:vAlign w:val="center"/>
+          </w:tcPr>
+          <w:p>
+            <w:pPr>
+              <w:spacing w:before="0" w:after="40" w:line="240" w:lineRule="auto"/>
+            </w:pPr>
+            <w:r>
+              <w:rPr>
+                <w:rFonts w:ascii="Calibri" w:hAnsi="Calibri" w:eastAsia="Microsoft YaHei"/>
+                <w:color w:val="1F2D3D"/>
+                <w:sz w:val="20"/>
+              </w:rPr>
+              <w:t>与本实验都使用多轮讨论，但它关注一般推理提升，本实验检验隐藏信息能否被披露和整合</w:t>
+            </w:r>
+          </w:p>
+        </w:tc>
+      </w:tr>
+      <w:tr>
+        <w:trPr>
+          <w:cantSplit/>
+        </w:trPr>
+        <w:tc>
+          <w:tcPr>
+            <w:tcW w:type="dxa" w:w="1600"/>
+            <w:tcMar>
+              <w:top w:w="80" w:type="dxa"/>
+              <w:start w:w="120" w:type="dxa"/>
+              <w:bottom w:w="80" w:type="dxa"/>
+              <w:end w:w="120" w:type="dxa"/>
+            </w:tcMar>
+            <w:vAlign w:val="center"/>
+          </w:tcPr>
+          <w:p>
+            <w:pPr>
+              <w:spacing w:before="0" w:after="40" w:line="240" w:lineRule="auto"/>
+            </w:pPr>
+            <w:r>
+              <w:rPr>
+                <w:rFonts w:ascii="Calibri" w:hAnsi="Calibri" w:eastAsia="Microsoft YaHei"/>
+                <w:color w:val="1F2D3D"/>
+                <w:sz w:val="20"/>
+              </w:rPr>
+              <w:t>MAST（Cemri et al., 2025）</w:t>
+            </w:r>
+          </w:p>
+        </w:tc>
+        <w:tc>
+          <w:tcPr>
+            <w:tcW w:type="dxa" w:w="2200"/>
+            <w:tcMar>
+              <w:top w:w="80" w:type="dxa"/>
+              <w:start w:w="120" w:type="dxa"/>
+              <w:bottom w:w="80" w:type="dxa"/>
+              <w:end w:w="120" w:type="dxa"/>
+            </w:tcMar>
+            <w:vAlign w:val="center"/>
+          </w:tcPr>
+          <w:p>
+            <w:pPr>
+              <w:spacing w:before="0" w:after="40" w:line="240" w:lineRule="auto"/>
+            </w:pPr>
+            <w:r>
+              <w:rPr>
+                <w:rFonts w:ascii="Calibri" w:hAnsi="Calibri" w:eastAsia="Microsoft YaHei"/>
+                <w:color w:val="1F2D3D"/>
+                <w:sz w:val="20"/>
+              </w:rPr>
+              <w:t>多智能体系统为什么失败</w:t>
+            </w:r>
+          </w:p>
+        </w:tc>
+        <w:tc>
+          <w:tcPr>
+            <w:tcW w:type="dxa" w:w="1700"/>
+            <w:tcMar>
+              <w:top w:w="80" w:type="dxa"/>
+              <w:start w:w="120" w:type="dxa"/>
+              <w:bottom w:w="80" w:type="dxa"/>
+              <w:end w:w="120" w:type="dxa"/>
+            </w:tcMar>
+            <w:vAlign w:val="center"/>
+          </w:tcPr>
+          <w:p>
+            <w:pPr>
+              <w:spacing w:before="0" w:after="40" w:line="240" w:lineRule="auto"/>
+            </w:pPr>
+            <w:r>
+              <w:rPr>
+                <w:rFonts w:ascii="Calibri" w:hAnsi="Calibri" w:eastAsia="Microsoft YaHei"/>
+                <w:color w:val="1F2D3D"/>
+                <w:sz w:val="20"/>
+              </w:rPr>
+              <w:t>分析五种流行 MAS 框架上的 150 余项任务</w:t>
+            </w:r>
+          </w:p>
+        </w:tc>
+        <w:tc>
+          <w:tcPr>
+            <w:tcW w:type="dxa" w:w="3860"/>
+            <w:tcMar>
+              <w:top w:w="80" w:type="dxa"/>
+              <w:start w:w="120" w:type="dxa"/>
+              <w:bottom w:w="80" w:type="dxa"/>
+              <w:end w:w="120" w:type="dxa"/>
+            </w:tcMar>
+            <w:vAlign w:val="center"/>
+          </w:tcPr>
+          <w:p>
+            <w:pPr>
+              <w:spacing w:before="0" w:after="40" w:line="240" w:lineRule="auto"/>
+            </w:pPr>
+            <w:r>
+              <w:rPr>
+                <w:rFonts w:ascii="Calibri" w:hAnsi="Calibri" w:eastAsia="Microsoft YaHei"/>
+                <w:color w:val="1F2D3D"/>
+                <w:sz w:val="20"/>
+              </w:rPr>
+              <w:t>为本实验的 FM-2.4/2.5/2.6 人工诊断提供分类依据，不是 HiddenBench 结果基线</w:t>
+            </w:r>
+          </w:p>
+        </w:tc>
+      </w:tr>
+    </w:tbl>
+    <w:p>
+      <w:pPr>
+        <w:spacing w:after="0"/>
+      </w:pPr>
+    </w:p>
+    <w:p>
+      <w:pPr>
+        <w:widowControl/>
+      </w:pPr>
+      <w:r>
+        <w:rPr>
+          <w:rFonts w:ascii="Calibri" w:hAnsi="Calibri" w:eastAsia="Microsoft YaHei"/>
+          <w:color w:val="1F2D3D"/>
+          <w:sz w:val="22"/>
+        </w:rPr>
+        <w:t>Microsoft 官方把 Agent Framework 定义为 AutoGen 和 Semantic Kernel 的后继框架，提供显式的顺序、并发、分支和群体协作工作流。因此，本次 工作的定位不是宣称发明了 HiddenBench 问题，而是把一个原本不以 MAF 为实验变量的公开基准迁移到 MAF，并检查迁移后能否复现相同的集体推理 困难。</w:t>
+      </w:r>
+    </w:p>
+    <w:p>
+      <w:pPr>
+        <w:widowControl/>
+      </w:pPr>
+      <w:r>
+        <w:rPr>
+          <w:rFonts w:ascii="Calibri" w:hAnsi="Calibri" w:eastAsia="Microsoft YaHei"/>
+          <w:color w:val="1F2D3D"/>
+          <w:sz w:val="22"/>
+        </w:rPr>
+        <w:t>来源：</w:t>
+      </w:r>
+    </w:p>
+    <w:p>
+      <w:pPr>
+        <w:pStyle w:val="ListBullet"/>
+      </w:pPr>
+      <w:r>
+        <w:rPr>
+          <w:rFonts w:ascii="Calibri" w:hAnsi="Calibri" w:eastAsia="Microsoft YaHei"/>
+          <w:color w:val="1F2D3D"/>
+          <w:sz w:val="22"/>
+        </w:rPr>
+        <w:t>Microsoft Agent Framework：</w:t>
+      </w:r>
+    </w:p>
+    <w:p>
+      <w:pPr>
+        <w:widowControl/>
+      </w:pPr>
+      <w:r>
+        <w:rPr>
+          <w:rFonts w:ascii="Calibri" w:hAnsi="Calibri" w:eastAsia="Microsoft YaHei"/>
+          <w:color w:val="1F2D3D"/>
+          <w:sz w:val="22"/>
+        </w:rPr>
+        <w:t>https://learn.microsoft.com/en-us/agent-framework/overview/</w:t>
+      </w:r>
+    </w:p>
+    <w:p>
+      <w:pPr>
+        <w:pStyle w:val="ListBullet"/>
+      </w:pPr>
+      <w:r>
+        <w:rPr>
+          <w:rFonts w:ascii="Calibri" w:hAnsi="Calibri" w:eastAsia="Microsoft YaHei"/>
+          <w:color w:val="1F2D3D"/>
+          <w:sz w:val="22"/>
+        </w:rPr>
+        <w:t>AutoGen：https://arxiv.org/abs/2308.08155</w:t>
+      </w:r>
+    </w:p>
+    <w:p>
+      <w:pPr>
+        <w:pStyle w:val="ListBullet"/>
+      </w:pPr>
+      <w:r>
+        <w:rPr>
+          <w:rFonts w:ascii="Calibri" w:hAnsi="Calibri" w:eastAsia="Microsoft YaHei"/>
+          <w:color w:val="1F2D3D"/>
+          <w:sz w:val="22"/>
+        </w:rPr>
+        <w:t>Multiagent Debate：https://arxiv.org/abs/2305.14325</w:t>
+      </w:r>
+    </w:p>
+    <w:p>
+      <w:pPr>
+        <w:pStyle w:val="ListBullet"/>
+      </w:pPr>
+      <w:r>
+        <w:rPr>
+          <w:rFonts w:ascii="Calibri" w:hAnsi="Calibri" w:eastAsia="Microsoft YaHei"/>
+          <w:color w:val="1F2D3D"/>
+          <w:sz w:val="22"/>
+        </w:rPr>
+        <w:t>HiddenBench：https://arxiv.org/abs/2505.11556</w:t>
+      </w:r>
+    </w:p>
+    <w:p>
+      <w:pPr>
+        <w:pStyle w:val="ListBullet"/>
+      </w:pPr>
+      <w:r>
+        <w:rPr>
+          <w:rFonts w:ascii="Calibri" w:hAnsi="Calibri" w:eastAsia="Microsoft YaHei"/>
+          <w:color w:val="1F2D3D"/>
+          <w:sz w:val="22"/>
+        </w:rPr>
+        <w:t>MAST：https://arxiv.org/abs/2503.13657</w:t>
+      </w:r>
+    </w:p>
+    <w:p>
+      <w:pPr>
         <w:pStyle w:val="Heading1"/>
       </w:pPr>
       <w:r>
@@ -1027,6 +1713,49 @@
           <w:sz w:val="22"/>
         </w:rPr>
         <w:t>非法投票最多追加一次格式修复请求。</w:t>
+      </w:r>
+    </w:p>
+    <w:p>
+      <w:pPr>
+        <w:widowControl/>
+      </w:pPr>
+      <w:r>
+        <w:rPr>
+          <w:rFonts w:ascii="Calibri" w:hAnsi="Calibri" w:eastAsia="Microsoft YaHei"/>
+          <w:color w:val="1F2D3D"/>
+          <w:sz w:val="22"/>
+        </w:rPr>
+        <w:t>这里的“轮转讨论”是</w:t>
+      </w:r>
+      <w:r>
+        <w:rPr>
+          <w:rFonts w:ascii="Calibri" w:hAnsi="Calibri" w:eastAsia="Microsoft YaHei"/>
+          <w:b/>
+          <w:color w:val="1F2D3D"/>
+          <w:sz w:val="22"/>
+        </w:rPr>
+        <w:t>顺序异步讨论</w:t>
+      </w:r>
+      <w:r>
+        <w:rPr>
+          <w:rFonts w:ascii="Calibri" w:hAnsi="Calibri" w:eastAsia="Microsoft YaHei"/>
+          <w:color w:val="1F2D3D"/>
+          <w:sz w:val="22"/>
+        </w:rPr>
+        <w:t>，不是四名智能体同时生成： agent-a 先发言，agent-b 能看到 agent-a 的消息，agent-c 能看到前两条， agent-d 能看到前三条；下一轮继续读取此前累积的全部公开消息。固定顺序 的目的是忠实保留 HiddenBench 的可审计讨论流程，并避免额外引入一个 LLM 发言选择器。</w:t>
+      </w:r>
+    </w:p>
+    <w:p>
+      <w:pPr>
+        <w:widowControl/>
+      </w:pPr>
+      <w:r>
+        <w:rPr>
+          <w:rFonts w:ascii="Calibri" w:hAnsi="Calibri" w:eastAsia="Microsoft YaHei"/>
+          <w:color w:val="1F2D3D"/>
+          <w:sz w:val="22"/>
+        </w:rPr>
+        <w:t>Agent 数量 4 也不是本次调出来的参数。HiddenBench 的 Hidden Profile 任务为每题提供 4 组私有信息，本实验按官方结构一对一分给 4 名 Agent。 因此本阶段不做 Agent 数量消融；如果改成 3 名或 5 名，就必须合并或拆分 私有信息，已经不再是同一实验条件。</w:t>
       </w:r>
     </w:p>
     <w:p>
@@ -1535,6 +2264,156 @@
           <w:sz w:val="22"/>
         </w:rPr>
         <w:t>没有加入“其他智能体可能掌握不同信息”“请主动寻找信息不对称”等额外 提示，避免改变原论文任务。</w:t>
+      </w:r>
+    </w:p>
+    <w:p>
+      <w:pPr>
+        <w:pStyle w:val="Heading2"/>
+      </w:pPr>
+      <w:r>
+        <w:rPr>
+          <w:rFonts w:ascii="Calibri" w:hAnsi="Calibri" w:eastAsia="Microsoft YaHei"/>
+          <w:b/>
+          <w:color w:val="2E74B5"/>
+          <w:sz w:val="26"/>
+        </w:rPr>
+        <w:t>4. 十题选择规则与固定种子</w:t>
+      </w:r>
+    </w:p>
+    <w:p>
+      <w:pPr>
+        <w:widowControl/>
+      </w:pPr>
+      <w:r>
+        <w:rPr>
+          <w:rFonts w:ascii="Calibri" w:hAnsi="Calibri" w:eastAsia="Microsoft YaHei"/>
+          <w:color w:val="1F2D3D"/>
+          <w:sz w:val="22"/>
+        </w:rPr>
+        <w:t xml:space="preserve">十题均来自官方 </w:t>
+      </w:r>
+      <w:r>
+        <w:rPr>
+          <w:rFonts w:ascii="Consolas" w:hAnsi="Consolas" w:eastAsia="Microsoft YaHei"/>
+          <w:color w:val="1F4D78"/>
+          <w:sz w:val="21"/>
+        </w:rPr>
+        <w:t>benchmark.json</w:t>
+      </w:r>
+      <w:r>
+        <w:rPr>
+          <w:rFonts w:ascii="Calibri" w:hAnsi="Calibri" w:eastAsia="Microsoft YaHei"/>
+          <w:color w:val="1F2D3D"/>
+          <w:sz w:val="22"/>
+        </w:rPr>
+        <w:t>，并在正式运行前写入配置文件锁定。 选择规则是：每题必须有 4 组私有信息，能够与 4 名 Agent 一一对应； 覆盖灾害、招聘、采购、医疗、安保、餐饮、IT 和投资等多个领域；包含 由既有人类研究改编的任务；不能看到试跑结果后更换题目。</w:t>
+      </w:r>
+    </w:p>
+    <w:p>
+      <w:pPr>
+        <w:widowControl/>
+      </w:pPr>
+      <w:r>
+        <w:rPr>
+          <w:rFonts w:ascii="Calibri" w:hAnsi="Calibri" w:eastAsia="Microsoft YaHei"/>
+          <w:color w:val="1F2D3D"/>
+          <w:sz w:val="22"/>
+        </w:rPr>
+        <w:t>固定设置为：</w:t>
+      </w:r>
+    </w:p>
+    <w:tbl>
+      <w:tblPr>
+        <w:tblW w:type="dxa" w:w="9360"/>
+        <w:jc w:val="left"/>
+        <w:tblLayout w:type="fixed"/>
+        <w:tblLook w:firstColumn="1" w:firstRow="1" w:lastColumn="0" w:lastRow="0" w:noHBand="0" w:noVBand="1" w:val="04A0"/>
+        <w:tblInd w:w="120" w:type="dxa"/>
+      </w:tblPr>
+      <w:tblGrid>
+        <w:gridCol w:w="9360"/>
+      </w:tblGrid>
+      <w:tr>
+        <w:trPr>
+          <w:cantSplit/>
+        </w:trPr>
+        <w:tc>
+          <w:tcPr>
+            <w:tcW w:type="dxa" w:w="9360"/>
+            <w:tcMar>
+              <w:top w:w="80" w:type="dxa"/>
+              <w:start w:w="120" w:type="dxa"/>
+              <w:bottom w:w="80" w:type="dxa"/>
+              <w:end w:w="120" w:type="dxa"/>
+            </w:tcMar>
+            <w:vAlign w:val="center"/>
+            <w:shd w:fill="F4F6F9"/>
+          </w:tcPr>
+          <w:p>
+            <w:pPr>
+              <w:spacing w:before="20" w:after="20" w:line="240" w:lineRule="auto"/>
+            </w:pPr>
+            <w:r>
+              <w:rPr>
+                <w:rFonts w:ascii="Consolas" w:hAnsi="Consolas" w:eastAsia="Microsoft YaHei"/>
+                <w:color w:val="1F2D3D"/>
+                <w:sz w:val="18"/>
+              </w:rPr>
+              <w:t>task_ids = [1, 5, 7, 9, 13, 14, 16, 25, 47, 62]</w:t>
+            </w:r>
+            <w:r>
+              <w:br/>
+            </w:r>
+            <w:r>
+              <w:rPr>
+                <w:rFonts w:ascii="Consolas" w:hAnsi="Consolas" w:eastAsia="Microsoft YaHei"/>
+                <w:color w:val="1F2D3D"/>
+                <w:sz w:val="18"/>
+              </w:rPr>
+              <w:t>base_seed = 20260728</w:t>
+            </w:r>
+            <w:r>
+              <w:br/>
+            </w:r>
+            <w:r>
+              <w:rPr>
+                <w:rFonts w:ascii="Consolas" w:hAnsi="Consolas" w:eastAsia="Microsoft YaHei"/>
+                <w:color w:val="1F2D3D"/>
+                <w:sz w:val="18"/>
+              </w:rPr>
+              <w:t>dataset_sha256 =</w:t>
+            </w:r>
+            <w:r>
+              <w:br/>
+            </w:r>
+            <w:r>
+              <w:rPr>
+                <w:rFonts w:ascii="Consolas" w:hAnsi="Consolas" w:eastAsia="Microsoft YaHei"/>
+                <w:color w:val="1F2D3D"/>
+                <w:sz w:val="18"/>
+              </w:rPr>
+              <w:t>2815AFFFCA4E470D1DFBC81E625160447DF1109CE371968181C9E1E6B90443A3</w:t>
+            </w:r>
+          </w:p>
+        </w:tc>
+      </w:tr>
+    </w:tbl>
+    <w:p>
+      <w:pPr>
+        <w:spacing w:after="0"/>
+      </w:pPr>
+    </w:p>
+    <w:p>
+      <w:pPr>
+        <w:widowControl/>
+      </w:pPr>
+      <w:r>
+        <w:rPr>
+          <w:rFonts w:ascii="Calibri" w:hAnsi="Calibri" w:eastAsia="Microsoft YaHei"/>
+          <w:color w:val="1F2D3D"/>
+          <w:sz w:val="22"/>
+        </w:rPr>
+        <w:t>每题只运行一个固定种子，所以这里的结果叫“十题单种子筛选”，不等同于 原论文的 65 题多 session 主实验。</w:t>
       </w:r>
     </w:p>
     <w:p>
@@ -2075,7 +2954,568 @@
           <w:color w:val="1F2D3D"/>
           <w:sz w:val="22"/>
         </w:rPr>
+        <w:t>下面保留前两轮模型原话，不是事后改写：</w:t>
+      </w:r>
+    </w:p>
+    <w:tbl>
+      <w:tblPr>
+        <w:tblStyle w:val="TableGrid"/>
+        <w:tblW w:type="dxa" w:w="9360"/>
+        <w:jc w:val="left"/>
+        <w:tblLayout w:type="fixed"/>
+        <w:tblLook w:firstColumn="1" w:firstRow="1" w:lastColumn="0" w:lastRow="0" w:noHBand="0" w:noVBand="1" w:val="04A0"/>
+        <w:tblInd w:w="120" w:type="dxa"/>
+      </w:tblPr>
+      <w:tblGrid>
+        <w:gridCol w:w="1800"/>
+        <w:gridCol w:w="7560"/>
+      </w:tblGrid>
+      <w:tr>
+        <w:trPr>
+          <w:cantSplit/>
+          <w:tblHeader w:val="true"/>
+        </w:trPr>
+        <w:tc>
+          <w:tcPr>
+            <w:tcW w:type="dxa" w:w="1800"/>
+            <w:tcMar>
+              <w:top w:w="80" w:type="dxa"/>
+              <w:start w:w="120" w:type="dxa"/>
+              <w:bottom w:w="80" w:type="dxa"/>
+              <w:end w:w="120" w:type="dxa"/>
+            </w:tcMar>
+            <w:vAlign w:val="center"/>
+            <w:shd w:fill="F2F4F7"/>
+          </w:tcPr>
+          <w:p>
+            <w:pPr>
+              <w:spacing w:before="0" w:after="40" w:line="240" w:lineRule="auto"/>
+            </w:pPr>
+            <w:r>
+              <w:rPr>
+                <w:rFonts w:ascii="Calibri" w:hAnsi="Calibri" w:eastAsia="Microsoft YaHei"/>
+                <w:b/>
+                <w:color w:val="1F4D78"/>
+                <w:sz w:val="20"/>
+              </w:rPr>
+              <w:t>轮次/Agent</w:t>
+            </w:r>
+          </w:p>
+        </w:tc>
+        <w:tc>
+          <w:tcPr>
+            <w:tcW w:type="dxa" w:w="7560"/>
+            <w:tcMar>
+              <w:top w:w="80" w:type="dxa"/>
+              <w:start w:w="120" w:type="dxa"/>
+              <w:bottom w:w="80" w:type="dxa"/>
+              <w:end w:w="120" w:type="dxa"/>
+            </w:tcMar>
+            <w:vAlign w:val="center"/>
+            <w:shd w:fill="F2F4F7"/>
+          </w:tcPr>
+          <w:p>
+            <w:pPr>
+              <w:spacing w:before="0" w:after="40" w:line="240" w:lineRule="auto"/>
+            </w:pPr>
+            <w:r>
+              <w:rPr>
+                <w:rFonts w:ascii="Calibri" w:hAnsi="Calibri" w:eastAsia="Microsoft YaHei"/>
+                <w:b/>
+                <w:color w:val="1F4D78"/>
+                <w:sz w:val="20"/>
+              </w:rPr>
+              <w:t>原始发言</w:t>
+            </w:r>
+          </w:p>
+        </w:tc>
+      </w:tr>
+      <w:tr>
+        <w:trPr>
+          <w:cantSplit/>
+        </w:trPr>
+        <w:tc>
+          <w:tcPr>
+            <w:tcW w:type="dxa" w:w="1800"/>
+            <w:tcMar>
+              <w:top w:w="80" w:type="dxa"/>
+              <w:start w:w="120" w:type="dxa"/>
+              <w:bottom w:w="80" w:type="dxa"/>
+              <w:end w:w="120" w:type="dxa"/>
+            </w:tcMar>
+            <w:vAlign w:val="center"/>
+          </w:tcPr>
+          <w:p>
+            <w:pPr>
+              <w:spacing w:before="0" w:after="40" w:line="240" w:lineRule="auto"/>
+            </w:pPr>
+            <w:r>
+              <w:rPr>
+                <w:rFonts w:ascii="Calibri" w:hAnsi="Calibri" w:eastAsia="Microsoft YaHei"/>
+                <w:color w:val="1F2D3D"/>
+                <w:sz w:val="20"/>
+              </w:rPr>
+              <w:t>R1 / agent-a</w:t>
+            </w:r>
+          </w:p>
+        </w:tc>
+        <w:tc>
+          <w:tcPr>
+            <w:tcW w:type="dxa" w:w="7560"/>
+            <w:tcMar>
+              <w:top w:w="80" w:type="dxa"/>
+              <w:start w:w="120" w:type="dxa"/>
+              <w:bottom w:w="80" w:type="dxa"/>
+              <w:end w:w="120" w:type="dxa"/>
+            </w:tcMar>
+            <w:vAlign w:val="center"/>
+          </w:tcPr>
+          <w:p>
+            <w:pPr>
+              <w:spacing w:before="0" w:after="40" w:line="240" w:lineRule="auto"/>
+            </w:pPr>
+            <w:r>
+              <w:rPr>
+                <w:rFonts w:ascii="Calibri" w:hAnsi="Calibri" w:eastAsia="Microsoft YaHei"/>
+                <w:color w:val="1F2D3D"/>
+                <w:sz w:val="20"/>
+              </w:rPr>
+              <w:t>Given the power outage at Station Charlie and Station Alpha's recent restocking and backup generators, I propose we choose Station Alpha as our safest and most reliable shelter.</w:t>
+            </w:r>
+          </w:p>
+        </w:tc>
+      </w:tr>
+      <w:tr>
+        <w:trPr>
+          <w:cantSplit/>
+        </w:trPr>
+        <w:tc>
+          <w:tcPr>
+            <w:tcW w:type="dxa" w:w="1800"/>
+            <w:tcMar>
+              <w:top w:w="80" w:type="dxa"/>
+              <w:start w:w="120" w:type="dxa"/>
+              <w:bottom w:w="80" w:type="dxa"/>
+              <w:end w:w="120" w:type="dxa"/>
+            </w:tcMar>
+            <w:vAlign w:val="center"/>
+          </w:tcPr>
+          <w:p>
+            <w:pPr>
+              <w:spacing w:before="0" w:after="40" w:line="240" w:lineRule="auto"/>
+            </w:pPr>
+            <w:r>
+              <w:rPr>
+                <w:rFonts w:ascii="Calibri" w:hAnsi="Calibri" w:eastAsia="Microsoft YaHei"/>
+                <w:color w:val="1F2D3D"/>
+                <w:sz w:val="20"/>
+              </w:rPr>
+              <w:t>R1 / agent-b</w:t>
+            </w:r>
+          </w:p>
+        </w:tc>
+        <w:tc>
+          <w:tcPr>
+            <w:tcW w:type="dxa" w:w="7560"/>
+            <w:tcMar>
+              <w:top w:w="80" w:type="dxa"/>
+              <w:start w:w="120" w:type="dxa"/>
+              <w:bottom w:w="80" w:type="dxa"/>
+              <w:end w:w="120" w:type="dxa"/>
+            </w:tcMar>
+            <w:vAlign w:val="center"/>
+          </w:tcPr>
+          <w:p>
+            <w:pPr>
+              <w:spacing w:before="0" w:after="40" w:line="240" w:lineRule="auto"/>
+            </w:pPr>
+            <w:r>
+              <w:rPr>
+                <w:rFonts w:ascii="Calibri" w:hAnsi="Calibri" w:eastAsia="Microsoft YaHei"/>
+                <w:color w:val="1F2D3D"/>
+                <w:sz w:val="20"/>
+              </w:rPr>
+              <w:t>Station Alpha is unsafe due to elevated toxin levels from ventilation exposure, so we must rule it out and consider the remaining shelters.</w:t>
+            </w:r>
+          </w:p>
+        </w:tc>
+      </w:tr>
+      <w:tr>
+        <w:trPr>
+          <w:cantSplit/>
+        </w:trPr>
+        <w:tc>
+          <w:tcPr>
+            <w:tcW w:type="dxa" w:w="1800"/>
+            <w:tcMar>
+              <w:top w:w="80" w:type="dxa"/>
+              <w:start w:w="120" w:type="dxa"/>
+              <w:bottom w:w="80" w:type="dxa"/>
+              <w:end w:w="120" w:type="dxa"/>
+            </w:tcMar>
+            <w:vAlign w:val="center"/>
+          </w:tcPr>
+          <w:p>
+            <w:pPr>
+              <w:spacing w:before="0" w:after="40" w:line="240" w:lineRule="auto"/>
+            </w:pPr>
+            <w:r>
+              <w:rPr>
+                <w:rFonts w:ascii="Calibri" w:hAnsi="Calibri" w:eastAsia="Microsoft YaHei"/>
+                <w:color w:val="1F2D3D"/>
+                <w:sz w:val="20"/>
+              </w:rPr>
+              <w:t>R1 / agent-c</w:t>
+            </w:r>
+          </w:p>
+        </w:tc>
+        <w:tc>
+          <w:tcPr>
+            <w:tcW w:type="dxa" w:w="7560"/>
+            <w:tcMar>
+              <w:top w:w="80" w:type="dxa"/>
+              <w:start w:w="120" w:type="dxa"/>
+              <w:bottom w:w="80" w:type="dxa"/>
+              <w:end w:w="120" w:type="dxa"/>
+            </w:tcMar>
+            <w:vAlign w:val="center"/>
+          </w:tcPr>
+          <w:p>
+            <w:pPr>
+              <w:spacing w:before="0" w:after="40" w:line="240" w:lineRule="auto"/>
+            </w:pPr>
+            <w:r>
+              <w:rPr>
+                <w:rFonts w:ascii="Calibri" w:hAnsi="Calibri" w:eastAsia="Microsoft YaHei"/>
+                <w:color w:val="1F2D3D"/>
+                <w:sz w:val="20"/>
+              </w:rPr>
+              <w:t>Given the conflicting reports on Station Alpha and the confirmed safety of Station Delta's systems, I recommend we choose Station Delta as our shelter.</w:t>
+            </w:r>
+          </w:p>
+        </w:tc>
+      </w:tr>
+      <w:tr>
+        <w:trPr>
+          <w:cantSplit/>
+        </w:trPr>
+        <w:tc>
+          <w:tcPr>
+            <w:tcW w:type="dxa" w:w="1800"/>
+            <w:tcMar>
+              <w:top w:w="80" w:type="dxa"/>
+              <w:start w:w="120" w:type="dxa"/>
+              <w:bottom w:w="80" w:type="dxa"/>
+              <w:end w:w="120" w:type="dxa"/>
+            </w:tcMar>
+            <w:vAlign w:val="center"/>
+          </w:tcPr>
+          <w:p>
+            <w:pPr>
+              <w:spacing w:before="0" w:after="40" w:line="240" w:lineRule="auto"/>
+            </w:pPr>
+            <w:r>
+              <w:rPr>
+                <w:rFonts w:ascii="Calibri" w:hAnsi="Calibri" w:eastAsia="Microsoft YaHei"/>
+                <w:color w:val="1F2D3D"/>
+                <w:sz w:val="20"/>
+              </w:rPr>
+              <w:t>R1 / agent-d</w:t>
+            </w:r>
+          </w:p>
+        </w:tc>
+        <w:tc>
+          <w:tcPr>
+            <w:tcW w:type="dxa" w:w="7560"/>
+            <w:tcMar>
+              <w:top w:w="80" w:type="dxa"/>
+              <w:start w:w="120" w:type="dxa"/>
+              <w:bottom w:w="80" w:type="dxa"/>
+              <w:end w:w="120" w:type="dxa"/>
+            </w:tcMar>
+            <w:vAlign w:val="center"/>
+          </w:tcPr>
+          <w:p>
+            <w:pPr>
+              <w:spacing w:before="0" w:after="40" w:line="240" w:lineRule="auto"/>
+            </w:pPr>
+            <w:r>
+              <w:rPr>
+                <w:rFonts w:ascii="Calibri" w:hAnsi="Calibri" w:eastAsia="Microsoft YaHei"/>
+                <w:color w:val="1F2D3D"/>
+                <w:sz w:val="20"/>
+              </w:rPr>
+              <w:t>Given the conflicting reports on Station Alpha and the potential contamination near Station Bravo, I recommend we choose Station Charlie for its higher ground and solar power, despite its smaller size.</w:t>
+            </w:r>
+          </w:p>
+        </w:tc>
+      </w:tr>
+      <w:tr>
+        <w:trPr>
+          <w:cantSplit/>
+        </w:trPr>
+        <w:tc>
+          <w:tcPr>
+            <w:tcW w:type="dxa" w:w="1800"/>
+            <w:tcMar>
+              <w:top w:w="80" w:type="dxa"/>
+              <w:start w:w="120" w:type="dxa"/>
+              <w:bottom w:w="80" w:type="dxa"/>
+              <w:end w:w="120" w:type="dxa"/>
+            </w:tcMar>
+            <w:vAlign w:val="center"/>
+          </w:tcPr>
+          <w:p>
+            <w:pPr>
+              <w:spacing w:before="0" w:after="40" w:line="240" w:lineRule="auto"/>
+            </w:pPr>
+            <w:r>
+              <w:rPr>
+                <w:rFonts w:ascii="Calibri" w:hAnsi="Calibri" w:eastAsia="Microsoft YaHei"/>
+                <w:color w:val="1F2D3D"/>
+                <w:sz w:val="20"/>
+              </w:rPr>
+              <w:t>R2 / agent-a</w:t>
+            </w:r>
+          </w:p>
+        </w:tc>
+        <w:tc>
+          <w:tcPr>
+            <w:tcW w:type="dxa" w:w="7560"/>
+            <w:tcMar>
+              <w:top w:w="80" w:type="dxa"/>
+              <w:start w:w="120" w:type="dxa"/>
+              <w:bottom w:w="80" w:type="dxa"/>
+              <w:end w:w="120" w:type="dxa"/>
+            </w:tcMar>
+            <w:vAlign w:val="center"/>
+          </w:tcPr>
+          <w:p>
+            <w:pPr>
+              <w:spacing w:before="0" w:after="40" w:line="240" w:lineRule="auto"/>
+            </w:pPr>
+            <w:r>
+              <w:rPr>
+                <w:rFonts w:ascii="Calibri" w:hAnsi="Calibri" w:eastAsia="Microsoft YaHei"/>
+                <w:color w:val="1F2D3D"/>
+                <w:sz w:val="20"/>
+              </w:rPr>
+              <w:t>Given Station Alpha is unsafe due to toxins and Station Charlie has no power, I recommend we choose Station Delta, which is empty and has all roads open, making it the most viable option.</w:t>
+            </w:r>
+          </w:p>
+        </w:tc>
+      </w:tr>
+      <w:tr>
+        <w:trPr>
+          <w:cantSplit/>
+        </w:trPr>
+        <w:tc>
+          <w:tcPr>
+            <w:tcW w:type="dxa" w:w="1800"/>
+            <w:tcMar>
+              <w:top w:w="80" w:type="dxa"/>
+              <w:start w:w="120" w:type="dxa"/>
+              <w:bottom w:w="80" w:type="dxa"/>
+              <w:end w:w="120" w:type="dxa"/>
+            </w:tcMar>
+            <w:vAlign w:val="center"/>
+          </w:tcPr>
+          <w:p>
+            <w:pPr>
+              <w:spacing w:before="0" w:after="40" w:line="240" w:lineRule="auto"/>
+            </w:pPr>
+            <w:r>
+              <w:rPr>
+                <w:rFonts w:ascii="Calibri" w:hAnsi="Calibri" w:eastAsia="Microsoft YaHei"/>
+                <w:color w:val="1F2D3D"/>
+                <w:sz w:val="20"/>
+              </w:rPr>
+              <w:t>R2 / agent-b</w:t>
+            </w:r>
+          </w:p>
+        </w:tc>
+        <w:tc>
+          <w:tcPr>
+            <w:tcW w:type="dxa" w:w="7560"/>
+            <w:tcMar>
+              <w:top w:w="80" w:type="dxa"/>
+              <w:start w:w="120" w:type="dxa"/>
+              <w:bottom w:w="80" w:type="dxa"/>
+              <w:end w:w="120" w:type="dxa"/>
+            </w:tcMar>
+            <w:vAlign w:val="center"/>
+          </w:tcPr>
+          <w:p>
+            <w:pPr>
+              <w:spacing w:before="0" w:after="40" w:line="240" w:lineRule="auto"/>
+            </w:pPr>
+            <w:r>
+              <w:rPr>
+                <w:rFonts w:ascii="Calibri" w:hAnsi="Calibri" w:eastAsia="Microsoft YaHei"/>
+                <w:color w:val="1F2D3D"/>
+                <w:sz w:val="20"/>
+              </w:rPr>
+              <w:t>Given Station Alpha's toxin contamination and Station Charlie's power outage, I agree that Station Delta is the safest choice with open roads and no immediate hazards.</w:t>
+            </w:r>
+          </w:p>
+        </w:tc>
+      </w:tr>
+      <w:tr>
+        <w:trPr>
+          <w:cantSplit/>
+        </w:trPr>
+        <w:tc>
+          <w:tcPr>
+            <w:tcW w:type="dxa" w:w="1800"/>
+            <w:tcMar>
+              <w:top w:w="80" w:type="dxa"/>
+              <w:start w:w="120" w:type="dxa"/>
+              <w:bottom w:w="80" w:type="dxa"/>
+              <w:end w:w="120" w:type="dxa"/>
+            </w:tcMar>
+            <w:vAlign w:val="center"/>
+          </w:tcPr>
+          <w:p>
+            <w:pPr>
+              <w:spacing w:before="0" w:after="40" w:line="240" w:lineRule="auto"/>
+            </w:pPr>
+            <w:r>
+              <w:rPr>
+                <w:rFonts w:ascii="Calibri" w:hAnsi="Calibri" w:eastAsia="Microsoft YaHei"/>
+                <w:color w:val="1F2D3D"/>
+                <w:sz w:val="20"/>
+              </w:rPr>
+              <w:t>R2 / agent-c</w:t>
+            </w:r>
+          </w:p>
+        </w:tc>
+        <w:tc>
+          <w:tcPr>
+            <w:tcW w:type="dxa" w:w="7560"/>
+            <w:tcMar>
+              <w:top w:w="80" w:type="dxa"/>
+              <w:start w:w="120" w:type="dxa"/>
+              <w:bottom w:w="80" w:type="dxa"/>
+              <w:end w:w="120" w:type="dxa"/>
+            </w:tcMar>
+            <w:vAlign w:val="center"/>
+          </w:tcPr>
+          <w:p>
+            <w:pPr>
+              <w:spacing w:before="0" w:after="40" w:line="240" w:lineRule="auto"/>
+            </w:pPr>
+            <w:r>
+              <w:rPr>
+                <w:rFonts w:ascii="Calibri" w:hAnsi="Calibri" w:eastAsia="Microsoft YaHei"/>
+                <w:color w:val="1F2D3D"/>
+                <w:sz w:val="20"/>
+              </w:rPr>
+              <w:t>Given the confirmed toxin contamination at Station Alpha and power outage at Station Charlie, I agree with the consensus that Station Delta is the safest and most reliable shelter.</w:t>
+            </w:r>
+          </w:p>
+        </w:tc>
+      </w:tr>
+      <w:tr>
+        <w:trPr>
+          <w:cantSplit/>
+        </w:trPr>
+        <w:tc>
+          <w:tcPr>
+            <w:tcW w:type="dxa" w:w="1800"/>
+            <w:tcMar>
+              <w:top w:w="80" w:type="dxa"/>
+              <w:start w:w="120" w:type="dxa"/>
+              <w:bottom w:w="80" w:type="dxa"/>
+              <w:end w:w="120" w:type="dxa"/>
+            </w:tcMar>
+            <w:vAlign w:val="center"/>
+          </w:tcPr>
+          <w:p>
+            <w:pPr>
+              <w:spacing w:before="0" w:after="40" w:line="240" w:lineRule="auto"/>
+            </w:pPr>
+            <w:r>
+              <w:rPr>
+                <w:rFonts w:ascii="Calibri" w:hAnsi="Calibri" w:eastAsia="Microsoft YaHei"/>
+                <w:color w:val="1F2D3D"/>
+                <w:sz w:val="20"/>
+              </w:rPr>
+              <w:t>R2 / agent-d</w:t>
+            </w:r>
+          </w:p>
+        </w:tc>
+        <w:tc>
+          <w:tcPr>
+            <w:tcW w:type="dxa" w:w="7560"/>
+            <w:tcMar>
+              <w:top w:w="80" w:type="dxa"/>
+              <w:start w:w="120" w:type="dxa"/>
+              <w:bottom w:w="80" w:type="dxa"/>
+              <w:end w:w="120" w:type="dxa"/>
+            </w:tcMar>
+            <w:vAlign w:val="center"/>
+          </w:tcPr>
+          <w:p>
+            <w:pPr>
+              <w:spacing w:before="0" w:after="40" w:line="240" w:lineRule="auto"/>
+            </w:pPr>
+            <w:r>
+              <w:rPr>
+                <w:rFonts w:ascii="Calibri" w:hAnsi="Calibri" w:eastAsia="Microsoft YaHei"/>
+                <w:color w:val="1F2D3D"/>
+                <w:sz w:val="20"/>
+              </w:rPr>
+              <w:t>Based on the consensus from the team, I agree that Station Delta is the safest choice, as it is empty with open roads and no reported contamination or power issues.</w:t>
+            </w:r>
+          </w:p>
+        </w:tc>
+      </w:tr>
+    </w:tbl>
+    <w:p>
+      <w:pPr>
+        <w:spacing w:after="0"/>
+      </w:pPr>
+    </w:p>
+    <w:p>
+      <w:pPr>
+        <w:widowControl/>
+      </w:pPr>
+      <w:r>
+        <w:rPr>
+          <w:rFonts w:ascii="Calibri" w:hAnsi="Calibri" w:eastAsia="Microsoft YaHei"/>
+          <w:color w:val="1F2D3D"/>
+          <w:sz w:val="22"/>
+        </w:rPr>
         <w:t>第二轮开始，agent-a 综合 Alpha 污染、Charlie 无电和 Delta 道路开放 等信息，改为支持 Delta。其余智能体也逐步支持 Delta。之后的讨论出现 大量重复确认，说明关键信息在前两轮已经基本完成整合，后续 13 轮主要 是在重复已经形成的结论。</w:t>
+      </w:r>
+    </w:p>
+    <w:p>
+      <w:pPr>
+        <w:widowControl/>
+      </w:pPr>
+      <w:r>
+        <w:rPr>
+          <w:rFonts w:ascii="Calibri" w:hAnsi="Calibri" w:eastAsia="Microsoft YaHei"/>
+          <w:color w:val="1F2D3D"/>
+          <w:sz w:val="22"/>
+        </w:rPr>
+        <w:t xml:space="preserve">完整 15 轮、60 条原始发言，以及每次调用对应的 system prompt、 user prompt、可见消息 ID 和三种条件投票，保存在随报告发布的 </w:t>
+      </w:r>
+      <w:r>
+        <w:rPr>
+          <w:rFonts w:ascii="Consolas" w:hAnsi="Consolas" w:eastAsia="Microsoft YaHei"/>
+          <w:color w:val="1F4D78"/>
+          <w:sz w:val="21"/>
+        </w:rPr>
+        <w:t>artifacts/hiddenbench-showcase-20260728-v2.jsonl</w:t>
+      </w:r>
+      <w:r>
+        <w:rPr>
+          <w:rFonts w:ascii="Calibri" w:hAnsi="Calibri" w:eastAsia="Microsoft YaHei"/>
+          <w:color w:val="1F2D3D"/>
+          <w:sz w:val="22"/>
+        </w:rPr>
+        <w:t xml:space="preserve"> 与可读 Markdown 附件中。</w:t>
       </w:r>
     </w:p>
     <w:p>
@@ -2704,6 +4144,954 @@
           <w:sz w:val="22"/>
         </w:rPr>
         <w:t>每题只运行一个固定种子。</w:t>
+      </w:r>
+    </w:p>
+    <w:p>
+      <w:pPr>
+        <w:pStyle w:val="Heading2"/>
+      </w:pPr>
+      <w:r>
+        <w:rPr>
+          <w:rFonts w:ascii="Calibri" w:hAnsi="Calibri" w:eastAsia="Microsoft YaHei"/>
+          <w:b/>
+          <w:color w:val="2E74B5"/>
+          <w:sz w:val="26"/>
+        </w:rPr>
+        <w:t>十道题分别在问什么</w:t>
+      </w:r>
+    </w:p>
+    <w:tbl>
+      <w:tblPr>
+        <w:tblStyle w:val="TableGrid"/>
+        <w:tblW w:type="dxa" w:w="9360"/>
+        <w:jc w:val="left"/>
+        <w:tblLayout w:type="fixed"/>
+        <w:tblLook w:firstColumn="1" w:firstRow="1" w:lastColumn="0" w:lastRow="0" w:noHBand="0" w:noVBand="1" w:val="04A0"/>
+        <w:tblInd w:w="120" w:type="dxa"/>
+      </w:tblPr>
+      <w:tblGrid>
+        <w:gridCol w:w="600"/>
+        <w:gridCol w:w="7160"/>
+        <w:gridCol w:w="1600"/>
+      </w:tblGrid>
+      <w:tr>
+        <w:trPr>
+          <w:cantSplit/>
+          <w:tblHeader w:val="true"/>
+        </w:trPr>
+        <w:tc>
+          <w:tcPr>
+            <w:tcW w:type="dxa" w:w="600"/>
+            <w:tcMar>
+              <w:top w:w="80" w:type="dxa"/>
+              <w:start w:w="120" w:type="dxa"/>
+              <w:bottom w:w="80" w:type="dxa"/>
+              <w:end w:w="120" w:type="dxa"/>
+            </w:tcMar>
+            <w:vAlign w:val="center"/>
+            <w:shd w:fill="F2F4F7"/>
+          </w:tcPr>
+          <w:p>
+            <w:pPr>
+              <w:spacing w:before="0" w:after="40" w:line="240" w:lineRule="auto"/>
+            </w:pPr>
+            <w:r>
+              <w:rPr>
+                <w:rFonts w:ascii="Calibri" w:hAnsi="Calibri" w:eastAsia="Microsoft YaHei"/>
+                <w:b/>
+                <w:color w:val="1F4D78"/>
+                <w:sz w:val="20"/>
+              </w:rPr>
+              <w:t>ID</w:t>
+            </w:r>
+          </w:p>
+        </w:tc>
+        <w:tc>
+          <w:tcPr>
+            <w:tcW w:type="dxa" w:w="7160"/>
+            <w:tcMar>
+              <w:top w:w="80" w:type="dxa"/>
+              <w:start w:w="120" w:type="dxa"/>
+              <w:bottom w:w="80" w:type="dxa"/>
+              <w:end w:w="120" w:type="dxa"/>
+            </w:tcMar>
+            <w:vAlign w:val="center"/>
+            <w:shd w:fill="F2F4F7"/>
+          </w:tcPr>
+          <w:p>
+            <w:pPr>
+              <w:spacing w:before="0" w:after="40" w:line="240" w:lineRule="auto"/>
+            </w:pPr>
+            <w:r>
+              <w:rPr>
+                <w:rFonts w:ascii="Calibri" w:hAnsi="Calibri" w:eastAsia="Microsoft YaHei"/>
+                <w:b/>
+                <w:color w:val="1F4D78"/>
+                <w:sz w:val="20"/>
+              </w:rPr>
+              <w:t>通俗题目说明与私有信息作用</w:t>
+            </w:r>
+          </w:p>
+        </w:tc>
+        <w:tc>
+          <w:tcPr>
+            <w:tcW w:type="dxa" w:w="1600"/>
+            <w:tcMar>
+              <w:top w:w="80" w:type="dxa"/>
+              <w:start w:w="120" w:type="dxa"/>
+              <w:bottom w:w="80" w:type="dxa"/>
+              <w:end w:w="120" w:type="dxa"/>
+            </w:tcMar>
+            <w:vAlign w:val="center"/>
+            <w:shd w:fill="F2F4F7"/>
+          </w:tcPr>
+          <w:p>
+            <w:pPr>
+              <w:spacing w:before="0" w:after="40" w:line="240" w:lineRule="auto"/>
+            </w:pPr>
+            <w:r>
+              <w:rPr>
+                <w:rFonts w:ascii="Calibri" w:hAnsi="Calibri" w:eastAsia="Microsoft YaHei"/>
+                <w:b/>
+                <w:color w:val="1F4D78"/>
+                <w:sz w:val="20"/>
+              </w:rPr>
+              <w:t>官方答案</w:t>
+            </w:r>
+          </w:p>
+        </w:tc>
+      </w:tr>
+      <w:tr>
+        <w:trPr>
+          <w:cantSplit/>
+        </w:trPr>
+        <w:tc>
+          <w:tcPr>
+            <w:tcW w:type="dxa" w:w="600"/>
+            <w:tcMar>
+              <w:top w:w="80" w:type="dxa"/>
+              <w:start w:w="120" w:type="dxa"/>
+              <w:bottom w:w="80" w:type="dxa"/>
+              <w:end w:w="120" w:type="dxa"/>
+            </w:tcMar>
+            <w:vAlign w:val="center"/>
+          </w:tcPr>
+          <w:p>
+            <w:pPr>
+              <w:spacing w:before="0" w:after="40" w:line="240" w:lineRule="auto"/>
+            </w:pPr>
+            <w:r>
+              <w:rPr>
+                <w:rFonts w:ascii="Calibri" w:hAnsi="Calibri" w:eastAsia="Microsoft YaHei"/>
+                <w:color w:val="1F2D3D"/>
+                <w:sz w:val="20"/>
+              </w:rPr>
+              <w:t>1</w:t>
+            </w:r>
+          </w:p>
+        </w:tc>
+        <w:tc>
+          <w:tcPr>
+            <w:tcW w:type="dxa" w:w="7160"/>
+            <w:tcMar>
+              <w:top w:w="80" w:type="dxa"/>
+              <w:start w:w="120" w:type="dxa"/>
+              <w:bottom w:w="80" w:type="dxa"/>
+              <w:end w:w="120" w:type="dxa"/>
+            </w:tcMar>
+            <w:vAlign w:val="center"/>
+          </w:tcPr>
+          <w:p>
+            <w:pPr>
+              <w:spacing w:before="0" w:after="40" w:line="240" w:lineRule="auto"/>
+            </w:pPr>
+            <w:r>
+              <w:rPr>
+                <w:rFonts w:ascii="Calibri" w:hAnsi="Calibri" w:eastAsia="Microsoft YaHei"/>
+                <w:color w:val="1F2D3D"/>
+                <w:sz w:val="20"/>
+              </w:rPr>
+              <w:t>暴雨后选择 West City、East Town 或 North Hill 疏散。共享信息描述接待条件；四条私有信息分别说明补给车、火灾、步道和泥石流造成的路线阻断。</w:t>
+            </w:r>
+          </w:p>
+        </w:tc>
+        <w:tc>
+          <w:tcPr>
+            <w:tcW w:type="dxa" w:w="1600"/>
+            <w:tcMar>
+              <w:top w:w="80" w:type="dxa"/>
+              <w:start w:w="120" w:type="dxa"/>
+              <w:bottom w:w="80" w:type="dxa"/>
+              <w:end w:w="120" w:type="dxa"/>
+            </w:tcMar>
+            <w:vAlign w:val="center"/>
+          </w:tcPr>
+          <w:p>
+            <w:pPr>
+              <w:spacing w:before="0" w:after="40" w:line="240" w:lineRule="auto"/>
+            </w:pPr>
+            <w:r>
+              <w:rPr>
+                <w:rFonts w:ascii="Calibri" w:hAnsi="Calibri" w:eastAsia="Microsoft YaHei"/>
+                <w:color w:val="1F2D3D"/>
+                <w:sz w:val="20"/>
+              </w:rPr>
+              <w:t>West City</w:t>
+            </w:r>
+          </w:p>
+        </w:tc>
+      </w:tr>
+      <w:tr>
+        <w:trPr>
+          <w:cantSplit/>
+        </w:trPr>
+        <w:tc>
+          <w:tcPr>
+            <w:tcW w:type="dxa" w:w="600"/>
+            <w:tcMar>
+              <w:top w:w="80" w:type="dxa"/>
+              <w:start w:w="120" w:type="dxa"/>
+              <w:bottom w:w="80" w:type="dxa"/>
+              <w:end w:w="120" w:type="dxa"/>
+            </w:tcMar>
+            <w:vAlign w:val="center"/>
+          </w:tcPr>
+          <w:p>
+            <w:pPr>
+              <w:spacing w:before="0" w:after="40" w:line="240" w:lineRule="auto"/>
+            </w:pPr>
+            <w:r>
+              <w:rPr>
+                <w:rFonts w:ascii="Calibri" w:hAnsi="Calibri" w:eastAsia="Microsoft YaHei"/>
+                <w:color w:val="1F2D3D"/>
+                <w:sz w:val="20"/>
+              </w:rPr>
+              <w:t>5</w:t>
+            </w:r>
+          </w:p>
+        </w:tc>
+        <w:tc>
+          <w:tcPr>
+            <w:tcW w:type="dxa" w:w="7160"/>
+            <w:tcMar>
+              <w:top w:w="80" w:type="dxa"/>
+              <w:start w:w="120" w:type="dxa"/>
+              <w:bottom w:w="80" w:type="dxa"/>
+              <w:end w:w="120" w:type="dxa"/>
+            </w:tcMar>
+            <w:vAlign w:val="center"/>
+          </w:tcPr>
+          <w:p>
+            <w:pPr>
+              <w:spacing w:before="0" w:after="40" w:line="240" w:lineRule="auto"/>
+            </w:pPr>
+            <w:r>
+              <w:rPr>
+                <w:rFonts w:ascii="Calibri" w:hAnsi="Calibri" w:eastAsia="Microsoft YaHei"/>
+                <w:color w:val="1F2D3D"/>
+                <w:sz w:val="20"/>
+              </w:rPr>
+              <w:t>从 Stevens、Roberts、Jones 中选择大学校长。简历是共享信息，筹款、教学、创新态度、团队关系和行为记录分散在四名成员手中。</w:t>
+            </w:r>
+          </w:p>
+        </w:tc>
+        <w:tc>
+          <w:tcPr>
+            <w:tcW w:type="dxa" w:w="1600"/>
+            <w:tcMar>
+              <w:top w:w="80" w:type="dxa"/>
+              <w:start w:w="120" w:type="dxa"/>
+              <w:bottom w:w="80" w:type="dxa"/>
+              <w:end w:w="120" w:type="dxa"/>
+            </w:tcMar>
+            <w:vAlign w:val="center"/>
+          </w:tcPr>
+          <w:p>
+            <w:pPr>
+              <w:spacing w:before="0" w:after="40" w:line="240" w:lineRule="auto"/>
+            </w:pPr>
+            <w:r>
+              <w:rPr>
+                <w:rFonts w:ascii="Calibri" w:hAnsi="Calibri" w:eastAsia="Microsoft YaHei"/>
+                <w:color w:val="1F2D3D"/>
+                <w:sz w:val="20"/>
+              </w:rPr>
+              <w:t>Roberts</w:t>
+            </w:r>
+          </w:p>
+        </w:tc>
+      </w:tr>
+      <w:tr>
+        <w:trPr>
+          <w:cantSplit/>
+        </w:trPr>
+        <w:tc>
+          <w:tcPr>
+            <w:tcW w:type="dxa" w:w="600"/>
+            <w:tcMar>
+              <w:top w:w="80" w:type="dxa"/>
+              <w:start w:w="120" w:type="dxa"/>
+              <w:bottom w:w="80" w:type="dxa"/>
+              <w:end w:w="120" w:type="dxa"/>
+            </w:tcMar>
+            <w:vAlign w:val="center"/>
+          </w:tcPr>
+          <w:p>
+            <w:pPr>
+              <w:spacing w:before="0" w:after="40" w:line="240" w:lineRule="auto"/>
+            </w:pPr>
+            <w:r>
+              <w:rPr>
+                <w:rFonts w:ascii="Calibri" w:hAnsi="Calibri" w:eastAsia="Microsoft YaHei"/>
+                <w:color w:val="1F2D3D"/>
+                <w:sz w:val="20"/>
+              </w:rPr>
+              <w:t>7</w:t>
+            </w:r>
+          </w:p>
+        </w:tc>
+        <w:tc>
+          <w:tcPr>
+            <w:tcW w:type="dxa" w:w="7160"/>
+            <w:tcMar>
+              <w:top w:w="80" w:type="dxa"/>
+              <w:start w:w="120" w:type="dxa"/>
+              <w:bottom w:w="80" w:type="dxa"/>
+              <w:end w:w="120" w:type="dxa"/>
+            </w:tcMar>
+            <w:vAlign w:val="center"/>
+          </w:tcPr>
+          <w:p>
+            <w:pPr>
+              <w:spacing w:before="0" w:after="40" w:line="240" w:lineRule="auto"/>
+            </w:pPr>
+            <w:r>
+              <w:rPr>
+                <w:rFonts w:ascii="Calibri" w:hAnsi="Calibri" w:eastAsia="Microsoft YaHei"/>
+                <w:color w:val="1F2D3D"/>
+                <w:sz w:val="20"/>
+              </w:rPr>
+              <w:t>从三家公司中选择空中侦察系统方案。十项技术准则被拆散，每名 Agent 只掌握一部分“符合/不符合”记录，必须合并后比较。</w:t>
+            </w:r>
+          </w:p>
+        </w:tc>
+        <w:tc>
+          <w:tcPr>
+            <w:tcW w:type="dxa" w:w="1600"/>
+            <w:tcMar>
+              <w:top w:w="80" w:type="dxa"/>
+              <w:start w:w="120" w:type="dxa"/>
+              <w:bottom w:w="80" w:type="dxa"/>
+              <w:end w:w="120" w:type="dxa"/>
+            </w:tcMar>
+            <w:vAlign w:val="center"/>
+          </w:tcPr>
+          <w:p>
+            <w:pPr>
+              <w:spacing w:before="0" w:after="40" w:line="240" w:lineRule="auto"/>
+            </w:pPr>
+            <w:r>
+              <w:rPr>
+                <w:rFonts w:ascii="Calibri" w:hAnsi="Calibri" w:eastAsia="Microsoft YaHei"/>
+                <w:color w:val="1F2D3D"/>
+                <w:sz w:val="20"/>
+              </w:rPr>
+              <w:t>Starlight Incorporated</w:t>
+            </w:r>
+          </w:p>
+        </w:tc>
+      </w:tr>
+      <w:tr>
+        <w:trPr>
+          <w:cantSplit/>
+        </w:trPr>
+        <w:tc>
+          <w:tcPr>
+            <w:tcW w:type="dxa" w:w="600"/>
+            <w:tcMar>
+              <w:top w:w="80" w:type="dxa"/>
+              <w:start w:w="120" w:type="dxa"/>
+              <w:bottom w:w="80" w:type="dxa"/>
+              <w:end w:w="120" w:type="dxa"/>
+            </w:tcMar>
+            <w:vAlign w:val="center"/>
+          </w:tcPr>
+          <w:p>
+            <w:pPr>
+              <w:spacing w:before="0" w:after="40" w:line="240" w:lineRule="auto"/>
+            </w:pPr>
+            <w:r>
+              <w:rPr>
+                <w:rFonts w:ascii="Calibri" w:hAnsi="Calibri" w:eastAsia="Microsoft YaHei"/>
+                <w:color w:val="1F2D3D"/>
+                <w:sz w:val="20"/>
+              </w:rPr>
+              <w:t>9</w:t>
+            </w:r>
+          </w:p>
+        </w:tc>
+        <w:tc>
+          <w:tcPr>
+            <w:tcW w:type="dxa" w:w="7160"/>
+            <w:tcMar>
+              <w:top w:w="80" w:type="dxa"/>
+              <w:start w:w="120" w:type="dxa"/>
+              <w:bottom w:w="80" w:type="dxa"/>
+              <w:end w:w="120" w:type="dxa"/>
+            </w:tcMar>
+            <w:vAlign w:val="center"/>
+          </w:tcPr>
+          <w:p>
+            <w:pPr>
+              <w:spacing w:before="0" w:after="40" w:line="240" w:lineRule="auto"/>
+            </w:pPr>
+            <w:r>
+              <w:rPr>
+                <w:rFonts w:ascii="Calibri" w:hAnsi="Calibri" w:eastAsia="Microsoft YaHei"/>
+                <w:color w:val="1F2D3D"/>
+                <w:sz w:val="20"/>
+              </w:rPr>
+              <w:t>暴雨中把危重患者转送到三家医院之一。道路是否通行、ICU 是否可用、医生和床位状态是分散的实时私有信息。</w:t>
+            </w:r>
+          </w:p>
+        </w:tc>
+        <w:tc>
+          <w:tcPr>
+            <w:tcW w:type="dxa" w:w="1600"/>
+            <w:tcMar>
+              <w:top w:w="80" w:type="dxa"/>
+              <w:start w:w="120" w:type="dxa"/>
+              <w:bottom w:w="80" w:type="dxa"/>
+              <w:end w:w="120" w:type="dxa"/>
+            </w:tcMar>
+            <w:vAlign w:val="center"/>
+          </w:tcPr>
+          <w:p>
+            <w:pPr>
+              <w:spacing w:before="0" w:after="40" w:line="240" w:lineRule="auto"/>
+            </w:pPr>
+            <w:r>
+              <w:rPr>
+                <w:rFonts w:ascii="Calibri" w:hAnsi="Calibri" w:eastAsia="Microsoft YaHei"/>
+                <w:color w:val="1F2D3D"/>
+                <w:sz w:val="20"/>
+              </w:rPr>
+              <w:t>Hospital A</w:t>
+            </w:r>
+          </w:p>
+        </w:tc>
+      </w:tr>
+      <w:tr>
+        <w:trPr>
+          <w:cantSplit/>
+        </w:trPr>
+        <w:tc>
+          <w:tcPr>
+            <w:tcW w:type="dxa" w:w="600"/>
+            <w:tcMar>
+              <w:top w:w="80" w:type="dxa"/>
+              <w:start w:w="120" w:type="dxa"/>
+              <w:bottom w:w="80" w:type="dxa"/>
+              <w:end w:w="120" w:type="dxa"/>
+            </w:tcMar>
+            <w:vAlign w:val="center"/>
+          </w:tcPr>
+          <w:p>
+            <w:pPr>
+              <w:spacing w:before="0" w:after="40" w:line="240" w:lineRule="auto"/>
+            </w:pPr>
+            <w:r>
+              <w:rPr>
+                <w:rFonts w:ascii="Calibri" w:hAnsi="Calibri" w:eastAsia="Microsoft YaHei"/>
+                <w:color w:val="1F2D3D"/>
+                <w:sz w:val="20"/>
+              </w:rPr>
+              <w:t>13</w:t>
+            </w:r>
+          </w:p>
+        </w:tc>
+        <w:tc>
+          <w:tcPr>
+            <w:tcW w:type="dxa" w:w="7160"/>
+            <w:tcMar>
+              <w:top w:w="80" w:type="dxa"/>
+              <w:start w:w="120" w:type="dxa"/>
+              <w:bottom w:w="80" w:type="dxa"/>
+              <w:end w:w="120" w:type="dxa"/>
+            </w:tcMar>
+            <w:vAlign w:val="center"/>
+          </w:tcPr>
+          <w:p>
+            <w:pPr>
+              <w:spacing w:before="0" w:after="40" w:line="240" w:lineRule="auto"/>
+            </w:pPr>
+            <w:r>
+              <w:rPr>
+                <w:rFonts w:ascii="Calibri" w:hAnsi="Calibri" w:eastAsia="Microsoft YaHei"/>
+                <w:color w:val="1F2D3D"/>
+                <w:sz w:val="20"/>
+              </w:rPr>
+              <w:t>判断哪个实验室盗走原型。门禁、设备位置、人员清点和不在场证明分散在四名审查者手中。</w:t>
+            </w:r>
+          </w:p>
+        </w:tc>
+        <w:tc>
+          <w:tcPr>
+            <w:tcW w:type="dxa" w:w="1600"/>
+            <w:tcMar>
+              <w:top w:w="80" w:type="dxa"/>
+              <w:start w:w="120" w:type="dxa"/>
+              <w:bottom w:w="80" w:type="dxa"/>
+              <w:end w:w="120" w:type="dxa"/>
+            </w:tcMar>
+            <w:vAlign w:val="center"/>
+          </w:tcPr>
+          <w:p>
+            <w:pPr>
+              <w:spacing w:before="0" w:after="40" w:line="240" w:lineRule="auto"/>
+            </w:pPr>
+            <w:r>
+              <w:rPr>
+                <w:rFonts w:ascii="Calibri" w:hAnsi="Calibri" w:eastAsia="Microsoft YaHei"/>
+                <w:color w:val="1F2D3D"/>
+                <w:sz w:val="20"/>
+              </w:rPr>
+              <w:t>Lab Gamma</w:t>
+            </w:r>
+          </w:p>
+        </w:tc>
+      </w:tr>
+      <w:tr>
+        <w:trPr>
+          <w:cantSplit/>
+        </w:trPr>
+        <w:tc>
+          <w:tcPr>
+            <w:tcW w:type="dxa" w:w="600"/>
+            <w:tcMar>
+              <w:top w:w="80" w:type="dxa"/>
+              <w:start w:w="120" w:type="dxa"/>
+              <w:bottom w:w="80" w:type="dxa"/>
+              <w:end w:w="120" w:type="dxa"/>
+            </w:tcMar>
+            <w:vAlign w:val="center"/>
+          </w:tcPr>
+          <w:p>
+            <w:pPr>
+              <w:spacing w:before="0" w:after="40" w:line="240" w:lineRule="auto"/>
+            </w:pPr>
+            <w:r>
+              <w:rPr>
+                <w:rFonts w:ascii="Calibri" w:hAnsi="Calibri" w:eastAsia="Microsoft YaHei"/>
+                <w:color w:val="1F2D3D"/>
+                <w:sz w:val="20"/>
+              </w:rPr>
+              <w:t>14</w:t>
+            </w:r>
+          </w:p>
+        </w:tc>
+        <w:tc>
+          <w:tcPr>
+            <w:tcW w:type="dxa" w:w="7160"/>
+            <w:tcMar>
+              <w:top w:w="80" w:type="dxa"/>
+              <w:start w:w="120" w:type="dxa"/>
+              <w:bottom w:w="80" w:type="dxa"/>
+              <w:end w:w="120" w:type="dxa"/>
+            </w:tcMar>
+            <w:vAlign w:val="center"/>
+          </w:tcPr>
+          <w:p>
+            <w:pPr>
+              <w:spacing w:before="0" w:after="40" w:line="240" w:lineRule="auto"/>
+            </w:pPr>
+            <w:r>
+              <w:rPr>
+                <w:rFonts w:ascii="Calibri" w:hAnsi="Calibri" w:eastAsia="Microsoft YaHei"/>
+                <w:color w:val="1F2D3D"/>
+                <w:sz w:val="20"/>
+              </w:rPr>
+              <w:t>为有素食和严重贝类过敏成员的团队选餐厅。卫生警告、交叉污染、包场和停电后的菜单可用性分别隐藏。</w:t>
+            </w:r>
+          </w:p>
+        </w:tc>
+        <w:tc>
+          <w:tcPr>
+            <w:tcW w:type="dxa" w:w="1600"/>
+            <w:tcMar>
+              <w:top w:w="80" w:type="dxa"/>
+              <w:start w:w="120" w:type="dxa"/>
+              <w:bottom w:w="80" w:type="dxa"/>
+              <w:end w:w="120" w:type="dxa"/>
+            </w:tcMar>
+            <w:vAlign w:val="center"/>
+          </w:tcPr>
+          <w:p>
+            <w:pPr>
+              <w:spacing w:before="0" w:after="40" w:line="240" w:lineRule="auto"/>
+            </w:pPr>
+            <w:r>
+              <w:rPr>
+                <w:rFonts w:ascii="Calibri" w:hAnsi="Calibri" w:eastAsia="Microsoft YaHei"/>
+                <w:color w:val="1F2D3D"/>
+                <w:sz w:val="20"/>
+              </w:rPr>
+              <w:t>Restaurant C</w:t>
+            </w:r>
+          </w:p>
+        </w:tc>
+      </w:tr>
+      <w:tr>
+        <w:trPr>
+          <w:cantSplit/>
+        </w:trPr>
+        <w:tc>
+          <w:tcPr>
+            <w:tcW w:type="dxa" w:w="600"/>
+            <w:tcMar>
+              <w:top w:w="80" w:type="dxa"/>
+              <w:start w:w="120" w:type="dxa"/>
+              <w:bottom w:w="80" w:type="dxa"/>
+              <w:end w:w="120" w:type="dxa"/>
+            </w:tcMar>
+            <w:vAlign w:val="center"/>
+          </w:tcPr>
+          <w:p>
+            <w:pPr>
+              <w:spacing w:before="0" w:after="40" w:line="240" w:lineRule="auto"/>
+            </w:pPr>
+            <w:r>
+              <w:rPr>
+                <w:rFonts w:ascii="Calibri" w:hAnsi="Calibri" w:eastAsia="Microsoft YaHei"/>
+                <w:color w:val="1F2D3D"/>
+                <w:sz w:val="20"/>
+              </w:rPr>
+              <w:t>16</w:t>
+            </w:r>
+          </w:p>
+        </w:tc>
+        <w:tc>
+          <w:tcPr>
+            <w:tcW w:type="dxa" w:w="7160"/>
+            <w:tcMar>
+              <w:top w:w="80" w:type="dxa"/>
+              <w:start w:w="120" w:type="dxa"/>
+              <w:bottom w:w="80" w:type="dxa"/>
+              <w:end w:w="120" w:type="dxa"/>
+            </w:tcMar>
+            <w:vAlign w:val="center"/>
+          </w:tcPr>
+          <w:p>
+            <w:pPr>
+              <w:spacing w:before="0" w:after="40" w:line="240" w:lineRule="auto"/>
+            </w:pPr>
+            <w:r>
+              <w:rPr>
+                <w:rFonts w:ascii="Calibri" w:hAnsi="Calibri" w:eastAsia="Microsoft YaHei"/>
+                <w:color w:val="1F2D3D"/>
+                <w:sz w:val="20"/>
+              </w:rPr>
+              <w:t>勒索攻击后选择数据备份中心。资产冻结、Alpha 停电风险、Charlie 修复审计和 Bravo 临时经理风险分别隐藏。</w:t>
+            </w:r>
+          </w:p>
+        </w:tc>
+        <w:tc>
+          <w:tcPr>
+            <w:tcW w:type="dxa" w:w="1600"/>
+            <w:tcMar>
+              <w:top w:w="80" w:type="dxa"/>
+              <w:start w:w="120" w:type="dxa"/>
+              <w:bottom w:w="80" w:type="dxa"/>
+              <w:end w:w="120" w:type="dxa"/>
+            </w:tcMar>
+            <w:vAlign w:val="center"/>
+          </w:tcPr>
+          <w:p>
+            <w:pPr>
+              <w:spacing w:before="0" w:after="40" w:line="240" w:lineRule="auto"/>
+            </w:pPr>
+            <w:r>
+              <w:rPr>
+                <w:rFonts w:ascii="Calibri" w:hAnsi="Calibri" w:eastAsia="Microsoft YaHei"/>
+                <w:color w:val="1F2D3D"/>
+                <w:sz w:val="20"/>
+              </w:rPr>
+              <w:t>Charlie</w:t>
+            </w:r>
+          </w:p>
+        </w:tc>
+      </w:tr>
+      <w:tr>
+        <w:trPr>
+          <w:cantSplit/>
+        </w:trPr>
+        <w:tc>
+          <w:tcPr>
+            <w:tcW w:type="dxa" w:w="600"/>
+            <w:tcMar>
+              <w:top w:w="80" w:type="dxa"/>
+              <w:start w:w="120" w:type="dxa"/>
+              <w:bottom w:w="80" w:type="dxa"/>
+              <w:end w:w="120" w:type="dxa"/>
+            </w:tcMar>
+            <w:vAlign w:val="center"/>
+          </w:tcPr>
+          <w:p>
+            <w:pPr>
+              <w:spacing w:before="0" w:after="40" w:line="240" w:lineRule="auto"/>
+            </w:pPr>
+            <w:r>
+              <w:rPr>
+                <w:rFonts w:ascii="Calibri" w:hAnsi="Calibri" w:eastAsia="Microsoft YaHei"/>
+                <w:color w:val="1F2D3D"/>
+                <w:sz w:val="20"/>
+              </w:rPr>
+              <w:t>25</w:t>
+            </w:r>
+          </w:p>
+        </w:tc>
+        <w:tc>
+          <w:tcPr>
+            <w:tcW w:type="dxa" w:w="7160"/>
+            <w:tcMar>
+              <w:top w:w="80" w:type="dxa"/>
+              <w:start w:w="120" w:type="dxa"/>
+              <w:bottom w:w="80" w:type="dxa"/>
+              <w:end w:w="120" w:type="dxa"/>
+            </w:tcMar>
+            <w:vAlign w:val="center"/>
+          </w:tcPr>
+          <w:p>
+            <w:pPr>
+              <w:spacing w:before="0" w:after="40" w:line="240" w:lineRule="auto"/>
+            </w:pPr>
+            <w:r>
+              <w:rPr>
+                <w:rFonts w:ascii="Calibri" w:hAnsi="Calibri" w:eastAsia="Microsoft YaHei"/>
+                <w:color w:val="1F2D3D"/>
+                <w:sz w:val="20"/>
+              </w:rPr>
+              <w:t>化工事故后选择避难所。Alpha/Bravo 的污染、Charlie 无电、Delta 系统安全分别由不同 Agent 掌握。</w:t>
+            </w:r>
+          </w:p>
+        </w:tc>
+        <w:tc>
+          <w:tcPr>
+            <w:tcW w:type="dxa" w:w="1600"/>
+            <w:tcMar>
+              <w:top w:w="80" w:type="dxa"/>
+              <w:start w:w="120" w:type="dxa"/>
+              <w:bottom w:w="80" w:type="dxa"/>
+              <w:end w:w="120" w:type="dxa"/>
+            </w:tcMar>
+            <w:vAlign w:val="center"/>
+          </w:tcPr>
+          <w:p>
+            <w:pPr>
+              <w:spacing w:before="0" w:after="40" w:line="240" w:lineRule="auto"/>
+            </w:pPr>
+            <w:r>
+              <w:rPr>
+                <w:rFonts w:ascii="Calibri" w:hAnsi="Calibri" w:eastAsia="Microsoft YaHei"/>
+                <w:color w:val="1F2D3D"/>
+                <w:sz w:val="20"/>
+              </w:rPr>
+              <w:t>Station Delta</w:t>
+            </w:r>
+          </w:p>
+        </w:tc>
+      </w:tr>
+      <w:tr>
+        <w:trPr>
+          <w:cantSplit/>
+        </w:trPr>
+        <w:tc>
+          <w:tcPr>
+            <w:tcW w:type="dxa" w:w="600"/>
+            <w:tcMar>
+              <w:top w:w="80" w:type="dxa"/>
+              <w:start w:w="120" w:type="dxa"/>
+              <w:bottom w:w="80" w:type="dxa"/>
+              <w:end w:w="120" w:type="dxa"/>
+            </w:tcMar>
+            <w:vAlign w:val="center"/>
+          </w:tcPr>
+          <w:p>
+            <w:pPr>
+              <w:spacing w:before="0" w:after="40" w:line="240" w:lineRule="auto"/>
+            </w:pPr>
+            <w:r>
+              <w:rPr>
+                <w:rFonts w:ascii="Calibri" w:hAnsi="Calibri" w:eastAsia="Microsoft YaHei"/>
+                <w:color w:val="1F2D3D"/>
+                <w:sz w:val="20"/>
+              </w:rPr>
+              <w:t>47</w:t>
+            </w:r>
+          </w:p>
+        </w:tc>
+        <w:tc>
+          <w:tcPr>
+            <w:tcW w:type="dxa" w:w="7160"/>
+            <w:tcMar>
+              <w:top w:w="80" w:type="dxa"/>
+              <w:start w:w="120" w:type="dxa"/>
+              <w:bottom w:w="80" w:type="dxa"/>
+              <w:end w:w="120" w:type="dxa"/>
+            </w:tcMar>
+            <w:vAlign w:val="center"/>
+          </w:tcPr>
+          <w:p>
+            <w:pPr>
+              <w:spacing w:before="0" w:after="40" w:line="240" w:lineRule="auto"/>
+            </w:pPr>
+            <w:r>
+              <w:rPr>
+                <w:rFonts w:ascii="Calibri" w:hAnsi="Calibri" w:eastAsia="Microsoft YaHei"/>
+                <w:color w:val="1F2D3D"/>
+                <w:sz w:val="20"/>
+              </w:rPr>
+              <w:t>在会议室、储藏室和 CEO 办公室中寻找失踪原型。门禁、清洁、房门故障和装修封锁信息被分散。</w:t>
+            </w:r>
+          </w:p>
+        </w:tc>
+        <w:tc>
+          <w:tcPr>
+            <w:tcW w:type="dxa" w:w="1600"/>
+            <w:tcMar>
+              <w:top w:w="80" w:type="dxa"/>
+              <w:start w:w="120" w:type="dxa"/>
+              <w:bottom w:w="80" w:type="dxa"/>
+              <w:end w:w="120" w:type="dxa"/>
+            </w:tcMar>
+            <w:vAlign w:val="center"/>
+          </w:tcPr>
+          <w:p>
+            <w:pPr>
+              <w:spacing w:before="0" w:after="40" w:line="240" w:lineRule="auto"/>
+            </w:pPr>
+            <w:r>
+              <w:rPr>
+                <w:rFonts w:ascii="Calibri" w:hAnsi="Calibri" w:eastAsia="Microsoft YaHei"/>
+                <w:color w:val="1F2D3D"/>
+                <w:sz w:val="20"/>
+              </w:rPr>
+              <w:t>CEO's Office</w:t>
+            </w:r>
+          </w:p>
+        </w:tc>
+      </w:tr>
+      <w:tr>
+        <w:trPr>
+          <w:cantSplit/>
+        </w:trPr>
+        <w:tc>
+          <w:tcPr>
+            <w:tcW w:type="dxa" w:w="600"/>
+            <w:tcMar>
+              <w:top w:w="80" w:type="dxa"/>
+              <w:start w:w="120" w:type="dxa"/>
+              <w:bottom w:w="80" w:type="dxa"/>
+              <w:end w:w="120" w:type="dxa"/>
+            </w:tcMar>
+            <w:vAlign w:val="center"/>
+          </w:tcPr>
+          <w:p>
+            <w:pPr>
+              <w:spacing w:before="0" w:after="40" w:line="240" w:lineRule="auto"/>
+            </w:pPr>
+            <w:r>
+              <w:rPr>
+                <w:rFonts w:ascii="Calibri" w:hAnsi="Calibri" w:eastAsia="Microsoft YaHei"/>
+                <w:color w:val="1F2D3D"/>
+                <w:sz w:val="20"/>
+              </w:rPr>
+              <w:t>62</w:t>
+            </w:r>
+          </w:p>
+        </w:tc>
+        <w:tc>
+          <w:tcPr>
+            <w:tcW w:type="dxa" w:w="7160"/>
+            <w:tcMar>
+              <w:top w:w="80" w:type="dxa"/>
+              <w:start w:w="120" w:type="dxa"/>
+              <w:bottom w:w="80" w:type="dxa"/>
+              <w:end w:w="120" w:type="dxa"/>
+            </w:tcMar>
+            <w:vAlign w:val="center"/>
+          </w:tcPr>
+          <w:p>
+            <w:pPr>
+              <w:spacing w:before="0" w:after="40" w:line="240" w:lineRule="auto"/>
+            </w:pPr>
+            <w:r>
+              <w:rPr>
+                <w:rFonts w:ascii="Calibri" w:hAnsi="Calibri" w:eastAsia="Microsoft YaHei"/>
+                <w:color w:val="1F2D3D"/>
+                <w:sz w:val="20"/>
+              </w:rPr>
+              <w:t>从生物医药、AI 硬件和物流软件公司中选择收购对象。专利到期、工程师离职、合同不可转让和客户回归条件分别隐藏。</w:t>
+            </w:r>
+          </w:p>
+        </w:tc>
+        <w:tc>
+          <w:tcPr>
+            <w:tcW w:type="dxa" w:w="1600"/>
+            <w:tcMar>
+              <w:top w:w="80" w:type="dxa"/>
+              <w:start w:w="120" w:type="dxa"/>
+              <w:bottom w:w="80" w:type="dxa"/>
+              <w:end w:w="120" w:type="dxa"/>
+            </w:tcMar>
+            <w:vAlign w:val="center"/>
+          </w:tcPr>
+          <w:p>
+            <w:pPr>
+              <w:spacing w:before="0" w:after="40" w:line="240" w:lineRule="auto"/>
+            </w:pPr>
+            <w:r>
+              <w:rPr>
+                <w:rFonts w:ascii="Calibri" w:hAnsi="Calibri" w:eastAsia="Microsoft YaHei"/>
+                <w:color w:val="1F2D3D"/>
+                <w:sz w:val="20"/>
+              </w:rPr>
+              <w:t>Option C: Logistics software company</w:t>
+            </w:r>
+          </w:p>
+        </w:tc>
+      </w:tr>
+    </w:tbl>
+    <w:p>
+      <w:pPr>
+        <w:spacing w:after="0"/>
+      </w:pPr>
+    </w:p>
+    <w:p>
+      <w:pPr>
+        <w:widowControl/>
+      </w:pPr>
+      <w:r>
+        <w:rPr>
+          <w:rFonts w:ascii="Calibri" w:hAnsi="Calibri" w:eastAsia="Microsoft YaHei"/>
+          <w:color w:val="1F2D3D"/>
+          <w:sz w:val="22"/>
+        </w:rPr>
+        <w:t>这张表回答“几个案例到底是什么题目”。每道题的完整英文场景、共享 信息、四条私有信息、候选答案和实际分配仍以公开 JSONL 为准。</w:t>
+      </w:r>
+    </w:p>
+    <w:p>
+      <w:pPr>
+        <w:pStyle w:val="Heading2"/>
+      </w:pPr>
+      <w:r>
+        <w:rPr>
+          <w:rFonts w:ascii="Calibri" w:hAnsi="Calibri" w:eastAsia="Microsoft YaHei"/>
+          <w:b/>
+          <w:color w:val="2E74B5"/>
+          <w:sz w:val="26"/>
+        </w:rPr>
+        <w:t>正确率结果</w:t>
       </w:r>
     </w:p>
     <w:tbl>
@@ -6889,7 +9277,7 @@
           <w:color w:val="1F2D3D"/>
           <w:sz w:val="22"/>
         </w:rPr>
-        <w:t>代码提交：</w:t>
+        <w:t>关键代码提交：</w:t>
       </w:r>
     </w:p>
     <w:tbl>
@@ -6929,7 +9317,18 @@
                 <w:color w:val="1F2D3D"/>
                 <w:sz w:val="18"/>
               </w:rPr>
-              <w:t>b31e8fe</w:t>
+              <w:t>原始 HiddenBench 正式运行实现：b31e8fe</w:t>
+            </w:r>
+            <w:r>
+              <w:br/>
+            </w:r>
+            <w:r>
+              <w:rPr>
+                <w:rFonts w:ascii="Consolas" w:hAnsi="Consolas" w:eastAsia="Microsoft YaHei"/>
+                <w:color w:val="1F2D3D"/>
+                <w:sz w:val="18"/>
+              </w:rPr>
+              <w:t>自动披露指标 lexical-semantic-v2：69d9f7a</w:t>
             </w:r>
           </w:p>
         </w:tc>
@@ -6950,7 +9349,23 @@
           <w:color w:val="1F2D3D"/>
           <w:sz w:val="22"/>
         </w:rPr>
-        <w:t>GitHub：</w:t>
+        <w:t xml:space="preserve">最终报告、代码和指定实验附件合并后统一从 </w:t>
+      </w:r>
+      <w:r>
+        <w:rPr>
+          <w:rFonts w:ascii="Consolas" w:hAnsi="Consolas" w:eastAsia="Microsoft YaHei"/>
+          <w:color w:val="1F4D78"/>
+          <w:sz w:val="21"/>
+        </w:rPr>
+        <w:t>master</w:t>
+      </w:r>
+      <w:r>
+        <w:rPr>
+          <w:rFonts w:ascii="Calibri" w:hAnsi="Calibri" w:eastAsia="Microsoft YaHei"/>
+          <w:color w:val="1F2D3D"/>
+          <w:sz w:val="22"/>
+        </w:rPr>
+        <w:t xml:space="preserve"> 获取：</w:t>
       </w:r>
     </w:p>
     <w:p>
@@ -7321,6 +9736,45 @@
           <w:color w:val="1F2D3D"/>
           <w:sz w:val="22"/>
         </w:rPr>
+        <w:t>说明了十道题分别是什么、4 个 Agent 的依据和顺序异步发言语义；</w:t>
+      </w:r>
+    </w:p>
+    <w:p>
+      <w:pPr>
+        <w:pStyle w:val="ListBullet"/>
+      </w:pPr>
+      <w:r>
+        <w:rPr>
+          <w:rFonts w:ascii="Calibri" w:hAnsi="Calibri" w:eastAsia="Microsoft YaHei"/>
+          <w:color w:val="1F2D3D"/>
+          <w:sz w:val="22"/>
+        </w:rPr>
+        <w:t>对比了 HiddenBench、AutoGen、Multiagent Debate、MAST 与 MAF 的关系；</w:t>
+      </w:r>
+    </w:p>
+    <w:p>
+      <w:pPr>
+        <w:pStyle w:val="ListBullet"/>
+      </w:pPr>
+      <w:r>
+        <w:rPr>
+          <w:rFonts w:ascii="Calibri" w:hAnsi="Calibri" w:eastAsia="Microsoft YaHei"/>
+          <w:color w:val="1F2D3D"/>
+          <w:sz w:val="22"/>
+        </w:rPr>
+        <w:t>将 ID 25 全部 60 条对话及十题原始记录作为可下载附件发布；</w:t>
+      </w:r>
+    </w:p>
+    <w:p>
+      <w:pPr>
+        <w:pStyle w:val="ListBullet"/>
+      </w:pPr>
+      <w:r>
+        <w:rPr>
+          <w:rFonts w:ascii="Calibri" w:hAnsi="Calibri" w:eastAsia="Microsoft YaHei"/>
+          <w:color w:val="1F2D3D"/>
+          <w:sz w:val="22"/>
+        </w:rPr>
         <w:t>发现讨论增益与错误共识同时存在。</w:t>
       </w:r>
     </w:p>
@@ -7429,7 +9883,20 @@
           <w:color w:val="1F2D3D"/>
           <w:sz w:val="22"/>
         </w:rPr>
-        <w:t>：ID 25 v2 重评分记录；</w:t>
+        <w:t>：ID 25 完整机器可读记录，</w:t>
+      </w:r>
+    </w:p>
+    <w:p>
+      <w:pPr>
+        <w:widowControl/>
+      </w:pPr>
+      <w:r>
+        <w:rPr>
+          <w:rFonts w:ascii="Calibri" w:hAnsi="Calibri" w:eastAsia="Microsoft YaHei"/>
+          <w:color w:val="1F2D3D"/>
+          <w:sz w:val="22"/>
+        </w:rPr>
+        <w:t>含实际 system prompt、user prompt、可见消息 ID、原始回答和投票；</w:t>
       </w:r>
     </w:p>
     <w:p>
@@ -7450,7 +9917,20 @@
           <w:color w:val="1F2D3D"/>
           <w:sz w:val="22"/>
         </w:rPr>
-        <w:t>：ID 25 完整可读档案；</w:t>
+        <w:t>：ID 25 的 15 轮、60 条</w:t>
+      </w:r>
+    </w:p>
+    <w:p>
+      <w:pPr>
+        <w:widowControl/>
+      </w:pPr>
+      <w:r>
+        <w:rPr>
+          <w:rFonts w:ascii="Calibri" w:hAnsi="Calibri" w:eastAsia="Microsoft YaHei"/>
+          <w:color w:val="1F2D3D"/>
+          <w:sz w:val="22"/>
+        </w:rPr>
+        <w:t>完整可读讨论档案；</w:t>
       </w:r>
     </w:p>
     <w:p>
@@ -7513,7 +9993,7 @@
           <w:color w:val="1F2D3D"/>
           <w:sz w:val="22"/>
         </w:rPr>
-        <w:t>：十题 v2 重评分记录；</w:t>
+        <w:t>：十题完整机器可读记录；</w:t>
       </w:r>
     </w:p>
     <w:p>
@@ -7577,6 +10057,35 @@
           <w:sz w:val="22"/>
         </w:rPr>
         <w:t>：完整复现手册。</w:t>
+      </w:r>
+    </w:p>
+    <w:p>
+      <w:pPr>
+        <w:widowControl/>
+      </w:pPr>
+      <w:r>
+        <w:rPr>
+          <w:rFonts w:ascii="Calibri" w:hAnsi="Calibri" w:eastAsia="Microsoft YaHei"/>
+          <w:color w:val="1F2D3D"/>
+          <w:sz w:val="22"/>
+        </w:rPr>
+        <w:t xml:space="preserve">上述七个实验附件在本次提交中被明确纳入版本控制，不再只是本地 </w:t>
+      </w:r>
+      <w:r>
+        <w:rPr>
+          <w:rFonts w:ascii="Consolas" w:hAnsi="Consolas" w:eastAsia="Microsoft YaHei"/>
+          <w:color w:val="1F4D78"/>
+          <w:sz w:val="21"/>
+        </w:rPr>
+        <w:t>.gitignore</w:t>
+      </w:r>
+      <w:r>
+        <w:rPr>
+          <w:rFonts w:ascii="Calibri" w:hAnsi="Calibri" w:eastAsia="Microsoft YaHei"/>
+          <w:color w:val="1F2D3D"/>
+          <w:sz w:val="22"/>
+        </w:rPr>
+        <w:t xml:space="preserve"> 下的临时文件。老师从 GitHub 下载仓库即可复核。</w:t>
       </w:r>
     </w:p>
     <w:sectPr>

</xml_diff>